<commit_message>
progress viz pca + tsne
</commit_message>
<xml_diff>
--- a/docs/presentations/E4-G2-TEDOLDI-SANTIAGO-2025-DOC.docx
+++ b/docs/presentations/E4-G2-TEDOLDI-SANTIAGO-2025-DOC.docx
@@ -120,40 +120,7 @@
           <w:sz w:val="44"/>
           <w:szCs w:val="44"/>
         </w:rPr>
-        <w:t xml:space="preserve">Taller de Tesis I </w:t>
-      </w:r>
-      <w:r>
-        <w:rPr>
-          <w:rFonts w:ascii="Liberation Sans" w:eastAsia="Liberation Sans" w:hAnsi="Liberation Sans" w:cs="Liberation Sans"/>
-          <w:b/>
-          <w:bCs/>
-          <w:color w:val="000000"/>
-          <w:sz w:val="44"/>
-          <w:szCs w:val="44"/>
-        </w:rPr>
-        <w:t xml:space="preserve">2025 </w:t>
-      </w:r>
-      <w:r>
-        <w:rPr>
-          <w:rFonts w:ascii="Liberation Sans" w:eastAsia="Liberation Sans" w:hAnsi="Liberation Sans" w:cs="Liberation Sans"/>
-          <w:b/>
-          <w:bCs/>
-          <w:color w:val="000000"/>
-          <w:sz w:val="44"/>
-          <w:szCs w:val="44"/>
-        </w:rPr>
-        <w:t xml:space="preserve">– Entrega </w:t>
-      </w:r>
-      <w:r>
-        <w:rPr>
-          <w:rFonts w:ascii="Liberation Sans" w:eastAsia="Liberation Sans" w:hAnsi="Liberation Sans" w:cs="Liberation Sans"/>
-          <w:b/>
-          <w:bCs/>
-          <w:color w:val="000000"/>
-          <w:sz w:val="44"/>
-          <w:szCs w:val="44"/>
-        </w:rPr>
-        <w:t>Final</w:t>
+        <w:t>Trabajo de Especialización</w:t>
       </w:r>
     </w:p>
     <w:p>
@@ -203,7 +170,40 @@
           <w:sz w:val="44"/>
           <w:szCs w:val="44"/>
         </w:rPr>
-        <w:t xml:space="preserve"> - UBA</w:t>
+        <w:t xml:space="preserve"> </w:t>
+      </w:r>
+      <w:r>
+        <w:rPr>
+          <w:rFonts w:ascii="Liberation Sans" w:eastAsia="Liberation Sans" w:hAnsi="Liberation Sans" w:cs="Liberation Sans"/>
+          <w:b/>
+          <w:bCs/>
+          <w:color w:val="000000"/>
+          <w:sz w:val="44"/>
+          <w:szCs w:val="44"/>
+        </w:rPr>
+        <w:t>–</w:t>
+      </w:r>
+      <w:r>
+        <w:rPr>
+          <w:rFonts w:ascii="Liberation Sans" w:eastAsia="Liberation Sans" w:hAnsi="Liberation Sans" w:cs="Liberation Sans"/>
+          <w:b/>
+          <w:bCs/>
+          <w:color w:val="000000"/>
+          <w:sz w:val="44"/>
+          <w:szCs w:val="44"/>
+        </w:rPr>
+        <w:t xml:space="preserve"> UBA</w:t>
+      </w:r>
+      <w:r>
+        <w:rPr>
+          <w:rFonts w:ascii="Liberation Sans" w:eastAsia="Liberation Sans" w:hAnsi="Liberation Sans" w:cs="Liberation Sans"/>
+          <w:b/>
+          <w:bCs/>
+          <w:color w:val="000000"/>
+          <w:sz w:val="44"/>
+          <w:szCs w:val="44"/>
+        </w:rPr>
+        <w:t xml:space="preserve"> – 2025</w:t>
       </w:r>
     </w:p>
     <w:p>
@@ -238,6 +238,13 @@
           <w:color w:val="000000"/>
         </w:rPr>
       </w:pPr>
+      <w:r>
+        <w:rPr>
+          <w:rFonts w:ascii="Liberation Sans" w:eastAsia="Liberation Sans" w:hAnsi="Liberation Sans" w:cs="Liberation Sans"/>
+          <w:color w:val="000000"/>
+        </w:rPr>
+        <w:t>Alumno</w:t>
+      </w:r>
     </w:p>
     <w:p>
       <w:pPr>
@@ -254,29 +261,7 @@
           <w:rFonts w:ascii="Liberation Sans" w:eastAsia="Liberation Sans" w:hAnsi="Liberation Sans" w:cs="Liberation Sans"/>
           <w:color w:val="000000"/>
         </w:rPr>
-        <w:t>Profesoras:</w:t>
-      </w:r>
-    </w:p>
-    <w:p>
-      <w:pPr>
-        <w:pStyle w:val="LO-normal"/>
-        <w:numPr>
-          <w:ilvl w:val="0"/>
-          <w:numId w:val="14"/>
-        </w:numPr>
-        <w:spacing w:before="144" w:after="216"/>
-        <w:jc w:val="both"/>
-        <w:rPr>
-          <w:rFonts w:ascii="Liberation Sans" w:eastAsia="Liberation Sans" w:hAnsi="Liberation Sans" w:cs="Liberation Sans"/>
-          <w:color w:val="000000"/>
-        </w:rPr>
-      </w:pPr>
-      <w:r>
-        <w:rPr>
-          <w:rFonts w:ascii="Liberation Sans" w:eastAsia="Liberation Sans" w:hAnsi="Liberation Sans" w:cs="Liberation Sans"/>
-          <w:color w:val="000000"/>
-        </w:rPr>
-        <w:t xml:space="preserve">Nancy </w:t>
+        <w:t xml:space="preserve">Santiago </w:t>
       </w:r>
       <w:proofErr w:type="spellStart"/>
       <w:r>
@@ -284,92 +269,22 @@
           <w:rFonts w:ascii="Liberation Sans" w:eastAsia="Liberation Sans" w:hAnsi="Liberation Sans" w:cs="Liberation Sans"/>
           <w:color w:val="000000"/>
         </w:rPr>
-        <w:t>Andrioli</w:t>
+        <w:t>Sebastian</w:t>
       </w:r>
       <w:proofErr w:type="spellEnd"/>
-    </w:p>
-    <w:p>
-      <w:pPr>
-        <w:pStyle w:val="LO-normal"/>
-        <w:numPr>
-          <w:ilvl w:val="0"/>
-          <w:numId w:val="14"/>
-        </w:numPr>
-        <w:spacing w:before="144" w:after="216"/>
-        <w:jc w:val="both"/>
-        <w:rPr>
-          <w:rFonts w:ascii="Liberation Sans" w:eastAsia="Liberation Sans" w:hAnsi="Liberation Sans" w:cs="Liberation Sans"/>
-          <w:color w:val="000000"/>
-        </w:rPr>
-      </w:pPr>
-      <w:r>
-        <w:rPr>
-          <w:rFonts w:ascii="Liberation Sans" w:eastAsia="Liberation Sans" w:hAnsi="Liberation Sans" w:cs="Liberation Sans"/>
-          <w:color w:val="000000"/>
-        </w:rPr>
-        <w:t xml:space="preserve">Luz </w:t>
-      </w:r>
-      <w:proofErr w:type="spellStart"/>
-      <w:r>
-        <w:rPr>
-          <w:rFonts w:ascii="Liberation Sans" w:eastAsia="Liberation Sans" w:hAnsi="Liberation Sans" w:cs="Liberation Sans"/>
-          <w:color w:val="000000"/>
-        </w:rPr>
-        <w:t>Bavassi</w:t>
-      </w:r>
-      <w:proofErr w:type="spellEnd"/>
-    </w:p>
-    <w:p>
-      <w:pPr>
-        <w:pStyle w:val="LO-normal"/>
-        <w:numPr>
-          <w:ilvl w:val="0"/>
-          <w:numId w:val="14"/>
-        </w:numPr>
-        <w:spacing w:before="144" w:after="216"/>
-        <w:jc w:val="both"/>
-        <w:rPr>
-          <w:rFonts w:ascii="Liberation Sans" w:eastAsia="Liberation Sans" w:hAnsi="Liberation Sans" w:cs="Liberation Sans"/>
-          <w:color w:val="000000"/>
-        </w:rPr>
-      </w:pPr>
-      <w:r>
-        <w:rPr>
-          <w:rFonts w:ascii="Liberation Sans" w:eastAsia="Liberation Sans" w:hAnsi="Liberation Sans" w:cs="Liberation Sans"/>
-          <w:color w:val="000000"/>
-        </w:rPr>
-        <w:t xml:space="preserve">Laura </w:t>
-      </w:r>
-      <w:proofErr w:type="spellStart"/>
-      <w:r>
-        <w:rPr>
-          <w:rFonts w:ascii="Liberation Sans" w:eastAsia="Liberation Sans" w:hAnsi="Liberation Sans" w:cs="Liberation Sans"/>
-          <w:color w:val="000000"/>
-        </w:rPr>
-        <w:t>Kaczer</w:t>
-      </w:r>
-      <w:proofErr w:type="spellEnd"/>
-    </w:p>
-    <w:p>
-      <w:pPr>
-        <w:pStyle w:val="LO-normal"/>
-        <w:numPr>
-          <w:ilvl w:val="0"/>
-          <w:numId w:val="14"/>
-        </w:numPr>
-        <w:spacing w:before="144" w:after="216"/>
-        <w:jc w:val="both"/>
-        <w:rPr>
-          <w:rFonts w:ascii="Liberation Sans" w:eastAsia="Liberation Sans" w:hAnsi="Liberation Sans" w:cs="Liberation Sans"/>
-          <w:color w:val="000000"/>
-        </w:rPr>
-      </w:pPr>
-      <w:r>
-        <w:rPr>
-          <w:rFonts w:ascii="Liberation Sans" w:eastAsia="Liberation Sans" w:hAnsi="Liberation Sans" w:cs="Liberation Sans"/>
-          <w:color w:val="000000"/>
-        </w:rPr>
-        <w:t>Daniela Parada</w:t>
+      <w:r>
+        <w:rPr>
+          <w:rFonts w:ascii="Liberation Sans" w:eastAsia="Liberation Sans" w:hAnsi="Liberation Sans" w:cs="Liberation Sans"/>
+          <w:color w:val="000000"/>
+        </w:rPr>
+        <w:t xml:space="preserve"> </w:t>
+      </w:r>
+      <w:r>
+        <w:rPr>
+          <w:rFonts w:ascii="Liberation Sans" w:eastAsia="Liberation Sans" w:hAnsi="Liberation Sans" w:cs="Liberation Sans"/>
+          <w:color w:val="000000"/>
+        </w:rPr>
+        <w:t>Tedoldi</w:t>
       </w:r>
     </w:p>
     <w:p>
@@ -387,55 +302,33 @@
           <w:rFonts w:ascii="Liberation Sans" w:eastAsia="Liberation Sans" w:hAnsi="Liberation Sans" w:cs="Liberation Sans"/>
           <w:color w:val="000000"/>
         </w:rPr>
-        <w:t xml:space="preserve">Alumno: </w:t>
+        <w:t>DNI 36386675</w:t>
       </w:r>
     </w:p>
     <w:p>
       <w:pPr>
-        <w:pStyle w:val="LO-normal"/>
-        <w:numPr>
-          <w:ilvl w:val="0"/>
-          <w:numId w:val="15"/>
-        </w:numPr>
-        <w:spacing w:before="144" w:after="216"/>
-        <w:jc w:val="both"/>
-        <w:rPr>
-          <w:rFonts w:ascii="Liberation Sans" w:eastAsia="Liberation Sans" w:hAnsi="Liberation Sans" w:cs="Liberation Sans"/>
-          <w:color w:val="000000"/>
-        </w:rPr>
-      </w:pPr>
-      <w:r>
-        <w:rPr>
-          <w:rFonts w:ascii="Liberation Sans" w:eastAsia="Liberation Sans" w:hAnsi="Liberation Sans" w:cs="Liberation Sans"/>
-          <w:color w:val="000000"/>
-        </w:rPr>
-        <w:t>Santiago Tedoldi</w:t>
+        <w:widowControl/>
+        <w:rPr>
+          <w:rFonts w:ascii="Liberation Sans" w:eastAsia="Liberation Sans" w:hAnsi="Liberation Sans" w:cs="Liberation Sans"/>
+          <w:color w:val="000000"/>
+        </w:rPr>
+      </w:pPr>
+      <w:r>
+        <w:rPr>
+          <w:rFonts w:ascii="Liberation Sans" w:eastAsia="Liberation Sans" w:hAnsi="Liberation Sans" w:cs="Liberation Sans"/>
+          <w:color w:val="000000"/>
+        </w:rPr>
+        <w:br w:type="page"/>
       </w:r>
     </w:p>
     <w:p>
       <w:pPr>
-        <w:widowControl/>
-        <w:rPr>
-          <w:rFonts w:ascii="Liberation Sans" w:eastAsia="Liberation Sans" w:hAnsi="Liberation Sans" w:cs="Liberation Sans"/>
-          <w:color w:val="000000"/>
-        </w:rPr>
-      </w:pPr>
-      <w:r>
-        <w:rPr>
-          <w:rFonts w:ascii="Liberation Sans" w:eastAsia="Liberation Sans" w:hAnsi="Liberation Sans" w:cs="Liberation Sans"/>
-          <w:color w:val="000000"/>
-        </w:rPr>
-        <w:br w:type="page"/>
-      </w:r>
-    </w:p>
-    <w:p>
-      <w:pPr>
         <w:pStyle w:val="Ttulo3"/>
         <w:rPr>
           <w:color w:val="000000"/>
         </w:rPr>
       </w:pPr>
-      <w:bookmarkStart w:id="0" w:name="_Toc202122263"/>
+      <w:bookmarkStart w:id="0" w:name="_Toc206607282"/>
       <w:r>
         <w:rPr>
           <w:color w:val="000000"/>
@@ -513,7 +406,7 @@
             </w:rPr>
             <w:fldChar w:fldCharType="separate"/>
           </w:r>
-          <w:hyperlink w:anchor="_Toc202122263" w:history="1">
+          <w:hyperlink w:anchor="_Toc206607282" w:history="1">
             <w:r>
               <w:rPr>
                 <w:rStyle w:val="Hipervnculo"/>
@@ -540,7 +433,7 @@
                 <w:noProof/>
                 <w:webHidden/>
               </w:rPr>
-              <w:instrText xml:space="preserve"> PAGEREF _Toc202122263 \h </w:instrText>
+              <w:instrText xml:space="preserve"> PAGEREF _Toc206607282 \h </w:instrText>
             </w:r>
             <w:r>
               <w:rPr>
@@ -587,7 +480,7 @@
               <w14:ligatures w14:val="standardContextual"/>
             </w:rPr>
           </w:pPr>
-          <w:hyperlink w:anchor="_Toc202122264" w:history="1">
+          <w:hyperlink w:anchor="_Toc206607283" w:history="1">
             <w:r>
               <w:rPr>
                 <w:rStyle w:val="Hipervnculo"/>
@@ -614,7 +507,7 @@
                 <w:noProof/>
                 <w:webHidden/>
               </w:rPr>
-              <w:instrText xml:space="preserve"> PAGEREF _Toc202122264 \h </w:instrText>
+              <w:instrText xml:space="preserve"> PAGEREF _Toc206607283 \h </w:instrText>
             </w:r>
             <w:r>
               <w:rPr>
@@ -661,7 +554,7 @@
               <w14:ligatures w14:val="standardContextual"/>
             </w:rPr>
           </w:pPr>
-          <w:hyperlink w:anchor="_Toc202122265" w:history="1">
+          <w:hyperlink w:anchor="_Toc206607284" w:history="1">
             <w:r>
               <w:rPr>
                 <w:rStyle w:val="Hipervnculo"/>
@@ -688,7 +581,7 @@
                 <w:noProof/>
                 <w:webHidden/>
               </w:rPr>
-              <w:instrText xml:space="preserve"> PAGEREF _Toc202122265 \h </w:instrText>
+              <w:instrText xml:space="preserve"> PAGEREF _Toc206607284 \h </w:instrText>
             </w:r>
             <w:r>
               <w:rPr>
@@ -735,7 +628,7 @@
               <w14:ligatures w14:val="standardContextual"/>
             </w:rPr>
           </w:pPr>
-          <w:hyperlink w:anchor="_Toc202122266" w:history="1">
+          <w:hyperlink w:anchor="_Toc206607285" w:history="1">
             <w:r>
               <w:rPr>
                 <w:rStyle w:val="Hipervnculo"/>
@@ -762,7 +655,7 @@
                 <w:noProof/>
                 <w:webHidden/>
               </w:rPr>
-              <w:instrText xml:space="preserve"> PAGEREF _Toc202122266 \h </w:instrText>
+              <w:instrText xml:space="preserve"> PAGEREF _Toc206607285 \h </w:instrText>
             </w:r>
             <w:r>
               <w:rPr>
@@ -809,7 +702,7 @@
               <w14:ligatures w14:val="standardContextual"/>
             </w:rPr>
           </w:pPr>
-          <w:hyperlink w:anchor="_Toc202122267" w:history="1">
+          <w:hyperlink w:anchor="_Toc206607286" w:history="1">
             <w:r>
               <w:rPr>
                 <w:rStyle w:val="Hipervnculo"/>
@@ -836,7 +729,7 @@
                 <w:noProof/>
                 <w:webHidden/>
               </w:rPr>
-              <w:instrText xml:space="preserve"> PAGEREF _Toc202122267 \h </w:instrText>
+              <w:instrText xml:space="preserve"> PAGEREF _Toc206607286 \h </w:instrText>
             </w:r>
             <w:r>
               <w:rPr>
@@ -883,7 +776,7 @@
               <w14:ligatures w14:val="standardContextual"/>
             </w:rPr>
           </w:pPr>
-          <w:hyperlink w:anchor="_Toc202122268" w:history="1">
+          <w:hyperlink w:anchor="_Toc206607287" w:history="1">
             <w:r>
               <w:rPr>
                 <w:rStyle w:val="Hipervnculo"/>
@@ -910,7 +803,7 @@
                 <w:noProof/>
                 <w:webHidden/>
               </w:rPr>
-              <w:instrText xml:space="preserve"> PAGEREF _Toc202122268 \h </w:instrText>
+              <w:instrText xml:space="preserve"> PAGEREF _Toc206607287 \h </w:instrText>
             </w:r>
             <w:r>
               <w:rPr>
@@ -957,7 +850,7 @@
               <w14:ligatures w14:val="standardContextual"/>
             </w:rPr>
           </w:pPr>
-          <w:hyperlink w:anchor="_Toc202122269" w:history="1">
+          <w:hyperlink w:anchor="_Toc206607288" w:history="1">
             <w:r>
               <w:rPr>
                 <w:rStyle w:val="Hipervnculo"/>
@@ -984,7 +877,7 @@
                 <w:noProof/>
                 <w:webHidden/>
               </w:rPr>
-              <w:instrText xml:space="preserve"> PAGEREF _Toc202122269 \h </w:instrText>
+              <w:instrText xml:space="preserve"> PAGEREF _Toc206607288 \h </w:instrText>
             </w:r>
             <w:r>
               <w:rPr>
@@ -1031,7 +924,7 @@
               <w14:ligatures w14:val="standardContextual"/>
             </w:rPr>
           </w:pPr>
-          <w:hyperlink w:anchor="_Toc202122270" w:history="1">
+          <w:hyperlink w:anchor="_Toc206607289" w:history="1">
             <w:r>
               <w:rPr>
                 <w:rStyle w:val="Hipervnculo"/>
@@ -1058,7 +951,7 @@
                 <w:noProof/>
                 <w:webHidden/>
               </w:rPr>
-              <w:instrText xml:space="preserve"> PAGEREF _Toc202122270 \h </w:instrText>
+              <w:instrText xml:space="preserve"> PAGEREF _Toc206607289 \h </w:instrText>
             </w:r>
             <w:r>
               <w:rPr>
@@ -1105,7 +998,7 @@
               <w14:ligatures w14:val="standardContextual"/>
             </w:rPr>
           </w:pPr>
-          <w:hyperlink w:anchor="_Toc202122271" w:history="1">
+          <w:hyperlink w:anchor="_Toc206607290" w:history="1">
             <w:r>
               <w:rPr>
                 <w:rStyle w:val="Hipervnculo"/>
@@ -1132,7 +1025,7 @@
                 <w:noProof/>
                 <w:webHidden/>
               </w:rPr>
-              <w:instrText xml:space="preserve"> PAGEREF _Toc202122271 \h </w:instrText>
+              <w:instrText xml:space="preserve"> PAGEREF _Toc206607290 \h </w:instrText>
             </w:r>
             <w:r>
               <w:rPr>
@@ -1179,7 +1072,7 @@
               <w14:ligatures w14:val="standardContextual"/>
             </w:rPr>
           </w:pPr>
-          <w:hyperlink w:anchor="_Toc202122272" w:history="1">
+          <w:hyperlink w:anchor="_Toc206607291" w:history="1">
             <w:r>
               <w:rPr>
                 <w:rStyle w:val="Hipervnculo"/>
@@ -1206,7 +1099,7 @@
                 <w:noProof/>
                 <w:webHidden/>
               </w:rPr>
-              <w:instrText xml:space="preserve"> PAGEREF _Toc202122272 \h </w:instrText>
+              <w:instrText xml:space="preserve"> PAGEREF _Toc206607291 \h </w:instrText>
             </w:r>
             <w:r>
               <w:rPr>
@@ -1253,7 +1146,7 @@
               <w14:ligatures w14:val="standardContextual"/>
             </w:rPr>
           </w:pPr>
-          <w:hyperlink w:anchor="_Toc202122273" w:history="1">
+          <w:hyperlink w:anchor="_Toc206607292" w:history="1">
             <w:r>
               <w:rPr>
                 <w:rStyle w:val="Hipervnculo"/>
@@ -1280,7 +1173,7 @@
                 <w:noProof/>
                 <w:webHidden/>
               </w:rPr>
-              <w:instrText xml:space="preserve"> PAGEREF _Toc202122273 \h </w:instrText>
+              <w:instrText xml:space="preserve"> PAGEREF _Toc206607292 \h </w:instrText>
             </w:r>
             <w:r>
               <w:rPr>
@@ -1327,7 +1220,7 @@
               <w14:ligatures w14:val="standardContextual"/>
             </w:rPr>
           </w:pPr>
-          <w:hyperlink w:anchor="_Toc202122274" w:history="1">
+          <w:hyperlink w:anchor="_Toc206607293" w:history="1">
             <w:r>
               <w:rPr>
                 <w:rStyle w:val="Hipervnculo"/>
@@ -1354,7 +1247,7 @@
                 <w:noProof/>
                 <w:webHidden/>
               </w:rPr>
-              <w:instrText xml:space="preserve"> PAGEREF _Toc202122274 \h </w:instrText>
+              <w:instrText xml:space="preserve"> PAGEREF _Toc206607293 \h </w:instrText>
             </w:r>
             <w:r>
               <w:rPr>
@@ -1401,7 +1294,7 @@
               <w14:ligatures w14:val="standardContextual"/>
             </w:rPr>
           </w:pPr>
-          <w:hyperlink w:anchor="_Toc202122275" w:history="1">
+          <w:hyperlink w:anchor="_Toc206607294" w:history="1">
             <w:r>
               <w:rPr>
                 <w:rStyle w:val="Hipervnculo"/>
@@ -1428,7 +1321,7 @@
                 <w:noProof/>
                 <w:webHidden/>
               </w:rPr>
-              <w:instrText xml:space="preserve"> PAGEREF _Toc202122275 \h </w:instrText>
+              <w:instrText xml:space="preserve"> PAGEREF _Toc206607294 \h </w:instrText>
             </w:r>
             <w:r>
               <w:rPr>
@@ -1475,7 +1368,7 @@
               <w14:ligatures w14:val="standardContextual"/>
             </w:rPr>
           </w:pPr>
-          <w:hyperlink w:anchor="_Toc202122276" w:history="1">
+          <w:hyperlink w:anchor="_Toc206607295" w:history="1">
             <w:r>
               <w:rPr>
                 <w:rStyle w:val="Hipervnculo"/>
@@ -1502,7 +1395,7 @@
                 <w:noProof/>
                 <w:webHidden/>
               </w:rPr>
-              <w:instrText xml:space="preserve"> PAGEREF _Toc202122276 \h </w:instrText>
+              <w:instrText xml:space="preserve"> PAGEREF _Toc206607295 \h </w:instrText>
             </w:r>
             <w:r>
               <w:rPr>
@@ -1549,7 +1442,7 @@
               <w14:ligatures w14:val="standardContextual"/>
             </w:rPr>
           </w:pPr>
-          <w:hyperlink w:anchor="_Toc202122277" w:history="1">
+          <w:hyperlink w:anchor="_Toc206607296" w:history="1">
             <w:r>
               <w:rPr>
                 <w:rStyle w:val="Hipervnculo"/>
@@ -1576,7 +1469,7 @@
                 <w:noProof/>
                 <w:webHidden/>
               </w:rPr>
-              <w:instrText xml:space="preserve"> PAGEREF _Toc202122277 \h </w:instrText>
+              <w:instrText xml:space="preserve"> PAGEREF _Toc206607296 \h </w:instrText>
             </w:r>
             <w:r>
               <w:rPr>
@@ -1623,7 +1516,7 @@
               <w14:ligatures w14:val="standardContextual"/>
             </w:rPr>
           </w:pPr>
-          <w:hyperlink w:anchor="_Toc202122278" w:history="1">
+          <w:hyperlink w:anchor="_Toc206607297" w:history="1">
             <w:r>
               <w:rPr>
                 <w:rStyle w:val="Hipervnculo"/>
@@ -1650,7 +1543,7 @@
                 <w:noProof/>
                 <w:webHidden/>
               </w:rPr>
-              <w:instrText xml:space="preserve"> PAGEREF _Toc202122278 \h </w:instrText>
+              <w:instrText xml:space="preserve"> PAGEREF _Toc206607297 \h </w:instrText>
             </w:r>
             <w:r>
               <w:rPr>
@@ -1697,7 +1590,7 @@
               <w14:ligatures w14:val="standardContextual"/>
             </w:rPr>
           </w:pPr>
-          <w:hyperlink w:anchor="_Toc202122279" w:history="1">
+          <w:hyperlink w:anchor="_Toc206607298" w:history="1">
             <w:r>
               <w:rPr>
                 <w:rStyle w:val="Hipervnculo"/>
@@ -1724,7 +1617,7 @@
                 <w:noProof/>
                 <w:webHidden/>
               </w:rPr>
-              <w:instrText xml:space="preserve"> PAGEREF _Toc202122279 \h </w:instrText>
+              <w:instrText xml:space="preserve"> PAGEREF _Toc206607298 \h </w:instrText>
             </w:r>
             <w:r>
               <w:rPr>
@@ -1744,7 +1637,7 @@
                 <w:noProof/>
                 <w:webHidden/>
               </w:rPr>
-              <w:t>7</w:t>
+              <w:t>8</w:t>
             </w:r>
             <w:r>
               <w:rPr>
@@ -1771,7 +1664,7 @@
               <w14:ligatures w14:val="standardContextual"/>
             </w:rPr>
           </w:pPr>
-          <w:hyperlink w:anchor="_Toc202122280" w:history="1">
+          <w:hyperlink w:anchor="_Toc206607299" w:history="1">
             <w:r>
               <w:rPr>
                 <w:rStyle w:val="Hipervnculo"/>
@@ -1798,7 +1691,7 @@
                 <w:noProof/>
                 <w:webHidden/>
               </w:rPr>
-              <w:instrText xml:space="preserve"> PAGEREF _Toc202122280 \h </w:instrText>
+              <w:instrText xml:space="preserve"> PAGEREF _Toc206607299 \h </w:instrText>
             </w:r>
             <w:r>
               <w:rPr>
@@ -1845,7 +1738,7 @@
               <w14:ligatures w14:val="standardContextual"/>
             </w:rPr>
           </w:pPr>
-          <w:hyperlink w:anchor="_Toc202122281" w:history="1">
+          <w:hyperlink w:anchor="_Toc206607300" w:history="1">
             <w:r>
               <w:rPr>
                 <w:rStyle w:val="Hipervnculo"/>
@@ -1872,7 +1765,7 @@
                 <w:noProof/>
                 <w:webHidden/>
               </w:rPr>
-              <w:instrText xml:space="preserve"> PAGEREF _Toc202122281 \h </w:instrText>
+              <w:instrText xml:space="preserve"> PAGEREF _Toc206607300 \h </w:instrText>
             </w:r>
             <w:r>
               <w:rPr>
@@ -1919,7 +1812,7 @@
               <w14:ligatures w14:val="standardContextual"/>
             </w:rPr>
           </w:pPr>
-          <w:hyperlink w:anchor="_Toc202122282" w:history="1">
+          <w:hyperlink w:anchor="_Toc206607301" w:history="1">
             <w:r>
               <w:rPr>
                 <w:rStyle w:val="Hipervnculo"/>
@@ -1946,7 +1839,7 @@
                 <w:noProof/>
                 <w:webHidden/>
               </w:rPr>
-              <w:instrText xml:space="preserve"> PAGEREF _Toc202122282 \h </w:instrText>
+              <w:instrText xml:space="preserve"> PAGEREF _Toc206607301 \h </w:instrText>
             </w:r>
             <w:r>
               <w:rPr>
@@ -1966,7 +1859,7 @@
                 <w:noProof/>
                 <w:webHidden/>
               </w:rPr>
-              <w:t>11</w:t>
+              <w:t>12</w:t>
             </w:r>
             <w:r>
               <w:rPr>
@@ -1993,7 +1886,7 @@
               <w14:ligatures w14:val="standardContextual"/>
             </w:rPr>
           </w:pPr>
-          <w:hyperlink w:anchor="_Toc202122283" w:history="1">
+          <w:hyperlink w:anchor="_Toc206607302" w:history="1">
             <w:r>
               <w:rPr>
                 <w:rStyle w:val="Hipervnculo"/>
@@ -2020,7 +1913,7 @@
                 <w:noProof/>
                 <w:webHidden/>
               </w:rPr>
-              <w:instrText xml:space="preserve"> PAGEREF _Toc202122283 \h </w:instrText>
+              <w:instrText xml:space="preserve"> PAGEREF _Toc206607302 \h </w:instrText>
             </w:r>
             <w:r>
               <w:rPr>
@@ -2040,7 +1933,7 @@
                 <w:noProof/>
                 <w:webHidden/>
               </w:rPr>
-              <w:t>14</w:t>
+              <w:t>15</w:t>
             </w:r>
             <w:r>
               <w:rPr>
@@ -2067,7 +1960,7 @@
               <w14:ligatures w14:val="standardContextual"/>
             </w:rPr>
           </w:pPr>
-          <w:hyperlink w:anchor="_Toc202122284" w:history="1">
+          <w:hyperlink w:anchor="_Toc206607303" w:history="1">
             <w:r>
               <w:rPr>
                 <w:rStyle w:val="Hipervnculo"/>
@@ -2094,7 +1987,7 @@
                 <w:noProof/>
                 <w:webHidden/>
               </w:rPr>
-              <w:instrText xml:space="preserve"> PAGEREF _Toc202122284 \h </w:instrText>
+              <w:instrText xml:space="preserve"> PAGEREF _Toc206607303 \h </w:instrText>
             </w:r>
             <w:r>
               <w:rPr>
@@ -2114,7 +2007,7 @@
                 <w:noProof/>
                 <w:webHidden/>
               </w:rPr>
-              <w:t>14</w:t>
+              <w:t>15</w:t>
             </w:r>
             <w:r>
               <w:rPr>
@@ -2141,7 +2034,7 @@
               <w14:ligatures w14:val="standardContextual"/>
             </w:rPr>
           </w:pPr>
-          <w:hyperlink w:anchor="_Toc202122285" w:history="1">
+          <w:hyperlink w:anchor="_Toc206607304" w:history="1">
             <w:r>
               <w:rPr>
                 <w:rStyle w:val="Hipervnculo"/>
@@ -2168,7 +2061,7 @@
                 <w:noProof/>
                 <w:webHidden/>
               </w:rPr>
-              <w:instrText xml:space="preserve"> PAGEREF _Toc202122285 \h </w:instrText>
+              <w:instrText xml:space="preserve"> PAGEREF _Toc206607304 \h </w:instrText>
             </w:r>
             <w:r>
               <w:rPr>
@@ -2188,7 +2081,7 @@
                 <w:noProof/>
                 <w:webHidden/>
               </w:rPr>
-              <w:t>14</w:t>
+              <w:t>15</w:t>
             </w:r>
             <w:r>
               <w:rPr>
@@ -2215,7 +2108,7 @@
               <w14:ligatures w14:val="standardContextual"/>
             </w:rPr>
           </w:pPr>
-          <w:hyperlink w:anchor="_Toc202122286" w:history="1">
+          <w:hyperlink w:anchor="_Toc206607305" w:history="1">
             <w:r>
               <w:rPr>
                 <w:rStyle w:val="Hipervnculo"/>
@@ -2242,7 +2135,7 @@
                 <w:noProof/>
                 <w:webHidden/>
               </w:rPr>
-              <w:instrText xml:space="preserve"> PAGEREF _Toc202122286 \h </w:instrText>
+              <w:instrText xml:space="preserve"> PAGEREF _Toc206607305 \h </w:instrText>
             </w:r>
             <w:r>
               <w:rPr>
@@ -2262,7 +2155,7 @@
                 <w:noProof/>
                 <w:webHidden/>
               </w:rPr>
-              <w:t>15</w:t>
+              <w:t>16</w:t>
             </w:r>
             <w:r>
               <w:rPr>
@@ -2289,7 +2182,7 @@
               <w14:ligatures w14:val="standardContextual"/>
             </w:rPr>
           </w:pPr>
-          <w:hyperlink w:anchor="_Toc202122287" w:history="1">
+          <w:hyperlink w:anchor="_Toc206607306" w:history="1">
             <w:r>
               <w:rPr>
                 <w:rStyle w:val="Hipervnculo"/>
@@ -2316,7 +2209,7 @@
                 <w:noProof/>
                 <w:webHidden/>
               </w:rPr>
-              <w:instrText xml:space="preserve"> PAGEREF _Toc202122287 \h </w:instrText>
+              <w:instrText xml:space="preserve"> PAGEREF _Toc206607306 \h </w:instrText>
             </w:r>
             <w:r>
               <w:rPr>
@@ -2336,7 +2229,7 @@
                 <w:noProof/>
                 <w:webHidden/>
               </w:rPr>
-              <w:t>16</w:t>
+              <w:t>17</w:t>
             </w:r>
             <w:r>
               <w:rPr>
@@ -2363,13 +2256,13 @@
               <w14:ligatures w14:val="standardContextual"/>
             </w:rPr>
           </w:pPr>
-          <w:hyperlink w:anchor="_Toc202122288" w:history="1">
+          <w:hyperlink w:anchor="_Toc206607307" w:history="1">
             <w:r>
               <w:rPr>
                 <w:rStyle w:val="Hipervnculo"/>
                 <w:noProof/>
               </w:rPr>
-              <w:t>Visualización del DistiltBERT ajustado</w:t>
+              <w:t>Visualización del DistilBERT ajustado</w:t>
             </w:r>
             <w:r>
               <w:rPr>
@@ -2390,7 +2283,7 @@
                 <w:noProof/>
                 <w:webHidden/>
               </w:rPr>
-              <w:instrText xml:space="preserve"> PAGEREF _Toc202122288 \h </w:instrText>
+              <w:instrText xml:space="preserve"> PAGEREF _Toc206607307 \h </w:instrText>
             </w:r>
             <w:r>
               <w:rPr>
@@ -2410,7 +2303,7 @@
                 <w:noProof/>
                 <w:webHidden/>
               </w:rPr>
-              <w:t>17</w:t>
+              <w:t>18</w:t>
             </w:r>
             <w:r>
               <w:rPr>
@@ -2437,7 +2330,7 @@
               <w14:ligatures w14:val="standardContextual"/>
             </w:rPr>
           </w:pPr>
-          <w:hyperlink w:anchor="_Toc202122289" w:history="1">
+          <w:hyperlink w:anchor="_Toc206607308" w:history="1">
             <w:r>
               <w:rPr>
                 <w:rStyle w:val="Hipervnculo"/>
@@ -2464,7 +2357,7 @@
                 <w:noProof/>
                 <w:webHidden/>
               </w:rPr>
-              <w:instrText xml:space="preserve"> PAGEREF _Toc202122289 \h </w:instrText>
+              <w:instrText xml:space="preserve"> PAGEREF _Toc206607308 \h </w:instrText>
             </w:r>
             <w:r>
               <w:rPr>
@@ -2484,7 +2377,7 @@
                 <w:noProof/>
                 <w:webHidden/>
               </w:rPr>
-              <w:t>18</w:t>
+              <w:t>19</w:t>
             </w:r>
             <w:r>
               <w:rPr>
@@ -2511,7 +2404,7 @@
               <w14:ligatures w14:val="standardContextual"/>
             </w:rPr>
           </w:pPr>
-          <w:hyperlink w:anchor="_Toc202122290" w:history="1">
+          <w:hyperlink w:anchor="_Toc206607309" w:history="1">
             <w:r>
               <w:rPr>
                 <w:rStyle w:val="Hipervnculo"/>
@@ -2538,7 +2431,7 @@
                 <w:noProof/>
                 <w:webHidden/>
               </w:rPr>
-              <w:instrText xml:space="preserve"> PAGEREF _Toc202122290 \h </w:instrText>
+              <w:instrText xml:space="preserve"> PAGEREF _Toc206607309 \h </w:instrText>
             </w:r>
             <w:r>
               <w:rPr>
@@ -2558,7 +2451,7 @@
                 <w:noProof/>
                 <w:webHidden/>
               </w:rPr>
-              <w:t>19</w:t>
+              <w:t>20</w:t>
             </w:r>
             <w:r>
               <w:rPr>
@@ -2585,7 +2478,7 @@
               <w14:ligatures w14:val="standardContextual"/>
             </w:rPr>
           </w:pPr>
-          <w:hyperlink w:anchor="_Toc202122291" w:history="1">
+          <w:hyperlink w:anchor="_Toc206607310" w:history="1">
             <w:r>
               <w:rPr>
                 <w:rStyle w:val="Hipervnculo"/>
@@ -2613,7 +2506,7 @@
                 <w:noProof/>
                 <w:webHidden/>
               </w:rPr>
-              <w:instrText xml:space="preserve"> PAGEREF _Toc202122291 \h </w:instrText>
+              <w:instrText xml:space="preserve"> PAGEREF _Toc206607310 \h </w:instrText>
             </w:r>
             <w:r>
               <w:rPr>
@@ -2633,7 +2526,7 @@
                 <w:noProof/>
                 <w:webHidden/>
               </w:rPr>
-              <w:t>19</w:t>
+              <w:t>20</w:t>
             </w:r>
             <w:r>
               <w:rPr>
@@ -2660,7 +2553,7 @@
               <w14:ligatures w14:val="standardContextual"/>
             </w:rPr>
           </w:pPr>
-          <w:hyperlink w:anchor="_Toc202122292" w:history="1">
+          <w:hyperlink w:anchor="_Toc206607311" w:history="1">
             <w:r>
               <w:rPr>
                 <w:rStyle w:val="Hipervnculo"/>
@@ -2688,7 +2581,7 @@
                 <w:noProof/>
                 <w:webHidden/>
               </w:rPr>
-              <w:instrText xml:space="preserve"> PAGEREF _Toc202122292 \h </w:instrText>
+              <w:instrText xml:space="preserve"> PAGEREF _Toc206607311 \h </w:instrText>
             </w:r>
             <w:r>
               <w:rPr>
@@ -2708,7 +2601,7 @@
                 <w:noProof/>
                 <w:webHidden/>
               </w:rPr>
-              <w:t>19</w:t>
+              <w:t>20</w:t>
             </w:r>
             <w:r>
               <w:rPr>
@@ -2735,7 +2628,7 @@
               <w14:ligatures w14:val="standardContextual"/>
             </w:rPr>
           </w:pPr>
-          <w:hyperlink w:anchor="_Toc202122293" w:history="1">
+          <w:hyperlink w:anchor="_Toc206607312" w:history="1">
             <w:r>
               <w:rPr>
                 <w:rStyle w:val="Hipervnculo"/>
@@ -2763,7 +2656,7 @@
                 <w:noProof/>
                 <w:webHidden/>
               </w:rPr>
-              <w:instrText xml:space="preserve"> PAGEREF _Toc202122293 \h </w:instrText>
+              <w:instrText xml:space="preserve"> PAGEREF _Toc206607312 \h </w:instrText>
             </w:r>
             <w:r>
               <w:rPr>
@@ -2783,7 +2676,7 @@
                 <w:noProof/>
                 <w:webHidden/>
               </w:rPr>
-              <w:t>19</w:t>
+              <w:t>20</w:t>
             </w:r>
             <w:r>
               <w:rPr>
@@ -2810,7 +2703,7 @@
               <w14:ligatures w14:val="standardContextual"/>
             </w:rPr>
           </w:pPr>
-          <w:hyperlink w:anchor="_Toc202122294" w:history="1">
+          <w:hyperlink w:anchor="_Toc206607313" w:history="1">
             <w:r>
               <w:rPr>
                 <w:rStyle w:val="Hipervnculo"/>
@@ -2838,7 +2731,7 @@
                 <w:noProof/>
                 <w:webHidden/>
               </w:rPr>
-              <w:instrText xml:space="preserve"> PAGEREF _Toc202122294 \h </w:instrText>
+              <w:instrText xml:space="preserve"> PAGEREF _Toc206607313 \h </w:instrText>
             </w:r>
             <w:r>
               <w:rPr>
@@ -2858,7 +2751,7 @@
                 <w:noProof/>
                 <w:webHidden/>
               </w:rPr>
-              <w:t>19</w:t>
+              <w:t>20</w:t>
             </w:r>
             <w:r>
               <w:rPr>
@@ -2885,7 +2778,7 @@
               <w14:ligatures w14:val="standardContextual"/>
             </w:rPr>
           </w:pPr>
-          <w:hyperlink w:anchor="_Toc202122295" w:history="1">
+          <w:hyperlink w:anchor="_Toc206607314" w:history="1">
             <w:r>
               <w:rPr>
                 <w:rStyle w:val="Hipervnculo"/>
@@ -2913,7 +2806,7 @@
                 <w:noProof/>
                 <w:webHidden/>
               </w:rPr>
-              <w:instrText xml:space="preserve"> PAGEREF _Toc202122295 \h </w:instrText>
+              <w:instrText xml:space="preserve"> PAGEREF _Toc206607314 \h </w:instrText>
             </w:r>
             <w:r>
               <w:rPr>
@@ -2933,7 +2826,7 @@
                 <w:noProof/>
                 <w:webHidden/>
               </w:rPr>
-              <w:t>19</w:t>
+              <w:t>20</w:t>
             </w:r>
             <w:r>
               <w:rPr>
@@ -2960,7 +2853,7 @@
               <w14:ligatures w14:val="standardContextual"/>
             </w:rPr>
           </w:pPr>
-          <w:hyperlink w:anchor="_Toc202122296" w:history="1">
+          <w:hyperlink w:anchor="_Toc206607315" w:history="1">
             <w:r>
               <w:rPr>
                 <w:rStyle w:val="Hipervnculo"/>
@@ -2988,7 +2881,7 @@
                 <w:noProof/>
                 <w:webHidden/>
               </w:rPr>
-              <w:instrText xml:space="preserve"> PAGEREF _Toc202122296 \h </w:instrText>
+              <w:instrText xml:space="preserve"> PAGEREF _Toc206607315 \h </w:instrText>
             </w:r>
             <w:r>
               <w:rPr>
@@ -3008,7 +2901,7 @@
                 <w:noProof/>
                 <w:webHidden/>
               </w:rPr>
-              <w:t>19</w:t>
+              <w:t>21</w:t>
             </w:r>
             <w:r>
               <w:rPr>
@@ -3035,7 +2928,7 @@
               <w14:ligatures w14:val="standardContextual"/>
             </w:rPr>
           </w:pPr>
-          <w:hyperlink w:anchor="_Toc202122297" w:history="1">
+          <w:hyperlink w:anchor="_Toc206607316" w:history="1">
             <w:r>
               <w:rPr>
                 <w:rStyle w:val="Hipervnculo"/>
@@ -3062,7 +2955,7 @@
                 <w:noProof/>
                 <w:webHidden/>
               </w:rPr>
-              <w:instrText xml:space="preserve"> PAGEREF _Toc202122297 \h </w:instrText>
+              <w:instrText xml:space="preserve"> PAGEREF _Toc206607316 \h </w:instrText>
             </w:r>
             <w:r>
               <w:rPr>
@@ -3082,7 +2975,7 @@
                 <w:noProof/>
                 <w:webHidden/>
               </w:rPr>
-              <w:t>20</w:t>
+              <w:t>21</w:t>
             </w:r>
             <w:r>
               <w:rPr>
@@ -3109,7 +3002,7 @@
               <w14:ligatures w14:val="standardContextual"/>
             </w:rPr>
           </w:pPr>
-          <w:hyperlink w:anchor="_Toc202122298" w:history="1">
+          <w:hyperlink w:anchor="_Toc206607317" w:history="1">
             <w:r>
               <w:rPr>
                 <w:rStyle w:val="Hipervnculo"/>
@@ -3137,7 +3030,7 @@
                 <w:noProof/>
                 <w:webHidden/>
               </w:rPr>
-              <w:instrText xml:space="preserve"> PAGEREF _Toc202122298 \h </w:instrText>
+              <w:instrText xml:space="preserve"> PAGEREF _Toc206607317 \h </w:instrText>
             </w:r>
             <w:r>
               <w:rPr>
@@ -3157,7 +3050,7 @@
                 <w:noProof/>
                 <w:webHidden/>
               </w:rPr>
-              <w:t>20</w:t>
+              <w:t>21</w:t>
             </w:r>
             <w:r>
               <w:rPr>
@@ -3193,22 +3086,9 @@
     </w:sdt>
     <w:p>
       <w:pPr>
-        <w:widowControl/>
-        <w:rPr>
-          <w:rFonts w:ascii="Liberation Sans" w:eastAsia="Liberation Sans" w:hAnsi="Liberation Sans" w:cs="Liberation Sans"/>
-          <w:b/>
-          <w:u w:val="single"/>
-        </w:rPr>
-      </w:pPr>
-      <w:r>
-        <w:br w:type="page"/>
-      </w:r>
-    </w:p>
-    <w:p>
-      <w:pPr>
         <w:pStyle w:val="Ttulo3"/>
       </w:pPr>
-      <w:bookmarkStart w:id="1" w:name="_Toc202122264"/>
+      <w:bookmarkStart w:id="1" w:name="_Toc206607283"/>
       <w:r>
         <w:lastRenderedPageBreak/>
         <w:t>Contexto</w:t>
@@ -4490,16 +4370,23 @@
           <w:rFonts w:ascii="Liberation Sans" w:eastAsia="Liberation Sans" w:hAnsi="Liberation Sans" w:cs="Liberation Sans"/>
           <w:color w:val="000000"/>
         </w:rPr>
-        <w:t xml:space="preserve"> los estados. En la Argentina, este error se define como declaración inexacta y se penaliza con multa de 1 a 5 veces del perjuicio fiscal o, si se trata de una mercadería prohibida, del valor de la mercadería (Art. 954, Código Aduanero).</w:t>
+        <w:t xml:space="preserve"> los estados. En la Argentina, </w:t>
+      </w:r>
+      <w:r>
+        <w:rPr>
+          <w:rFonts w:ascii="Liberation Sans" w:eastAsia="Liberation Sans" w:hAnsi="Liberation Sans" w:cs="Liberation Sans"/>
+          <w:color w:val="000000"/>
+        </w:rPr>
+        <w:lastRenderedPageBreak/>
+        <w:t>este error se define como declaración inexacta y se penaliza con multa de 1 a 5 veces del perjuicio fiscal o, si se trata de una mercadería prohibida, del valor de la mercadería (Art. 954, Código Aduanero).</w:t>
       </w:r>
     </w:p>
     <w:p>
       <w:pPr>
         <w:pStyle w:val="Ttulo3"/>
       </w:pPr>
-      <w:bookmarkStart w:id="2" w:name="_Toc202122265"/>
-      <w:r>
-        <w:lastRenderedPageBreak/>
+      <w:bookmarkStart w:id="2" w:name="_Toc206607284"/>
+      <w:r>
         <w:t>Objetivo</w:t>
       </w:r>
       <w:bookmarkEnd w:id="2"/>
@@ -4584,7 +4471,7 @@
       <w:pPr>
         <w:pStyle w:val="Ttulo3"/>
       </w:pPr>
-      <w:bookmarkStart w:id="3" w:name="_Toc202122266"/>
+      <w:bookmarkStart w:id="3" w:name="_Toc206607285"/>
       <w:r>
         <w:t>Descripción</w:t>
       </w:r>
@@ -4601,7 +4488,7 @@
           <w:numId w:val="7"/>
         </w:numPr>
       </w:pPr>
-      <w:bookmarkStart w:id="4" w:name="_Toc202122267"/>
+      <w:bookmarkStart w:id="4" w:name="_Toc206607286"/>
       <w:r>
         <w:t>Contenido y Origen:</w:t>
       </w:r>
@@ -4723,7 +4610,7 @@
           <w:numId w:val="7"/>
         </w:numPr>
       </w:pPr>
-      <w:bookmarkStart w:id="5" w:name="_Toc202122268"/>
+      <w:bookmarkStart w:id="5" w:name="_Toc206607287"/>
       <w:r>
         <w:t>Características:</w:t>
       </w:r>
@@ -4829,7 +4716,7 @@
       <w:pPr>
         <w:pStyle w:val="Ttulo3"/>
       </w:pPr>
-      <w:bookmarkStart w:id="6" w:name="_Toc202122269"/>
+      <w:bookmarkStart w:id="6" w:name="_Toc206607288"/>
       <w:r>
         <w:t>Preguntas y Retos del Proyecto</w:t>
       </w:r>
@@ -4895,7 +4782,7 @@
       <w:pPr>
         <w:pStyle w:val="Ttulo3"/>
       </w:pPr>
-      <w:bookmarkStart w:id="7" w:name="_Toc202122270"/>
+      <w:bookmarkStart w:id="7" w:name="_Toc206607289"/>
       <w:r>
         <w:t xml:space="preserve">Técnicas y Enfoques </w:t>
       </w:r>
@@ -5387,6 +5274,7 @@
           <w:rFonts w:ascii="Liberation Sans" w:eastAsia="Liberation Sans" w:hAnsi="Liberation Sans" w:cs="Liberation Sans"/>
           <w:color w:val="000000"/>
         </w:rPr>
+        <w:lastRenderedPageBreak/>
         <w:t>Learning</w:t>
       </w:r>
       <w:proofErr w:type="spellEnd"/>
@@ -5964,22 +5852,14 @@
           <w:rFonts w:ascii="Liberation Sans" w:eastAsia="Liberation Sans" w:hAnsi="Liberation Sans" w:cs="Liberation Sans"/>
           <w:color w:val="000000"/>
         </w:rPr>
-        <w:t xml:space="preserve"> Cómo método analítico y exploratorio, para reducir la </w:t>
-      </w:r>
-      <w:r>
-        <w:rPr>
-          <w:rFonts w:ascii="Liberation Sans" w:eastAsia="Liberation Sans" w:hAnsi="Liberation Sans" w:cs="Liberation Sans"/>
-          <w:color w:val="000000"/>
-        </w:rPr>
-        <w:lastRenderedPageBreak/>
-        <w:t>dimensionalidad del conjunto de datos, facilitar el manejo de las características extraídas e identificar patrones de los textos.</w:t>
+        <w:t xml:space="preserve"> Cómo método analítico y exploratorio, para reducir la dimensionalidad del conjunto de datos, facilitar el manejo de las características extraídas e identificar patrones de los textos.</w:t>
       </w:r>
     </w:p>
     <w:p>
       <w:pPr>
         <w:pStyle w:val="Ttulo3"/>
       </w:pPr>
-      <w:bookmarkStart w:id="8" w:name="_Toc202122271"/>
+      <w:bookmarkStart w:id="8" w:name="_Toc206607290"/>
       <w:r>
         <w:t>Metodología</w:t>
       </w:r>
@@ -5993,7 +5873,7 @@
           <w:numId w:val="7"/>
         </w:numPr>
       </w:pPr>
-      <w:bookmarkStart w:id="9" w:name="_Toc202122272"/>
+      <w:bookmarkStart w:id="9" w:name="_Toc206607291"/>
       <w:r>
         <w:t>EDA</w:t>
       </w:r>
@@ -6174,7 +6054,7 @@
           <w:numId w:val="7"/>
         </w:numPr>
       </w:pPr>
-      <w:bookmarkStart w:id="10" w:name="_Toc202122273"/>
+      <w:bookmarkStart w:id="10" w:name="_Toc206607292"/>
       <w:r>
         <w:t>Ingeniería de variables</w:t>
       </w:r>
@@ -6355,7 +6235,7 @@
           <w:numId w:val="7"/>
         </w:numPr>
       </w:pPr>
-      <w:bookmarkStart w:id="11" w:name="_Toc202122274"/>
+      <w:bookmarkStart w:id="11" w:name="_Toc206607293"/>
       <w:r>
         <w:t>Técnicas no-supervisadas</w:t>
       </w:r>
@@ -6497,7 +6377,7 @@
           <w:numId w:val="7"/>
         </w:numPr>
       </w:pPr>
-      <w:bookmarkStart w:id="12" w:name="_Toc202122275"/>
+      <w:bookmarkStart w:id="12" w:name="_Toc206607294"/>
       <w:r>
         <w:t xml:space="preserve">Definición del </w:t>
       </w:r>
@@ -6526,7 +6406,15 @@
           <w:rFonts w:ascii="Liberation Sans" w:eastAsia="Liberation Sans" w:hAnsi="Liberation Sans" w:cs="Liberation Sans"/>
           <w:color w:val="000000"/>
         </w:rPr>
-        <w:t xml:space="preserve">En el contexto planteado, la desagregación del código tarifario HS06, en códigos regionales o nacionales, tiene fundamento de negocio y permite considerar futuros cambios en la variable objetivo. Ampliando lo antes mencionado, la clasificación de mercaderías usando el HS, a nivel internacional, se </w:t>
+        <w:t xml:space="preserve">En el contexto planteado, la desagregación del código tarifario HS06, en códigos </w:t>
+      </w:r>
+      <w:r>
+        <w:rPr>
+          <w:rFonts w:ascii="Liberation Sans" w:eastAsia="Liberation Sans" w:hAnsi="Liberation Sans" w:cs="Liberation Sans"/>
+          <w:color w:val="000000"/>
+        </w:rPr>
+        <w:lastRenderedPageBreak/>
+        <w:t xml:space="preserve">regionales o nacionales, tiene fundamento de negocio y permite considerar futuros cambios en la variable objetivo. Ampliando lo antes mencionado, la clasificación de mercaderías usando el HS, a nivel internacional, se </w:t>
       </w:r>
       <w:r>
         <w:rPr>
@@ -6606,15 +6494,7 @@
           <w:rFonts w:ascii="Liberation Sans" w:eastAsia="Liberation Sans" w:hAnsi="Liberation Sans" w:cs="Liberation Sans"/>
           <w:color w:val="000000"/>
         </w:rPr>
-        <w:t xml:space="preserve">Partidas (HS04): Primeros cuatro dígitos del código y define a mercaderías relevantes para el comercio internacional. Ejemplo: Partida 8471 define a las máquinas automáticas para tratamiento o procesamiento de datos </w:t>
-      </w:r>
-      <w:r>
-        <w:rPr>
-          <w:rFonts w:ascii="Liberation Sans" w:eastAsia="Liberation Sans" w:hAnsi="Liberation Sans" w:cs="Liberation Sans"/>
-          <w:color w:val="000000"/>
-        </w:rPr>
-        <w:lastRenderedPageBreak/>
-        <w:t>(computadoras).</w:t>
+        <w:t>Partidas (HS04): Primeros cuatro dígitos del código y define a mercaderías relevantes para el comercio internacional. Ejemplo: Partida 8471 define a las máquinas automáticas para tratamiento o procesamiento de datos (computadoras).</w:t>
       </w:r>
     </w:p>
     <w:p>
@@ -6700,7 +6580,7 @@
           <w:numId w:val="7"/>
         </w:numPr>
       </w:pPr>
-      <w:bookmarkStart w:id="13" w:name="_Toc202122276"/>
+      <w:bookmarkStart w:id="13" w:name="_Toc206607295"/>
       <w:r>
         <w:t>Técnicas supervisadas y transferencia del aprendizaje</w:t>
       </w:r>
@@ -6808,7 +6688,14 @@
           <w:rFonts w:ascii="Liberation Sans" w:eastAsia="Liberation Sans" w:hAnsi="Liberation Sans" w:cs="Liberation Sans"/>
           <w:color w:val="000000"/>
         </w:rPr>
-        <w:t>distiltBERT</w:t>
+        <w:t>D</w:t>
+      </w:r>
+      <w:r>
+        <w:rPr>
+          <w:rFonts w:ascii="Liberation Sans" w:eastAsia="Liberation Sans" w:hAnsi="Liberation Sans" w:cs="Liberation Sans"/>
+          <w:color w:val="000000"/>
+        </w:rPr>
+        <w:t>istiltBERT</w:t>
       </w:r>
       <w:proofErr w:type="spellEnd"/>
       <w:r>
@@ -7053,7 +6940,7 @@
       <w:pPr>
         <w:pStyle w:val="Ttulo3"/>
       </w:pPr>
-      <w:bookmarkStart w:id="14" w:name="_Toc202122277"/>
+      <w:bookmarkStart w:id="14" w:name="_Toc206607296"/>
       <w:r>
         <w:t>Perfilado y análisis de los datos</w:t>
       </w:r>
@@ -7067,7 +6954,7 @@
           <w:numId w:val="7"/>
         </w:numPr>
       </w:pPr>
-      <w:bookmarkStart w:id="15" w:name="_Toc202122278"/>
+      <w:bookmarkStart w:id="15" w:name="_Toc206607297"/>
       <w:r>
         <w:t>Quick EDA</w:t>
       </w:r>
@@ -7155,7 +7042,6 @@
               <w:bottom w:val="single" w:sz="4" w:space="0" w:color="BFBFBF"/>
               <w:right w:val="single" w:sz="4" w:space="0" w:color="BFBFBF"/>
             </w:tcBorders>
-            <w:shd w:val="clear" w:color="auto" w:fill="auto"/>
           </w:tcPr>
           <w:p>
             <w:pPr>
@@ -7184,7 +7070,6 @@
               <w:bottom w:val="single" w:sz="4" w:space="0" w:color="BFBFBF"/>
               <w:right w:val="single" w:sz="4" w:space="0" w:color="BFBFBF"/>
             </w:tcBorders>
-            <w:shd w:val="clear" w:color="auto" w:fill="auto"/>
           </w:tcPr>
           <w:p>
             <w:pPr>
@@ -7281,7 +7166,6 @@
               <w:bottom w:val="single" w:sz="4" w:space="0" w:color="BFBFBF"/>
               <w:right w:val="single" w:sz="4" w:space="0" w:color="BFBFBF"/>
             </w:tcBorders>
-            <w:shd w:val="clear" w:color="auto" w:fill="auto"/>
           </w:tcPr>
           <w:p>
             <w:pPr>
@@ -7310,7 +7194,6 @@
               <w:bottom w:val="single" w:sz="4" w:space="0" w:color="BFBFBF"/>
               <w:right w:val="single" w:sz="4" w:space="0" w:color="BFBFBF"/>
             </w:tcBorders>
-            <w:shd w:val="clear" w:color="auto" w:fill="auto"/>
           </w:tcPr>
           <w:p>
             <w:pPr>
@@ -7360,6 +7243,7 @@
                 <w:rFonts w:ascii="Liberation Sans Narrow" w:eastAsia="Liberation Sans Narrow" w:hAnsi="Liberation Sans Narrow" w:cs="Liberation Sans Narrow"/>
                 <w:color w:val="000000"/>
               </w:rPr>
+              <w:lastRenderedPageBreak/>
               <w:t>HS04</w:t>
             </w:r>
           </w:p>
@@ -7407,7 +7291,6 @@
               <w:bottom w:val="single" w:sz="4" w:space="0" w:color="BFBFBF"/>
               <w:right w:val="single" w:sz="4" w:space="0" w:color="BFBFBF"/>
             </w:tcBorders>
-            <w:shd w:val="clear" w:color="auto" w:fill="auto"/>
           </w:tcPr>
           <w:p>
             <w:pPr>
@@ -7436,7 +7319,6 @@
               <w:bottom w:val="single" w:sz="4" w:space="0" w:color="BFBFBF"/>
               <w:right w:val="single" w:sz="4" w:space="0" w:color="BFBFBF"/>
             </w:tcBorders>
-            <w:shd w:val="clear" w:color="auto" w:fill="auto"/>
           </w:tcPr>
           <w:p>
             <w:pPr>
@@ -7508,7 +7390,6 @@
               <w:bottom w:val="single" w:sz="4" w:space="0" w:color="BFBFBF"/>
               <w:right w:val="single" w:sz="4" w:space="0" w:color="BFBFBF"/>
             </w:tcBorders>
-            <w:shd w:val="clear" w:color="auto" w:fill="auto"/>
           </w:tcPr>
           <w:p>
             <w:pPr>
@@ -7537,7 +7418,6 @@
               <w:bottom w:val="single" w:sz="4" w:space="0" w:color="BFBFBF"/>
               <w:right w:val="single" w:sz="4" w:space="0" w:color="BFBFBF"/>
             </w:tcBorders>
-            <w:shd w:val="clear" w:color="auto" w:fill="auto"/>
           </w:tcPr>
           <w:p>
             <w:pPr>
@@ -7566,7 +7446,6 @@
               <w:bottom w:val="single" w:sz="4" w:space="0" w:color="BFBFBF"/>
               <w:right w:val="single" w:sz="4" w:space="0" w:color="BFBFBF"/>
             </w:tcBorders>
-            <w:shd w:val="clear" w:color="auto" w:fill="auto"/>
           </w:tcPr>
           <w:p>
             <w:pPr>
@@ -7595,7 +7474,6 @@
               <w:bottom w:val="single" w:sz="4" w:space="0" w:color="BFBFBF"/>
               <w:right w:val="single" w:sz="4" w:space="0" w:color="BFBFBF"/>
             </w:tcBorders>
-            <w:shd w:val="clear" w:color="auto" w:fill="auto"/>
           </w:tcPr>
           <w:p>
             <w:pPr>
@@ -7750,7 +7628,6 @@
               <w:bottom w:val="single" w:sz="4" w:space="0" w:color="BFBFBF"/>
               <w:right w:val="single" w:sz="4" w:space="0" w:color="BFBFBF"/>
             </w:tcBorders>
-            <w:shd w:val="clear" w:color="auto" w:fill="auto"/>
           </w:tcPr>
           <w:p>
             <w:pPr>
@@ -7779,7 +7656,6 @@
               <w:bottom w:val="single" w:sz="4" w:space="0" w:color="BFBFBF"/>
               <w:right w:val="single" w:sz="4" w:space="0" w:color="BFBFBF"/>
             </w:tcBorders>
-            <w:shd w:val="clear" w:color="auto" w:fill="auto"/>
           </w:tcPr>
           <w:p>
             <w:pPr>
@@ -7808,7 +7684,6 @@
               <w:bottom w:val="single" w:sz="4" w:space="0" w:color="BFBFBF"/>
               <w:right w:val="single" w:sz="4" w:space="0" w:color="BFBFBF"/>
             </w:tcBorders>
-            <w:shd w:val="clear" w:color="auto" w:fill="auto"/>
           </w:tcPr>
           <w:p>
             <w:pPr>
@@ -7837,7 +7712,6 @@
               <w:bottom w:val="single" w:sz="4" w:space="0" w:color="BFBFBF"/>
               <w:right w:val="single" w:sz="4" w:space="0" w:color="BFBFBF"/>
             </w:tcBorders>
-            <w:shd w:val="clear" w:color="auto" w:fill="auto"/>
           </w:tcPr>
           <w:p>
             <w:pPr>
@@ -7992,7 +7866,6 @@
               <w:bottom w:val="single" w:sz="4" w:space="0" w:color="BFBFBF"/>
               <w:right w:val="single" w:sz="4" w:space="0" w:color="BFBFBF"/>
             </w:tcBorders>
-            <w:shd w:val="clear" w:color="auto" w:fill="auto"/>
           </w:tcPr>
           <w:p>
             <w:pPr>
@@ -8021,7 +7894,6 @@
               <w:bottom w:val="single" w:sz="4" w:space="0" w:color="BFBFBF"/>
               <w:right w:val="single" w:sz="4" w:space="0" w:color="BFBFBF"/>
             </w:tcBorders>
-            <w:shd w:val="clear" w:color="auto" w:fill="auto"/>
           </w:tcPr>
           <w:p>
             <w:pPr>
@@ -8050,7 +7922,6 @@
               <w:bottom w:val="single" w:sz="4" w:space="0" w:color="BFBFBF"/>
               <w:right w:val="single" w:sz="4" w:space="0" w:color="BFBFBF"/>
             </w:tcBorders>
-            <w:shd w:val="clear" w:color="auto" w:fill="auto"/>
           </w:tcPr>
           <w:p>
             <w:pPr>
@@ -8079,7 +7950,6 @@
               <w:bottom w:val="single" w:sz="4" w:space="0" w:color="BFBFBF"/>
               <w:right w:val="single" w:sz="4" w:space="0" w:color="BFBFBF"/>
             </w:tcBorders>
-            <w:shd w:val="clear" w:color="auto" w:fill="auto"/>
           </w:tcPr>
           <w:p>
             <w:pPr>
@@ -8234,7 +8104,6 @@
               <w:bottom w:val="single" w:sz="4" w:space="0" w:color="BFBFBF"/>
               <w:right w:val="single" w:sz="4" w:space="0" w:color="BFBFBF"/>
             </w:tcBorders>
-            <w:shd w:val="clear" w:color="auto" w:fill="auto"/>
           </w:tcPr>
           <w:p>
             <w:pPr>
@@ -8263,7 +8132,6 @@
               <w:bottom w:val="single" w:sz="4" w:space="0" w:color="BFBFBF"/>
               <w:right w:val="single" w:sz="4" w:space="0" w:color="BFBFBF"/>
             </w:tcBorders>
-            <w:shd w:val="clear" w:color="auto" w:fill="auto"/>
           </w:tcPr>
           <w:p>
             <w:pPr>
@@ -8292,7 +8160,6 @@
               <w:bottom w:val="single" w:sz="4" w:space="0" w:color="BFBFBF"/>
               <w:right w:val="single" w:sz="4" w:space="0" w:color="BFBFBF"/>
             </w:tcBorders>
-            <w:shd w:val="clear" w:color="auto" w:fill="auto"/>
           </w:tcPr>
           <w:p>
             <w:pPr>
@@ -8321,7 +8188,6 @@
               <w:bottom w:val="single" w:sz="4" w:space="0" w:color="BFBFBF"/>
               <w:right w:val="single" w:sz="4" w:space="0" w:color="BFBFBF"/>
             </w:tcBorders>
-            <w:shd w:val="clear" w:color="auto" w:fill="auto"/>
           </w:tcPr>
           <w:p>
             <w:pPr>
@@ -8476,7 +8342,6 @@
               <w:bottom w:val="single" w:sz="4" w:space="0" w:color="BFBFBF"/>
               <w:right w:val="single" w:sz="4" w:space="0" w:color="BFBFBF"/>
             </w:tcBorders>
-            <w:shd w:val="clear" w:color="auto" w:fill="auto"/>
           </w:tcPr>
           <w:p>
             <w:pPr>
@@ -8505,7 +8370,6 @@
               <w:bottom w:val="single" w:sz="4" w:space="0" w:color="BFBFBF"/>
               <w:right w:val="single" w:sz="4" w:space="0" w:color="BFBFBF"/>
             </w:tcBorders>
-            <w:shd w:val="clear" w:color="auto" w:fill="auto"/>
           </w:tcPr>
           <w:p>
             <w:pPr>
@@ -8534,7 +8398,6 @@
               <w:bottom w:val="single" w:sz="4" w:space="0" w:color="BFBFBF"/>
               <w:right w:val="single" w:sz="4" w:space="0" w:color="BFBFBF"/>
             </w:tcBorders>
-            <w:shd w:val="clear" w:color="auto" w:fill="auto"/>
           </w:tcPr>
           <w:p>
             <w:pPr>
@@ -8563,7 +8426,6 @@
               <w:bottom w:val="single" w:sz="4" w:space="0" w:color="BFBFBF"/>
               <w:right w:val="single" w:sz="4" w:space="0" w:color="BFBFBF"/>
             </w:tcBorders>
-            <w:shd w:val="clear" w:color="auto" w:fill="auto"/>
           </w:tcPr>
           <w:p>
             <w:pPr>
@@ -8718,23 +8580,21 @@
               <w:bottom w:val="single" w:sz="4" w:space="0" w:color="BFBFBF"/>
               <w:right w:val="single" w:sz="4" w:space="0" w:color="BFBFBF"/>
             </w:tcBorders>
-            <w:shd w:val="clear" w:color="auto" w:fill="auto"/>
-          </w:tcPr>
-          <w:p>
-            <w:pPr>
-              <w:pStyle w:val="LO-normal"/>
-              <w:jc w:val="center"/>
-              <w:rPr>
-                <w:rFonts w:ascii="Liberation Sans Narrow" w:eastAsia="Liberation Sans Narrow" w:hAnsi="Liberation Sans Narrow" w:cs="Liberation Sans Narrow"/>
-                <w:color w:val="000000"/>
-              </w:rPr>
-            </w:pPr>
-            <w:r>
-              <w:rPr>
-                <w:rFonts w:ascii="Liberation Sans Narrow" w:eastAsia="Liberation Sans Narrow" w:hAnsi="Liberation Sans Narrow" w:cs="Liberation Sans Narrow"/>
-                <w:color w:val="000000"/>
-              </w:rPr>
-              <w:lastRenderedPageBreak/>
+          </w:tcPr>
+          <w:p>
+            <w:pPr>
+              <w:pStyle w:val="LO-normal"/>
+              <w:jc w:val="center"/>
+              <w:rPr>
+                <w:rFonts w:ascii="Liberation Sans Narrow" w:eastAsia="Liberation Sans Narrow" w:hAnsi="Liberation Sans Narrow" w:cs="Liberation Sans Narrow"/>
+                <w:color w:val="000000"/>
+              </w:rPr>
+            </w:pPr>
+            <w:r>
+              <w:rPr>
+                <w:rFonts w:ascii="Liberation Sans Narrow" w:eastAsia="Liberation Sans Narrow" w:hAnsi="Liberation Sans Narrow" w:cs="Liberation Sans Narrow"/>
+                <w:color w:val="000000"/>
+              </w:rPr>
               <w:t>83</w:t>
             </w:r>
           </w:p>
@@ -8748,7 +8608,6 @@
               <w:bottom w:val="single" w:sz="4" w:space="0" w:color="BFBFBF"/>
               <w:right w:val="single" w:sz="4" w:space="0" w:color="BFBFBF"/>
             </w:tcBorders>
-            <w:shd w:val="clear" w:color="auto" w:fill="auto"/>
           </w:tcPr>
           <w:p>
             <w:pPr>
@@ -8777,7 +8636,6 @@
               <w:bottom w:val="single" w:sz="4" w:space="0" w:color="BFBFBF"/>
               <w:right w:val="single" w:sz="4" w:space="0" w:color="BFBFBF"/>
             </w:tcBorders>
-            <w:shd w:val="clear" w:color="auto" w:fill="auto"/>
           </w:tcPr>
           <w:p>
             <w:pPr>
@@ -8806,7 +8664,6 @@
               <w:bottom w:val="single" w:sz="4" w:space="0" w:color="BFBFBF"/>
               <w:right w:val="single" w:sz="4" w:space="0" w:color="BFBFBF"/>
             </w:tcBorders>
-            <w:shd w:val="clear" w:color="auto" w:fill="auto"/>
           </w:tcPr>
           <w:p>
             <w:pPr>
@@ -8878,7 +8735,6 @@
               <w:bottom w:val="single" w:sz="4" w:space="0" w:color="BFBFBF"/>
               <w:right w:val="single" w:sz="4" w:space="0" w:color="BFBFBF"/>
             </w:tcBorders>
-            <w:shd w:val="clear" w:color="auto" w:fill="auto"/>
           </w:tcPr>
           <w:p>
             <w:pPr>
@@ -8907,7 +8763,6 @@
               <w:bottom w:val="single" w:sz="4" w:space="0" w:color="BFBFBF"/>
               <w:right w:val="single" w:sz="4" w:space="0" w:color="BFBFBF"/>
             </w:tcBorders>
-            <w:shd w:val="clear" w:color="auto" w:fill="auto"/>
           </w:tcPr>
           <w:p>
             <w:pPr>
@@ -8936,7 +8791,6 @@
               <w:bottom w:val="single" w:sz="4" w:space="0" w:color="BFBFBF"/>
               <w:right w:val="single" w:sz="4" w:space="0" w:color="BFBFBF"/>
             </w:tcBorders>
-            <w:shd w:val="clear" w:color="auto" w:fill="auto"/>
           </w:tcPr>
           <w:p>
             <w:pPr>
@@ -8965,7 +8819,6 @@
               <w:bottom w:val="single" w:sz="4" w:space="0" w:color="BFBFBF"/>
               <w:right w:val="single" w:sz="4" w:space="0" w:color="BFBFBF"/>
             </w:tcBorders>
-            <w:shd w:val="clear" w:color="auto" w:fill="auto"/>
           </w:tcPr>
           <w:p>
             <w:pPr>
@@ -9120,7 +8973,6 @@
               <w:bottom w:val="single" w:sz="4" w:space="0" w:color="BFBFBF"/>
               <w:right w:val="single" w:sz="4" w:space="0" w:color="BFBFBF"/>
             </w:tcBorders>
-            <w:shd w:val="clear" w:color="auto" w:fill="auto"/>
           </w:tcPr>
           <w:p>
             <w:pPr>
@@ -9149,7 +9001,6 @@
               <w:bottom w:val="single" w:sz="4" w:space="0" w:color="BFBFBF"/>
               <w:right w:val="single" w:sz="4" w:space="0" w:color="BFBFBF"/>
             </w:tcBorders>
-            <w:shd w:val="clear" w:color="auto" w:fill="auto"/>
           </w:tcPr>
           <w:p>
             <w:pPr>
@@ -9178,7 +9029,6 @@
               <w:bottom w:val="single" w:sz="4" w:space="0" w:color="BFBFBF"/>
               <w:right w:val="single" w:sz="4" w:space="0" w:color="BFBFBF"/>
             </w:tcBorders>
-            <w:shd w:val="clear" w:color="auto" w:fill="auto"/>
           </w:tcPr>
           <w:p>
             <w:pPr>
@@ -9207,7 +9057,6 @@
               <w:bottom w:val="single" w:sz="4" w:space="0" w:color="BFBFBF"/>
               <w:right w:val="single" w:sz="4" w:space="0" w:color="BFBFBF"/>
             </w:tcBorders>
-            <w:shd w:val="clear" w:color="auto" w:fill="auto"/>
           </w:tcPr>
           <w:p>
             <w:pPr>
@@ -9362,7 +9211,6 @@
               <w:bottom w:val="single" w:sz="4" w:space="0" w:color="BFBFBF"/>
               <w:right w:val="single" w:sz="4" w:space="0" w:color="BFBFBF"/>
             </w:tcBorders>
-            <w:shd w:val="clear" w:color="auto" w:fill="auto"/>
           </w:tcPr>
           <w:p>
             <w:pPr>
@@ -9391,7 +9239,6 @@
               <w:bottom w:val="single" w:sz="4" w:space="0" w:color="BFBFBF"/>
               <w:right w:val="single" w:sz="4" w:space="0" w:color="BFBFBF"/>
             </w:tcBorders>
-            <w:shd w:val="clear" w:color="auto" w:fill="auto"/>
           </w:tcPr>
           <w:p>
             <w:pPr>
@@ -9420,7 +9267,6 @@
               <w:bottom w:val="single" w:sz="4" w:space="0" w:color="BFBFBF"/>
               <w:right w:val="single" w:sz="4" w:space="0" w:color="BFBFBF"/>
             </w:tcBorders>
-            <w:shd w:val="clear" w:color="auto" w:fill="auto"/>
           </w:tcPr>
           <w:p>
             <w:pPr>
@@ -9449,7 +9295,6 @@
               <w:bottom w:val="single" w:sz="4" w:space="0" w:color="BFBFBF"/>
               <w:right w:val="single" w:sz="4" w:space="0" w:color="BFBFBF"/>
             </w:tcBorders>
-            <w:shd w:val="clear" w:color="auto" w:fill="auto"/>
           </w:tcPr>
           <w:p>
             <w:pPr>
@@ -9604,7 +9449,6 @@
               <w:bottom w:val="single" w:sz="4" w:space="0" w:color="BFBFBF"/>
               <w:right w:val="single" w:sz="4" w:space="0" w:color="BFBFBF"/>
             </w:tcBorders>
-            <w:shd w:val="clear" w:color="auto" w:fill="auto"/>
           </w:tcPr>
           <w:p>
             <w:pPr>
@@ -9633,7 +9477,6 @@
               <w:bottom w:val="single" w:sz="4" w:space="0" w:color="BFBFBF"/>
               <w:right w:val="single" w:sz="4" w:space="0" w:color="BFBFBF"/>
             </w:tcBorders>
-            <w:shd w:val="clear" w:color="auto" w:fill="auto"/>
           </w:tcPr>
           <w:p>
             <w:pPr>
@@ -9662,7 +9505,6 @@
               <w:bottom w:val="single" w:sz="4" w:space="0" w:color="BFBFBF"/>
               <w:right w:val="single" w:sz="4" w:space="0" w:color="BFBFBF"/>
             </w:tcBorders>
-            <w:shd w:val="clear" w:color="auto" w:fill="auto"/>
           </w:tcPr>
           <w:p>
             <w:pPr>
@@ -9691,7 +9533,6 @@
               <w:bottom w:val="single" w:sz="4" w:space="0" w:color="BFBFBF"/>
               <w:right w:val="single" w:sz="4" w:space="0" w:color="BFBFBF"/>
             </w:tcBorders>
-            <w:shd w:val="clear" w:color="auto" w:fill="auto"/>
           </w:tcPr>
           <w:p>
             <w:pPr>
@@ -9846,7 +9687,6 @@
               <w:bottom w:val="single" w:sz="4" w:space="0" w:color="BFBFBF"/>
               <w:right w:val="single" w:sz="4" w:space="0" w:color="BFBFBF"/>
             </w:tcBorders>
-            <w:shd w:val="clear" w:color="auto" w:fill="auto"/>
           </w:tcPr>
           <w:p>
             <w:pPr>
@@ -9875,7 +9715,6 @@
               <w:bottom w:val="single" w:sz="4" w:space="0" w:color="BFBFBF"/>
               <w:right w:val="single" w:sz="4" w:space="0" w:color="BFBFBF"/>
             </w:tcBorders>
-            <w:shd w:val="clear" w:color="auto" w:fill="auto"/>
           </w:tcPr>
           <w:p>
             <w:pPr>
@@ -9904,7 +9743,6 @@
               <w:bottom w:val="single" w:sz="4" w:space="0" w:color="BFBFBF"/>
               <w:right w:val="single" w:sz="4" w:space="0" w:color="BFBFBF"/>
             </w:tcBorders>
-            <w:shd w:val="clear" w:color="auto" w:fill="auto"/>
           </w:tcPr>
           <w:p>
             <w:pPr>
@@ -9933,7 +9771,6 @@
               <w:bottom w:val="single" w:sz="4" w:space="0" w:color="BFBFBF"/>
               <w:right w:val="single" w:sz="4" w:space="0" w:color="BFBFBF"/>
             </w:tcBorders>
-            <w:shd w:val="clear" w:color="auto" w:fill="auto"/>
           </w:tcPr>
           <w:p>
             <w:pPr>
@@ -10088,7 +9925,6 @@
               <w:bottom w:val="single" w:sz="4" w:space="0" w:color="BFBFBF"/>
               <w:right w:val="single" w:sz="4" w:space="0" w:color="BFBFBF"/>
             </w:tcBorders>
-            <w:shd w:val="clear" w:color="auto" w:fill="auto"/>
           </w:tcPr>
           <w:p>
             <w:pPr>
@@ -10117,7 +9953,6 @@
               <w:bottom w:val="single" w:sz="4" w:space="0" w:color="BFBFBF"/>
               <w:right w:val="single" w:sz="4" w:space="0" w:color="BFBFBF"/>
             </w:tcBorders>
-            <w:shd w:val="clear" w:color="auto" w:fill="auto"/>
           </w:tcPr>
           <w:p>
             <w:pPr>
@@ -10146,7 +9981,6 @@
               <w:bottom w:val="single" w:sz="4" w:space="0" w:color="BFBFBF"/>
               <w:right w:val="single" w:sz="4" w:space="0" w:color="BFBFBF"/>
             </w:tcBorders>
-            <w:shd w:val="clear" w:color="auto" w:fill="auto"/>
           </w:tcPr>
           <w:p>
             <w:pPr>
@@ -10175,7 +10009,6 @@
               <w:bottom w:val="single" w:sz="4" w:space="0" w:color="BFBFBF"/>
               <w:right w:val="single" w:sz="4" w:space="0" w:color="BFBFBF"/>
             </w:tcBorders>
-            <w:shd w:val="clear" w:color="auto" w:fill="auto"/>
           </w:tcPr>
           <w:p>
             <w:pPr>
@@ -10247,7 +10080,6 @@
               <w:bottom w:val="single" w:sz="4" w:space="0" w:color="BFBFBF"/>
               <w:right w:val="single" w:sz="4" w:space="0" w:color="BFBFBF"/>
             </w:tcBorders>
-            <w:shd w:val="clear" w:color="auto" w:fill="auto"/>
           </w:tcPr>
           <w:p>
             <w:pPr>
@@ -10276,7 +10108,6 @@
               <w:bottom w:val="single" w:sz="4" w:space="0" w:color="BFBFBF"/>
               <w:right w:val="single" w:sz="4" w:space="0" w:color="BFBFBF"/>
             </w:tcBorders>
-            <w:shd w:val="clear" w:color="auto" w:fill="auto"/>
           </w:tcPr>
           <w:p>
             <w:pPr>
@@ -10305,7 +10136,6 @@
               <w:bottom w:val="single" w:sz="4" w:space="0" w:color="BFBFBF"/>
               <w:right w:val="single" w:sz="4" w:space="0" w:color="BFBFBF"/>
             </w:tcBorders>
-            <w:shd w:val="clear" w:color="auto" w:fill="auto"/>
           </w:tcPr>
           <w:p>
             <w:pPr>
@@ -10334,7 +10164,6 @@
               <w:bottom w:val="single" w:sz="4" w:space="0" w:color="BFBFBF"/>
               <w:right w:val="single" w:sz="4" w:space="0" w:color="BFBFBF"/>
             </w:tcBorders>
-            <w:shd w:val="clear" w:color="auto" w:fill="auto"/>
           </w:tcPr>
           <w:p>
             <w:pPr>
@@ -10489,7 +10318,6 @@
               <w:bottom w:val="single" w:sz="4" w:space="0" w:color="BFBFBF"/>
               <w:right w:val="single" w:sz="4" w:space="0" w:color="BFBFBF"/>
             </w:tcBorders>
-            <w:shd w:val="clear" w:color="auto" w:fill="auto"/>
           </w:tcPr>
           <w:p>
             <w:pPr>
@@ -10518,7 +10346,6 @@
               <w:bottom w:val="single" w:sz="4" w:space="0" w:color="BFBFBF"/>
               <w:right w:val="single" w:sz="4" w:space="0" w:color="BFBFBF"/>
             </w:tcBorders>
-            <w:shd w:val="clear" w:color="auto" w:fill="auto"/>
           </w:tcPr>
           <w:p>
             <w:pPr>
@@ -10547,7 +10374,6 @@
               <w:bottom w:val="single" w:sz="4" w:space="0" w:color="BFBFBF"/>
               <w:right w:val="single" w:sz="4" w:space="0" w:color="BFBFBF"/>
             </w:tcBorders>
-            <w:shd w:val="clear" w:color="auto" w:fill="auto"/>
           </w:tcPr>
           <w:p>
             <w:pPr>
@@ -10576,7 +10402,6 @@
               <w:bottom w:val="single" w:sz="4" w:space="0" w:color="BFBFBF"/>
               <w:right w:val="single" w:sz="4" w:space="0" w:color="BFBFBF"/>
             </w:tcBorders>
-            <w:shd w:val="clear" w:color="auto" w:fill="auto"/>
           </w:tcPr>
           <w:p>
             <w:pPr>
@@ -10731,7 +10556,6 @@
               <w:bottom w:val="single" w:sz="4" w:space="0" w:color="BFBFBF"/>
               <w:right w:val="single" w:sz="4" w:space="0" w:color="BFBFBF"/>
             </w:tcBorders>
-            <w:shd w:val="clear" w:color="auto" w:fill="auto"/>
           </w:tcPr>
           <w:p>
             <w:pPr>
@@ -10760,7 +10584,6 @@
               <w:bottom w:val="single" w:sz="4" w:space="0" w:color="BFBFBF"/>
               <w:right w:val="single" w:sz="4" w:space="0" w:color="BFBFBF"/>
             </w:tcBorders>
-            <w:shd w:val="clear" w:color="auto" w:fill="auto"/>
           </w:tcPr>
           <w:p>
             <w:pPr>
@@ -10789,7 +10612,6 @@
               <w:bottom w:val="single" w:sz="4" w:space="0" w:color="BFBFBF"/>
               <w:right w:val="single" w:sz="4" w:space="0" w:color="BFBFBF"/>
             </w:tcBorders>
-            <w:shd w:val="clear" w:color="auto" w:fill="auto"/>
           </w:tcPr>
           <w:p>
             <w:pPr>
@@ -10818,7 +10640,6 @@
               <w:bottom w:val="single" w:sz="4" w:space="0" w:color="BFBFBF"/>
               <w:right w:val="single" w:sz="4" w:space="0" w:color="BFBFBF"/>
             </w:tcBorders>
-            <w:shd w:val="clear" w:color="auto" w:fill="auto"/>
           </w:tcPr>
           <w:p>
             <w:pPr>
@@ -10973,7 +10794,6 @@
               <w:bottom w:val="single" w:sz="4" w:space="0" w:color="BFBFBF"/>
               <w:right w:val="single" w:sz="4" w:space="0" w:color="BFBFBF"/>
             </w:tcBorders>
-            <w:shd w:val="clear" w:color="auto" w:fill="auto"/>
           </w:tcPr>
           <w:p>
             <w:pPr>
@@ -11002,7 +10822,6 @@
               <w:bottom w:val="single" w:sz="4" w:space="0" w:color="BFBFBF"/>
               <w:right w:val="single" w:sz="4" w:space="0" w:color="BFBFBF"/>
             </w:tcBorders>
-            <w:shd w:val="clear" w:color="auto" w:fill="auto"/>
           </w:tcPr>
           <w:p>
             <w:pPr>
@@ -11031,7 +10850,6 @@
               <w:bottom w:val="single" w:sz="4" w:space="0" w:color="BFBFBF"/>
               <w:right w:val="single" w:sz="4" w:space="0" w:color="BFBFBF"/>
             </w:tcBorders>
-            <w:shd w:val="clear" w:color="auto" w:fill="auto"/>
           </w:tcPr>
           <w:p>
             <w:pPr>
@@ -11060,7 +10878,6 @@
               <w:bottom w:val="single" w:sz="4" w:space="0" w:color="BFBFBF"/>
               <w:right w:val="single" w:sz="4" w:space="0" w:color="BFBFBF"/>
             </w:tcBorders>
-            <w:shd w:val="clear" w:color="auto" w:fill="auto"/>
           </w:tcPr>
           <w:p>
             <w:pPr>
@@ -11215,7 +11032,6 @@
               <w:bottom w:val="single" w:sz="4" w:space="0" w:color="BFBFBF"/>
               <w:right w:val="single" w:sz="4" w:space="0" w:color="BFBFBF"/>
             </w:tcBorders>
-            <w:shd w:val="clear" w:color="auto" w:fill="auto"/>
           </w:tcPr>
           <w:p>
             <w:pPr>
@@ -11244,7 +11060,6 @@
               <w:bottom w:val="single" w:sz="4" w:space="0" w:color="BFBFBF"/>
               <w:right w:val="single" w:sz="4" w:space="0" w:color="BFBFBF"/>
             </w:tcBorders>
-            <w:shd w:val="clear" w:color="auto" w:fill="auto"/>
           </w:tcPr>
           <w:p>
             <w:pPr>
@@ -11273,7 +11088,6 @@
               <w:bottom w:val="single" w:sz="4" w:space="0" w:color="BFBFBF"/>
               <w:right w:val="single" w:sz="4" w:space="0" w:color="BFBFBF"/>
             </w:tcBorders>
-            <w:shd w:val="clear" w:color="auto" w:fill="auto"/>
           </w:tcPr>
           <w:p>
             <w:pPr>
@@ -11302,7 +11116,6 @@
               <w:bottom w:val="single" w:sz="4" w:space="0" w:color="BFBFBF"/>
               <w:right w:val="single" w:sz="4" w:space="0" w:color="BFBFBF"/>
             </w:tcBorders>
-            <w:shd w:val="clear" w:color="auto" w:fill="auto"/>
           </w:tcPr>
           <w:p>
             <w:pPr>
@@ -11457,7 +11270,6 @@
               <w:bottom w:val="single" w:sz="4" w:space="0" w:color="BFBFBF"/>
               <w:right w:val="single" w:sz="4" w:space="0" w:color="BFBFBF"/>
             </w:tcBorders>
-            <w:shd w:val="clear" w:color="auto" w:fill="auto"/>
           </w:tcPr>
           <w:p>
             <w:pPr>
@@ -11486,7 +11298,6 @@
               <w:bottom w:val="single" w:sz="4" w:space="0" w:color="BFBFBF"/>
               <w:right w:val="single" w:sz="4" w:space="0" w:color="BFBFBF"/>
             </w:tcBorders>
-            <w:shd w:val="clear" w:color="auto" w:fill="auto"/>
           </w:tcPr>
           <w:p>
             <w:pPr>
@@ -11515,7 +11326,6 @@
               <w:bottom w:val="single" w:sz="4" w:space="0" w:color="BFBFBF"/>
               <w:right w:val="single" w:sz="4" w:space="0" w:color="BFBFBF"/>
             </w:tcBorders>
-            <w:shd w:val="clear" w:color="auto" w:fill="auto"/>
           </w:tcPr>
           <w:p>
             <w:pPr>
@@ -11544,7 +11354,6 @@
               <w:bottom w:val="single" w:sz="4" w:space="0" w:color="BFBFBF"/>
               <w:right w:val="single" w:sz="4" w:space="0" w:color="BFBFBF"/>
             </w:tcBorders>
-            <w:shd w:val="clear" w:color="auto" w:fill="auto"/>
           </w:tcPr>
           <w:p>
             <w:pPr>
@@ -11616,7 +11425,6 @@
               <w:bottom w:val="single" w:sz="4" w:space="0" w:color="BFBFBF"/>
               <w:right w:val="single" w:sz="4" w:space="0" w:color="BFBFBF"/>
             </w:tcBorders>
-            <w:shd w:val="clear" w:color="auto" w:fill="auto"/>
           </w:tcPr>
           <w:p>
             <w:pPr>
@@ -11645,7 +11453,6 @@
               <w:bottom w:val="single" w:sz="4" w:space="0" w:color="BFBFBF"/>
               <w:right w:val="single" w:sz="4" w:space="0" w:color="BFBFBF"/>
             </w:tcBorders>
-            <w:shd w:val="clear" w:color="auto" w:fill="auto"/>
           </w:tcPr>
           <w:p>
             <w:pPr>
@@ -11674,7 +11481,6 @@
               <w:bottom w:val="single" w:sz="4" w:space="0" w:color="BFBFBF"/>
               <w:right w:val="single" w:sz="4" w:space="0" w:color="BFBFBF"/>
             </w:tcBorders>
-            <w:shd w:val="clear" w:color="auto" w:fill="auto"/>
           </w:tcPr>
           <w:p>
             <w:pPr>
@@ -11703,7 +11509,6 @@
               <w:bottom w:val="single" w:sz="4" w:space="0" w:color="BFBFBF"/>
               <w:right w:val="single" w:sz="4" w:space="0" w:color="BFBFBF"/>
             </w:tcBorders>
-            <w:shd w:val="clear" w:color="auto" w:fill="auto"/>
           </w:tcPr>
           <w:p>
             <w:pPr>
@@ -11858,7 +11663,6 @@
               <w:bottom w:val="single" w:sz="4" w:space="0" w:color="BFBFBF"/>
               <w:right w:val="single" w:sz="4" w:space="0" w:color="BFBFBF"/>
             </w:tcBorders>
-            <w:shd w:val="clear" w:color="auto" w:fill="auto"/>
           </w:tcPr>
           <w:p>
             <w:pPr>
@@ -11887,7 +11691,6 @@
               <w:bottom w:val="single" w:sz="4" w:space="0" w:color="BFBFBF"/>
               <w:right w:val="single" w:sz="4" w:space="0" w:color="BFBFBF"/>
             </w:tcBorders>
-            <w:shd w:val="clear" w:color="auto" w:fill="auto"/>
           </w:tcPr>
           <w:p>
             <w:pPr>
@@ -11916,7 +11719,6 @@
               <w:bottom w:val="single" w:sz="4" w:space="0" w:color="BFBFBF"/>
               <w:right w:val="single" w:sz="4" w:space="0" w:color="BFBFBF"/>
             </w:tcBorders>
-            <w:shd w:val="clear" w:color="auto" w:fill="auto"/>
           </w:tcPr>
           <w:p>
             <w:pPr>
@@ -11945,7 +11747,6 @@
               <w:bottom w:val="single" w:sz="4" w:space="0" w:color="BFBFBF"/>
               <w:right w:val="single" w:sz="4" w:space="0" w:color="BFBFBF"/>
             </w:tcBorders>
-            <w:shd w:val="clear" w:color="auto" w:fill="auto"/>
           </w:tcPr>
           <w:p>
             <w:pPr>
@@ -12100,7 +11901,6 @@
               <w:bottom w:val="single" w:sz="4" w:space="0" w:color="BFBFBF"/>
               <w:right w:val="single" w:sz="4" w:space="0" w:color="BFBFBF"/>
             </w:tcBorders>
-            <w:shd w:val="clear" w:color="auto" w:fill="auto"/>
           </w:tcPr>
           <w:p>
             <w:pPr>
@@ -12129,7 +11929,6 @@
               <w:bottom w:val="single" w:sz="4" w:space="0" w:color="BFBFBF"/>
               <w:right w:val="single" w:sz="4" w:space="0" w:color="BFBFBF"/>
             </w:tcBorders>
-            <w:shd w:val="clear" w:color="auto" w:fill="auto"/>
           </w:tcPr>
           <w:p>
             <w:pPr>
@@ -12158,7 +11957,6 @@
               <w:bottom w:val="single" w:sz="4" w:space="0" w:color="BFBFBF"/>
               <w:right w:val="single" w:sz="4" w:space="0" w:color="BFBFBF"/>
             </w:tcBorders>
-            <w:shd w:val="clear" w:color="auto" w:fill="auto"/>
           </w:tcPr>
           <w:p>
             <w:pPr>
@@ -12187,7 +11985,6 @@
               <w:bottom w:val="single" w:sz="4" w:space="0" w:color="BFBFBF"/>
               <w:right w:val="single" w:sz="4" w:space="0" w:color="BFBFBF"/>
             </w:tcBorders>
-            <w:shd w:val="clear" w:color="auto" w:fill="auto"/>
           </w:tcPr>
           <w:p>
             <w:pPr>
@@ -12342,22 +12139,22 @@
               <w:bottom w:val="single" w:sz="4" w:space="0" w:color="BFBFBF"/>
               <w:right w:val="single" w:sz="4" w:space="0" w:color="BFBFBF"/>
             </w:tcBorders>
-            <w:shd w:val="clear" w:color="auto" w:fill="auto"/>
-          </w:tcPr>
-          <w:p>
-            <w:pPr>
-              <w:pStyle w:val="LO-normal"/>
-              <w:jc w:val="center"/>
-              <w:rPr>
-                <w:rFonts w:ascii="Liberation Sans Narrow" w:eastAsia="Liberation Sans Narrow" w:hAnsi="Liberation Sans Narrow" w:cs="Liberation Sans Narrow"/>
-                <w:color w:val="000000"/>
-              </w:rPr>
-            </w:pPr>
-            <w:r>
-              <w:rPr>
-                <w:rFonts w:ascii="Liberation Sans Narrow" w:eastAsia="Liberation Sans Narrow" w:hAnsi="Liberation Sans Narrow" w:cs="Liberation Sans Narrow"/>
-                <w:color w:val="000000"/>
-              </w:rPr>
+          </w:tcPr>
+          <w:p>
+            <w:pPr>
+              <w:pStyle w:val="LO-normal"/>
+              <w:jc w:val="center"/>
+              <w:rPr>
+                <w:rFonts w:ascii="Liberation Sans Narrow" w:eastAsia="Liberation Sans Narrow" w:hAnsi="Liberation Sans Narrow" w:cs="Liberation Sans Narrow"/>
+                <w:color w:val="000000"/>
+              </w:rPr>
+            </w:pPr>
+            <w:r>
+              <w:rPr>
+                <w:rFonts w:ascii="Liberation Sans Narrow" w:eastAsia="Liberation Sans Narrow" w:hAnsi="Liberation Sans Narrow" w:cs="Liberation Sans Narrow"/>
+                <w:color w:val="000000"/>
+              </w:rPr>
+              <w:lastRenderedPageBreak/>
               <w:t>870899</w:t>
             </w:r>
           </w:p>
@@ -12371,7 +12168,6 @@
               <w:bottom w:val="single" w:sz="4" w:space="0" w:color="BFBFBF"/>
               <w:right w:val="single" w:sz="4" w:space="0" w:color="BFBFBF"/>
             </w:tcBorders>
-            <w:shd w:val="clear" w:color="auto" w:fill="auto"/>
           </w:tcPr>
           <w:p>
             <w:pPr>
@@ -12400,7 +12196,6 @@
               <w:bottom w:val="single" w:sz="4" w:space="0" w:color="BFBFBF"/>
               <w:right w:val="single" w:sz="4" w:space="0" w:color="BFBFBF"/>
             </w:tcBorders>
-            <w:shd w:val="clear" w:color="auto" w:fill="auto"/>
           </w:tcPr>
           <w:p>
             <w:pPr>
@@ -12429,7 +12224,6 @@
               <w:bottom w:val="single" w:sz="4" w:space="0" w:color="BFBFBF"/>
               <w:right w:val="single" w:sz="4" w:space="0" w:color="BFBFBF"/>
             </w:tcBorders>
-            <w:shd w:val="clear" w:color="auto" w:fill="auto"/>
           </w:tcPr>
           <w:p>
             <w:pPr>
@@ -12584,7 +12378,6 @@
               <w:bottom w:val="single" w:sz="4" w:space="0" w:color="BFBFBF"/>
               <w:right w:val="single" w:sz="4" w:space="0" w:color="BFBFBF"/>
             </w:tcBorders>
-            <w:shd w:val="clear" w:color="auto" w:fill="auto"/>
           </w:tcPr>
           <w:p>
             <w:pPr>
@@ -12613,7 +12406,6 @@
               <w:bottom w:val="single" w:sz="4" w:space="0" w:color="BFBFBF"/>
               <w:right w:val="single" w:sz="4" w:space="0" w:color="BFBFBF"/>
             </w:tcBorders>
-            <w:shd w:val="clear" w:color="auto" w:fill="auto"/>
           </w:tcPr>
           <w:p>
             <w:pPr>
@@ -12642,7 +12434,6 @@
               <w:bottom w:val="single" w:sz="4" w:space="0" w:color="BFBFBF"/>
               <w:right w:val="single" w:sz="4" w:space="0" w:color="BFBFBF"/>
             </w:tcBorders>
-            <w:shd w:val="clear" w:color="auto" w:fill="auto"/>
           </w:tcPr>
           <w:p>
             <w:pPr>
@@ -12671,7 +12462,6 @@
               <w:bottom w:val="single" w:sz="4" w:space="0" w:color="BFBFBF"/>
               <w:right w:val="single" w:sz="4" w:space="0" w:color="BFBFBF"/>
             </w:tcBorders>
-            <w:shd w:val="clear" w:color="auto" w:fill="auto"/>
           </w:tcPr>
           <w:p>
             <w:pPr>
@@ -12826,7 +12616,6 @@
               <w:bottom w:val="single" w:sz="4" w:space="0" w:color="BFBFBF"/>
               <w:right w:val="single" w:sz="4" w:space="0" w:color="BFBFBF"/>
             </w:tcBorders>
-            <w:shd w:val="clear" w:color="auto" w:fill="auto"/>
           </w:tcPr>
           <w:p>
             <w:pPr>
@@ -12855,7 +12644,6 @@
               <w:bottom w:val="single" w:sz="4" w:space="0" w:color="BFBFBF"/>
               <w:right w:val="single" w:sz="4" w:space="0" w:color="BFBFBF"/>
             </w:tcBorders>
-            <w:shd w:val="clear" w:color="auto" w:fill="auto"/>
           </w:tcPr>
           <w:p>
             <w:pPr>
@@ -12884,7 +12672,6 @@
               <w:bottom w:val="single" w:sz="4" w:space="0" w:color="BFBFBF"/>
               <w:right w:val="single" w:sz="4" w:space="0" w:color="BFBFBF"/>
             </w:tcBorders>
-            <w:shd w:val="clear" w:color="auto" w:fill="auto"/>
           </w:tcPr>
           <w:p>
             <w:pPr>
@@ -12913,7 +12700,6 @@
               <w:bottom w:val="single" w:sz="4" w:space="0" w:color="BFBFBF"/>
               <w:right w:val="single" w:sz="4" w:space="0" w:color="BFBFBF"/>
             </w:tcBorders>
-            <w:shd w:val="clear" w:color="auto" w:fill="auto"/>
           </w:tcPr>
           <w:p>
             <w:pPr>
@@ -12961,7 +12747,7 @@
           <w:numId w:val="7"/>
         </w:numPr>
       </w:pPr>
-      <w:bookmarkStart w:id="16" w:name="_Toc202122279"/>
+      <w:bookmarkStart w:id="16" w:name="_Toc206607298"/>
       <w:r>
         <w:t>Nomenclatura HS06 en inglés</w:t>
       </w:r>
@@ -13047,7 +12833,6 @@
               <w:bottom w:val="single" w:sz="4" w:space="0" w:color="BFBFBF"/>
               <w:right w:val="single" w:sz="4" w:space="0" w:color="BFBFBF"/>
             </w:tcBorders>
-            <w:shd w:val="clear" w:color="auto" w:fill="auto"/>
           </w:tcPr>
           <w:p>
             <w:pPr>
@@ -13076,7 +12861,6 @@
               <w:bottom w:val="single" w:sz="4" w:space="0" w:color="BFBFBF"/>
               <w:right w:val="single" w:sz="4" w:space="0" w:color="BFBFBF"/>
             </w:tcBorders>
-            <w:shd w:val="clear" w:color="auto" w:fill="auto"/>
           </w:tcPr>
           <w:p>
             <w:pPr>
@@ -13107,7 +12891,6 @@
               <w:bottom w:val="single" w:sz="4" w:space="0" w:color="BFBFBF"/>
               <w:right w:val="single" w:sz="4" w:space="0" w:color="BFBFBF"/>
             </w:tcBorders>
-            <w:shd w:val="clear" w:color="auto" w:fill="auto"/>
           </w:tcPr>
           <w:p>
             <w:pPr>
@@ -13136,7 +12919,6 @@
               <w:bottom w:val="single" w:sz="4" w:space="0" w:color="BFBFBF"/>
               <w:right w:val="single" w:sz="4" w:space="0" w:color="BFBFBF"/>
             </w:tcBorders>
-            <w:shd w:val="clear" w:color="auto" w:fill="auto"/>
           </w:tcPr>
           <w:p>
             <w:pPr>
@@ -13311,7 +13093,6 @@
               <w:bottom w:val="single" w:sz="4" w:space="0" w:color="BFBFBF"/>
               <w:right w:val="single" w:sz="4" w:space="0" w:color="BFBFBF"/>
             </w:tcBorders>
-            <w:shd w:val="clear" w:color="auto" w:fill="auto"/>
           </w:tcPr>
           <w:p>
             <w:pPr>
@@ -13340,7 +13121,6 @@
               <w:bottom w:val="single" w:sz="4" w:space="0" w:color="BFBFBF"/>
               <w:right w:val="single" w:sz="4" w:space="0" w:color="BFBFBF"/>
             </w:tcBorders>
-            <w:shd w:val="clear" w:color="auto" w:fill="auto"/>
           </w:tcPr>
           <w:p>
             <w:pPr>
@@ -13376,16 +13156,7 @@
                 <w:color w:val="000000"/>
                 <w:lang w:val="en-GB"/>
               </w:rPr>
-              <w:t xml:space="preserve"> &amp;&amp; -- </w:t>
-            </w:r>
-            <w:r>
-              <w:rPr>
-                <w:rFonts w:ascii="Liberation Sans Narrow" w:eastAsia="Liberation Sans Narrow" w:hAnsi="Liberation Sans Narrow" w:cs="Liberation Sans Narrow"/>
-                <w:color w:val="000000"/>
-                <w:lang w:val="en-GB"/>
-              </w:rPr>
-              <w:lastRenderedPageBreak/>
-              <w:t>Pure-bred breeding animals</w:t>
+              <w:t xml:space="preserve"> &amp;&amp; -- Pure-bred breeding animals</w:t>
             </w:r>
           </w:p>
         </w:tc>
@@ -13398,23 +13169,21 @@
               <w:bottom w:val="single" w:sz="4" w:space="0" w:color="BFBFBF"/>
               <w:right w:val="single" w:sz="4" w:space="0" w:color="BFBFBF"/>
             </w:tcBorders>
-            <w:shd w:val="clear" w:color="auto" w:fill="auto"/>
-          </w:tcPr>
-          <w:p>
-            <w:pPr>
-              <w:pStyle w:val="LO-normal"/>
-              <w:jc w:val="center"/>
-              <w:rPr>
-                <w:rFonts w:ascii="Liberation Sans Narrow" w:eastAsia="Liberation Sans Narrow" w:hAnsi="Liberation Sans Narrow" w:cs="Liberation Sans Narrow"/>
-                <w:color w:val="000000"/>
-              </w:rPr>
-            </w:pPr>
-            <w:r>
-              <w:rPr>
-                <w:rFonts w:ascii="Liberation Sans Narrow" w:eastAsia="Liberation Sans Narrow" w:hAnsi="Liberation Sans Narrow" w:cs="Liberation Sans Narrow"/>
-                <w:color w:val="000000"/>
-              </w:rPr>
-              <w:lastRenderedPageBreak/>
+          </w:tcPr>
+          <w:p>
+            <w:pPr>
+              <w:pStyle w:val="LO-normal"/>
+              <w:jc w:val="center"/>
+              <w:rPr>
+                <w:rFonts w:ascii="Liberation Sans Narrow" w:eastAsia="Liberation Sans Narrow" w:hAnsi="Liberation Sans Narrow" w:cs="Liberation Sans Narrow"/>
+                <w:color w:val="000000"/>
+              </w:rPr>
+            </w:pPr>
+            <w:r>
+              <w:rPr>
+                <w:rFonts w:ascii="Liberation Sans Narrow" w:eastAsia="Liberation Sans Narrow" w:hAnsi="Liberation Sans Narrow" w:cs="Liberation Sans Narrow"/>
+                <w:color w:val="000000"/>
+              </w:rPr>
               <w:t>0101</w:t>
             </w:r>
           </w:p>
@@ -13428,7 +13197,6 @@
               <w:bottom w:val="single" w:sz="4" w:space="0" w:color="BFBFBF"/>
               <w:right w:val="single" w:sz="4" w:space="0" w:color="BFBFBF"/>
             </w:tcBorders>
-            <w:shd w:val="clear" w:color="auto" w:fill="auto"/>
           </w:tcPr>
           <w:p>
             <w:pPr>
@@ -13619,7 +13387,6 @@
               <w:bottom w:val="single" w:sz="4" w:space="0" w:color="BFBFBF"/>
               <w:right w:val="single" w:sz="4" w:space="0" w:color="BFBFBF"/>
             </w:tcBorders>
-            <w:shd w:val="clear" w:color="auto" w:fill="auto"/>
           </w:tcPr>
           <w:p>
             <w:pPr>
@@ -13648,7 +13415,6 @@
               <w:bottom w:val="single" w:sz="4" w:space="0" w:color="BFBFBF"/>
               <w:right w:val="single" w:sz="4" w:space="0" w:color="BFBFBF"/>
             </w:tcBorders>
-            <w:shd w:val="clear" w:color="auto" w:fill="auto"/>
           </w:tcPr>
           <w:p>
             <w:pPr>
@@ -13694,7 +13460,6 @@
               <w:bottom w:val="single" w:sz="4" w:space="0" w:color="BFBFBF"/>
               <w:right w:val="single" w:sz="4" w:space="0" w:color="BFBFBF"/>
             </w:tcBorders>
-            <w:shd w:val="clear" w:color="auto" w:fill="auto"/>
           </w:tcPr>
           <w:p>
             <w:pPr>
@@ -13723,7 +13488,6 @@
               <w:bottom w:val="single" w:sz="4" w:space="0" w:color="BFBFBF"/>
               <w:right w:val="single" w:sz="4" w:space="0" w:color="BFBFBF"/>
             </w:tcBorders>
-            <w:shd w:val="clear" w:color="auto" w:fill="auto"/>
           </w:tcPr>
           <w:p>
             <w:pPr>
@@ -13926,7 +13690,6 @@
               <w:bottom w:val="single" w:sz="4" w:space="0" w:color="BFBFBF"/>
               <w:right w:val="single" w:sz="4" w:space="0" w:color="BFBFBF"/>
             </w:tcBorders>
-            <w:shd w:val="clear" w:color="auto" w:fill="auto"/>
           </w:tcPr>
           <w:p>
             <w:pPr>
@@ -13955,7 +13718,6 @@
               <w:bottom w:val="single" w:sz="4" w:space="0" w:color="BFBFBF"/>
               <w:right w:val="single" w:sz="4" w:space="0" w:color="BFBFBF"/>
             </w:tcBorders>
-            <w:shd w:val="clear" w:color="auto" w:fill="auto"/>
           </w:tcPr>
           <w:p>
             <w:pPr>
@@ -13986,7 +13748,6 @@
               <w:bottom w:val="single" w:sz="4" w:space="0" w:color="BFBFBF"/>
               <w:right w:val="single" w:sz="4" w:space="0" w:color="BFBFBF"/>
             </w:tcBorders>
-            <w:shd w:val="clear" w:color="auto" w:fill="auto"/>
           </w:tcPr>
           <w:p>
             <w:pPr>
@@ -14015,7 +13776,6 @@
               <w:bottom w:val="single" w:sz="4" w:space="0" w:color="BFBFBF"/>
               <w:right w:val="single" w:sz="4" w:space="0" w:color="BFBFBF"/>
             </w:tcBorders>
-            <w:shd w:val="clear" w:color="auto" w:fill="auto"/>
           </w:tcPr>
           <w:p>
             <w:pPr>
@@ -14181,7 +13941,6 @@
               <w:bottom w:val="single" w:sz="4" w:space="0" w:color="BFBFBF"/>
               <w:right w:val="single" w:sz="4" w:space="0" w:color="BFBFBF"/>
             </w:tcBorders>
-            <w:shd w:val="clear" w:color="auto" w:fill="auto"/>
           </w:tcPr>
           <w:p>
             <w:pPr>
@@ -14210,7 +13969,6 @@
               <w:bottom w:val="single" w:sz="4" w:space="0" w:color="BFBFBF"/>
               <w:right w:val="single" w:sz="4" w:space="0" w:color="BFBFBF"/>
             </w:tcBorders>
-            <w:shd w:val="clear" w:color="auto" w:fill="auto"/>
           </w:tcPr>
           <w:p>
             <w:pPr>
@@ -14241,7 +13999,6 @@
               <w:bottom w:val="single" w:sz="4" w:space="0" w:color="BFBFBF"/>
               <w:right w:val="single" w:sz="4" w:space="0" w:color="BFBFBF"/>
             </w:tcBorders>
-            <w:shd w:val="clear" w:color="auto" w:fill="auto"/>
           </w:tcPr>
           <w:p>
             <w:pPr>
@@ -14270,7 +14027,6 @@
               <w:bottom w:val="single" w:sz="4" w:space="0" w:color="BFBFBF"/>
               <w:right w:val="single" w:sz="4" w:space="0" w:color="BFBFBF"/>
             </w:tcBorders>
-            <w:shd w:val="clear" w:color="auto" w:fill="auto"/>
           </w:tcPr>
           <w:p>
             <w:pPr>
@@ -14421,7 +14177,6 @@
               <w:bottom w:val="single" w:sz="4" w:space="0" w:color="BFBFBF"/>
               <w:right w:val="single" w:sz="4" w:space="0" w:color="BFBFBF"/>
             </w:tcBorders>
-            <w:shd w:val="clear" w:color="auto" w:fill="auto"/>
           </w:tcPr>
           <w:p>
             <w:pPr>
@@ -14450,7 +14205,6 @@
               <w:bottom w:val="single" w:sz="4" w:space="0" w:color="BFBFBF"/>
               <w:right w:val="single" w:sz="4" w:space="0" w:color="BFBFBF"/>
             </w:tcBorders>
-            <w:shd w:val="clear" w:color="auto" w:fill="auto"/>
           </w:tcPr>
           <w:p>
             <w:pPr>
@@ -14546,7 +14300,6 @@
               <w:bottom w:val="single" w:sz="4" w:space="0" w:color="BFBFBF"/>
               <w:right w:val="single" w:sz="4" w:space="0" w:color="BFBFBF"/>
             </w:tcBorders>
-            <w:shd w:val="clear" w:color="auto" w:fill="auto"/>
           </w:tcPr>
           <w:p>
             <w:pPr>
@@ -14575,7 +14328,6 @@
               <w:bottom w:val="single" w:sz="4" w:space="0" w:color="BFBFBF"/>
               <w:right w:val="single" w:sz="4" w:space="0" w:color="BFBFBF"/>
             </w:tcBorders>
-            <w:shd w:val="clear" w:color="auto" w:fill="auto"/>
           </w:tcPr>
           <w:p>
             <w:pPr>
@@ -14776,7 +14528,7 @@
           <w:numId w:val="7"/>
         </w:numPr>
       </w:pPr>
-      <w:bookmarkStart w:id="17" w:name="_Toc202122280"/>
+      <w:bookmarkStart w:id="17" w:name="_Toc206607299"/>
       <w:r>
         <w:t>EDA detallado</w:t>
       </w:r>
@@ -14817,6 +14569,7 @@
           <w:color w:val="000000"/>
           <w:lang w:val="en-GB"/>
         </w:rPr>
+        <w:lastRenderedPageBreak/>
         <w:t>['</w:t>
       </w:r>
       <w:proofErr w:type="spellStart"/>
@@ -15204,7 +14957,6 @@
           <w:color w:val="000000"/>
           <w:lang w:val="en-GB"/>
         </w:rPr>
-        <w:lastRenderedPageBreak/>
         <w:t xml:space="preserve"> '</w:t>
       </w:r>
       <w:proofErr w:type="spellStart"/>
@@ -15491,6 +15243,7 @@
           <w:rFonts w:ascii="Liberation Sans" w:eastAsia="Liberation Sans" w:hAnsi="Liberation Sans" w:cs="Liberation Sans"/>
           <w:color w:val="000000"/>
         </w:rPr>
+        <w:lastRenderedPageBreak/>
         <w:t>A su vez, surgen distribuciones más acampanadas para variables como el largo promedio (tanto para palabras como para caracteres), cuando se agrupa en los distintos códigos HS06, HS04 y HS02.</w:t>
       </w:r>
     </w:p>
@@ -15705,7 +15458,6 @@
         <w:rPr>
           <w:noProof/>
         </w:rPr>
-        <w:lastRenderedPageBreak/>
         <w:drawing>
           <wp:inline distT="0" distB="0" distL="0" distR="0" wp14:anchorId="05C63545" wp14:editId="1FF64660">
             <wp:extent cx="5490845" cy="3446145"/>
@@ -15753,7 +15505,7 @@
           <w:numId w:val="7"/>
         </w:numPr>
       </w:pPr>
-      <w:bookmarkStart w:id="22" w:name="_Toc202122281"/>
+      <w:bookmarkStart w:id="22" w:name="_Toc206607300"/>
       <w:proofErr w:type="spellStart"/>
       <w:r>
         <w:t>Embeddings</w:t>
@@ -15911,7 +15663,21 @@
           <w:rFonts w:ascii="Liberation Sans" w:eastAsia="Liberation Sans" w:hAnsi="Liberation Sans" w:cs="Liberation Sans"/>
           <w:color w:val="000000"/>
         </w:rPr>
-        <w:t xml:space="preserve"> de 764 dimensiones, uno para cada caso. A su vez, a modo de referencia, se procesan los textos de la nomenclatura de los códigos HS06.</w:t>
+        <w:t xml:space="preserve"> de 76</w:t>
+      </w:r>
+      <w:r>
+        <w:rPr>
+          <w:rFonts w:ascii="Liberation Sans" w:eastAsia="Liberation Sans" w:hAnsi="Liberation Sans" w:cs="Liberation Sans"/>
+          <w:color w:val="000000"/>
+        </w:rPr>
+        <w:t>8</w:t>
+      </w:r>
+      <w:r>
+        <w:rPr>
+          <w:rFonts w:ascii="Liberation Sans" w:eastAsia="Liberation Sans" w:hAnsi="Liberation Sans" w:cs="Liberation Sans"/>
+          <w:color w:val="000000"/>
+        </w:rPr>
+        <w:t xml:space="preserve"> dimensiones, uno para cada caso. A su vez, a modo de referencia, se procesan los textos de la nomenclatura de los códigos HS06.</w:t>
       </w:r>
     </w:p>
     <w:p>
@@ -15929,6 +15695,7 @@
           <w:rFonts w:ascii="Liberation Sans" w:eastAsia="Liberation Sans" w:hAnsi="Liberation Sans" w:cs="Liberation Sans"/>
           <w:color w:val="000000"/>
         </w:rPr>
+        <w:lastRenderedPageBreak/>
         <w:t xml:space="preserve">Para la visualización de estos </w:t>
       </w:r>
       <w:proofErr w:type="spellStart"/>
@@ -16066,7 +15833,6 @@
           <w:rFonts w:ascii="Liberation Sans" w:eastAsia="Liberation Sans" w:hAnsi="Liberation Sans" w:cs="Liberation Sans"/>
           <w:color w:val="000000"/>
         </w:rPr>
-        <w:lastRenderedPageBreak/>
         <w:t>HS06 full eng (nomenclatura):</w:t>
       </w:r>
     </w:p>
@@ -16195,8 +15961,9 @@
           <w:numId w:val="7"/>
         </w:numPr>
       </w:pPr>
-      <w:bookmarkStart w:id="23" w:name="_Toc202122282"/>
-      <w:r>
+      <w:bookmarkStart w:id="23" w:name="_Toc206607301"/>
+      <w:r>
+        <w:lastRenderedPageBreak/>
         <w:t>Medición de similitud del coseno</w:t>
       </w:r>
       <w:bookmarkEnd w:id="23"/>
@@ -16445,7 +16212,6 @@
         <w:rPr>
           <w:noProof/>
         </w:rPr>
-        <w:lastRenderedPageBreak/>
         <w:drawing>
           <wp:inline distT="0" distB="0" distL="0" distR="0" wp14:anchorId="3636A2BF" wp14:editId="690E3A6C">
             <wp:extent cx="5490845" cy="1782445"/>
@@ -16531,6 +16297,7 @@
         <w:rPr>
           <w:noProof/>
         </w:rPr>
+        <w:lastRenderedPageBreak/>
         <w:drawing>
           <wp:inline distT="0" distB="0" distL="0" distR="0" wp14:anchorId="61E4348C" wp14:editId="0AC0CD9B">
             <wp:extent cx="5490845" cy="1808480"/>
@@ -16634,7 +16401,6 @@
               <w:bottom w:val="single" w:sz="4" w:space="0" w:color="BFBFBF"/>
               <w:right w:val="single" w:sz="4" w:space="0" w:color="BFBFBF"/>
             </w:tcBorders>
-            <w:shd w:val="clear" w:color="auto" w:fill="auto"/>
           </w:tcPr>
           <w:p>
             <w:pPr>
@@ -16663,7 +16429,6 @@
               <w:bottom w:val="single" w:sz="4" w:space="0" w:color="BFBFBF"/>
               <w:right w:val="single" w:sz="4" w:space="0" w:color="BFBFBF"/>
             </w:tcBorders>
-            <w:shd w:val="clear" w:color="auto" w:fill="auto"/>
           </w:tcPr>
           <w:p>
             <w:pPr>
@@ -16692,7 +16457,6 @@
               <w:bottom w:val="single" w:sz="4" w:space="0" w:color="BFBFBF"/>
               <w:right w:val="single" w:sz="4" w:space="0" w:color="BFBFBF"/>
             </w:tcBorders>
-            <w:shd w:val="clear" w:color="auto" w:fill="auto"/>
           </w:tcPr>
           <w:p>
             <w:pPr>
@@ -16721,7 +16485,6 @@
               <w:bottom w:val="single" w:sz="4" w:space="0" w:color="BFBFBF"/>
               <w:right w:val="single" w:sz="4" w:space="0" w:color="BFBFBF"/>
             </w:tcBorders>
-            <w:shd w:val="clear" w:color="auto" w:fill="auto"/>
           </w:tcPr>
           <w:p>
             <w:pPr>
@@ -16874,7 +16637,6 @@
               <w:bottom w:val="single" w:sz="4" w:space="0" w:color="BFBFBF"/>
               <w:right w:val="single" w:sz="4" w:space="0" w:color="BFBFBF"/>
             </w:tcBorders>
-            <w:shd w:val="clear" w:color="auto" w:fill="auto"/>
           </w:tcPr>
           <w:p>
             <w:pPr>
@@ -16903,7 +16665,6 @@
               <w:bottom w:val="single" w:sz="4" w:space="0" w:color="BFBFBF"/>
               <w:right w:val="single" w:sz="4" w:space="0" w:color="BFBFBF"/>
             </w:tcBorders>
-            <w:shd w:val="clear" w:color="auto" w:fill="auto"/>
           </w:tcPr>
           <w:p>
             <w:pPr>
@@ -16932,7 +16693,6 @@
               <w:bottom w:val="single" w:sz="4" w:space="0" w:color="BFBFBF"/>
               <w:right w:val="single" w:sz="4" w:space="0" w:color="BFBFBF"/>
             </w:tcBorders>
-            <w:shd w:val="clear" w:color="auto" w:fill="auto"/>
           </w:tcPr>
           <w:p>
             <w:pPr>
@@ -16963,7 +16723,6 @@
               <w:bottom w:val="single" w:sz="4" w:space="0" w:color="BFBFBF"/>
               <w:right w:val="single" w:sz="4" w:space="0" w:color="BFBFBF"/>
             </w:tcBorders>
-            <w:shd w:val="clear" w:color="auto" w:fill="auto"/>
           </w:tcPr>
           <w:p>
             <w:pPr>
@@ -17114,7 +16873,6 @@
               <w:bottom w:val="single" w:sz="4" w:space="0" w:color="BFBFBF"/>
               <w:right w:val="single" w:sz="4" w:space="0" w:color="BFBFBF"/>
             </w:tcBorders>
-            <w:shd w:val="clear" w:color="auto" w:fill="auto"/>
           </w:tcPr>
           <w:p>
             <w:pPr>
@@ -17143,7 +16901,6 @@
               <w:bottom w:val="single" w:sz="4" w:space="0" w:color="BFBFBF"/>
               <w:right w:val="single" w:sz="4" w:space="0" w:color="BFBFBF"/>
             </w:tcBorders>
-            <w:shd w:val="clear" w:color="auto" w:fill="auto"/>
           </w:tcPr>
           <w:p>
             <w:pPr>
@@ -17172,7 +16929,6 @@
               <w:bottom w:val="single" w:sz="4" w:space="0" w:color="BFBFBF"/>
               <w:right w:val="single" w:sz="4" w:space="0" w:color="BFBFBF"/>
             </w:tcBorders>
-            <w:shd w:val="clear" w:color="auto" w:fill="auto"/>
           </w:tcPr>
           <w:p>
             <w:pPr>
@@ -17203,7 +16959,6 @@
               <w:bottom w:val="single" w:sz="4" w:space="0" w:color="BFBFBF"/>
               <w:right w:val="single" w:sz="4" w:space="0" w:color="BFBFBF"/>
             </w:tcBorders>
-            <w:shd w:val="clear" w:color="auto" w:fill="auto"/>
           </w:tcPr>
           <w:p>
             <w:pPr>
@@ -17386,7 +17141,6 @@
               <w:bottom w:val="single" w:sz="4" w:space="0" w:color="BFBFBF"/>
               <w:right w:val="single" w:sz="4" w:space="0" w:color="BFBFBF"/>
             </w:tcBorders>
-            <w:shd w:val="clear" w:color="auto" w:fill="auto"/>
           </w:tcPr>
           <w:p>
             <w:pPr>
@@ -17415,7 +17169,6 @@
               <w:bottom w:val="single" w:sz="4" w:space="0" w:color="BFBFBF"/>
               <w:right w:val="single" w:sz="4" w:space="0" w:color="BFBFBF"/>
             </w:tcBorders>
-            <w:shd w:val="clear" w:color="auto" w:fill="auto"/>
           </w:tcPr>
           <w:p>
             <w:pPr>
@@ -17444,7 +17197,6 @@
               <w:bottom w:val="single" w:sz="4" w:space="0" w:color="BFBFBF"/>
               <w:right w:val="single" w:sz="4" w:space="0" w:color="BFBFBF"/>
             </w:tcBorders>
-            <w:shd w:val="clear" w:color="auto" w:fill="auto"/>
           </w:tcPr>
           <w:p>
             <w:pPr>
@@ -17475,7 +17227,6 @@
               <w:bottom w:val="single" w:sz="4" w:space="0" w:color="BFBFBF"/>
               <w:right w:val="single" w:sz="4" w:space="0" w:color="BFBFBF"/>
             </w:tcBorders>
-            <w:shd w:val="clear" w:color="auto" w:fill="auto"/>
           </w:tcPr>
           <w:p>
             <w:pPr>
@@ -17628,7 +17379,6 @@
               <w:bottom w:val="single" w:sz="4" w:space="0" w:color="BFBFBF"/>
               <w:right w:val="single" w:sz="4" w:space="0" w:color="BFBFBF"/>
             </w:tcBorders>
-            <w:shd w:val="clear" w:color="auto" w:fill="auto"/>
           </w:tcPr>
           <w:p>
             <w:pPr>
@@ -17657,31 +17407,22 @@
               <w:bottom w:val="single" w:sz="4" w:space="0" w:color="BFBFBF"/>
               <w:right w:val="single" w:sz="4" w:space="0" w:color="BFBFBF"/>
             </w:tcBorders>
-            <w:shd w:val="clear" w:color="auto" w:fill="auto"/>
-          </w:tcPr>
-          <w:p>
-            <w:pPr>
-              <w:pStyle w:val="LO-normal"/>
-              <w:jc w:val="center"/>
-              <w:rPr>
-                <w:rFonts w:ascii="Liberation Sans Narrow" w:eastAsia="Liberation Sans Narrow" w:hAnsi="Liberation Sans Narrow" w:cs="Liberation Sans Narrow"/>
-                <w:color w:val="000000"/>
-              </w:rPr>
-            </w:pPr>
-            <w:r>
-              <w:rPr>
-                <w:rFonts w:ascii="Liberation Sans Narrow" w:eastAsia="Liberation Sans Narrow" w:hAnsi="Liberation Sans Narrow" w:cs="Liberation Sans Narrow"/>
-                <w:color w:val="000000"/>
-              </w:rPr>
-              <w:t xml:space="preserve">USED CHANGZHOU KWANGYANG </w:t>
-            </w:r>
-            <w:r>
-              <w:rPr>
-                <w:rFonts w:ascii="Liberation Sans Narrow" w:eastAsia="Liberation Sans Narrow" w:hAnsi="Liberation Sans Narrow" w:cs="Liberation Sans Narrow"/>
-                <w:color w:val="000000"/>
-              </w:rPr>
-              <w:lastRenderedPageBreak/>
-              <w:t>MOTORBYKE</w:t>
+          </w:tcPr>
+          <w:p>
+            <w:pPr>
+              <w:pStyle w:val="LO-normal"/>
+              <w:jc w:val="center"/>
+              <w:rPr>
+                <w:rFonts w:ascii="Liberation Sans Narrow" w:eastAsia="Liberation Sans Narrow" w:hAnsi="Liberation Sans Narrow" w:cs="Liberation Sans Narrow"/>
+                <w:color w:val="000000"/>
+              </w:rPr>
+            </w:pPr>
+            <w:r>
+              <w:rPr>
+                <w:rFonts w:ascii="Liberation Sans Narrow" w:eastAsia="Liberation Sans Narrow" w:hAnsi="Liberation Sans Narrow" w:cs="Liberation Sans Narrow"/>
+                <w:color w:val="000000"/>
+              </w:rPr>
+              <w:t>USED CHANGZHOU KWANGYANG MOTORBYKE</w:t>
             </w:r>
           </w:p>
         </w:tc>
@@ -17694,7 +17435,6 @@
               <w:bottom w:val="single" w:sz="4" w:space="0" w:color="BFBFBF"/>
               <w:right w:val="single" w:sz="4" w:space="0" w:color="BFBFBF"/>
             </w:tcBorders>
-            <w:shd w:val="clear" w:color="auto" w:fill="auto"/>
           </w:tcPr>
           <w:p>
             <w:pPr>
@@ -17712,17 +17452,7 @@
                 <w:color w:val="000000"/>
                 <w:lang w:val="en-GB"/>
               </w:rPr>
-              <w:lastRenderedPageBreak/>
-              <w:t xml:space="preserve">Motorcycles (including mopeds) and cycles fitted with an auxiliary motor – With reciprocating internal combustion piston </w:t>
-            </w:r>
-            <w:r>
-              <w:rPr>
-                <w:rFonts w:ascii="Liberation Sans Narrow" w:eastAsia="Liberation Sans Narrow" w:hAnsi="Liberation Sans Narrow" w:cs="Liberation Sans Narrow"/>
-                <w:color w:val="000000"/>
-                <w:lang w:val="en-GB"/>
-              </w:rPr>
-              <w:lastRenderedPageBreak/>
-              <w:t>engine of a cylinder capacity exceeding 50 cm³ but not exceeding 250 cm³</w:t>
+              <w:t>Motorcycles (including mopeds) and cycles fitted with an auxiliary motor – With reciprocating internal combustion piston engine of a cylinder capacity exceeding 50 cm³ but not exceeding 250 cm³</w:t>
             </w:r>
           </w:p>
         </w:tc>
@@ -17735,23 +17465,21 @@
               <w:bottom w:val="single" w:sz="4" w:space="0" w:color="BFBFBF"/>
               <w:right w:val="single" w:sz="4" w:space="0" w:color="BFBFBF"/>
             </w:tcBorders>
-            <w:shd w:val="clear" w:color="auto" w:fill="auto"/>
-          </w:tcPr>
-          <w:p>
-            <w:pPr>
-              <w:pStyle w:val="LO-normal"/>
-              <w:jc w:val="center"/>
-              <w:rPr>
-                <w:rFonts w:ascii="Liberation Sans Narrow" w:eastAsia="Liberation Sans Narrow" w:hAnsi="Liberation Sans Narrow" w:cs="Liberation Sans Narrow"/>
-                <w:color w:val="000000"/>
-              </w:rPr>
-            </w:pPr>
-            <w:r>
-              <w:rPr>
-                <w:rFonts w:ascii="Liberation Sans Narrow" w:eastAsia="Liberation Sans Narrow" w:hAnsi="Liberation Sans Narrow" w:cs="Liberation Sans Narrow"/>
-                <w:color w:val="000000"/>
-              </w:rPr>
-              <w:lastRenderedPageBreak/>
+          </w:tcPr>
+          <w:p>
+            <w:pPr>
+              <w:pStyle w:val="LO-normal"/>
+              <w:jc w:val="center"/>
+              <w:rPr>
+                <w:rFonts w:ascii="Liberation Sans Narrow" w:eastAsia="Liberation Sans Narrow" w:hAnsi="Liberation Sans Narrow" w:cs="Liberation Sans Narrow"/>
+                <w:color w:val="000000"/>
+              </w:rPr>
+            </w:pPr>
+            <w:r>
+              <w:rPr>
+                <w:rFonts w:ascii="Liberation Sans Narrow" w:eastAsia="Liberation Sans Narrow" w:hAnsi="Liberation Sans Narrow" w:cs="Liberation Sans Narrow"/>
+                <w:color w:val="000000"/>
+              </w:rPr>
               <w:t>0.826228</w:t>
             </w:r>
           </w:p>
@@ -17887,7 +17615,6 @@
               <w:bottom w:val="single" w:sz="4" w:space="0" w:color="BFBFBF"/>
               <w:right w:val="single" w:sz="4" w:space="0" w:color="BFBFBF"/>
             </w:tcBorders>
-            <w:shd w:val="clear" w:color="auto" w:fill="auto"/>
           </w:tcPr>
           <w:p>
             <w:pPr>
@@ -17916,7 +17643,6 @@
               <w:bottom w:val="single" w:sz="4" w:space="0" w:color="BFBFBF"/>
               <w:right w:val="single" w:sz="4" w:space="0" w:color="BFBFBF"/>
             </w:tcBorders>
-            <w:shd w:val="clear" w:color="auto" w:fill="auto"/>
           </w:tcPr>
           <w:p>
             <w:pPr>
@@ -17945,7 +17671,6 @@
               <w:bottom w:val="single" w:sz="4" w:space="0" w:color="BFBFBF"/>
               <w:right w:val="single" w:sz="4" w:space="0" w:color="BFBFBF"/>
             </w:tcBorders>
-            <w:shd w:val="clear" w:color="auto" w:fill="auto"/>
           </w:tcPr>
           <w:p>
             <w:pPr>
@@ -17976,7 +17701,6 @@
               <w:bottom w:val="single" w:sz="4" w:space="0" w:color="BFBFBF"/>
               <w:right w:val="single" w:sz="4" w:space="0" w:color="BFBFBF"/>
             </w:tcBorders>
-            <w:shd w:val="clear" w:color="auto" w:fill="auto"/>
           </w:tcPr>
           <w:p>
             <w:pPr>
@@ -18013,6 +17737,7 @@
           <w:rFonts w:ascii="Liberation Sans" w:eastAsia="Liberation Sans" w:hAnsi="Liberation Sans" w:cs="Liberation Sans"/>
           <w:color w:val="000000"/>
         </w:rPr>
+        <w:lastRenderedPageBreak/>
         <w:t>BOTTOM5 casos de similitud mínima:</w:t>
       </w:r>
     </w:p>
@@ -18044,7 +17769,6 @@
               <w:bottom w:val="single" w:sz="4" w:space="0" w:color="BFBFBF"/>
               <w:right w:val="single" w:sz="4" w:space="0" w:color="BFBFBF"/>
             </w:tcBorders>
-            <w:shd w:val="clear" w:color="auto" w:fill="auto"/>
           </w:tcPr>
           <w:p>
             <w:pPr>
@@ -18073,7 +17797,6 @@
               <w:bottom w:val="single" w:sz="4" w:space="0" w:color="BFBFBF"/>
               <w:right w:val="single" w:sz="4" w:space="0" w:color="BFBFBF"/>
             </w:tcBorders>
-            <w:shd w:val="clear" w:color="auto" w:fill="auto"/>
           </w:tcPr>
           <w:p>
             <w:pPr>
@@ -18102,7 +17825,6 @@
               <w:bottom w:val="single" w:sz="4" w:space="0" w:color="BFBFBF"/>
               <w:right w:val="single" w:sz="4" w:space="0" w:color="BFBFBF"/>
             </w:tcBorders>
-            <w:shd w:val="clear" w:color="auto" w:fill="auto"/>
           </w:tcPr>
           <w:p>
             <w:pPr>
@@ -18131,7 +17853,6 @@
               <w:bottom w:val="single" w:sz="4" w:space="0" w:color="BFBFBF"/>
               <w:right w:val="single" w:sz="4" w:space="0" w:color="BFBFBF"/>
             </w:tcBorders>
-            <w:shd w:val="clear" w:color="auto" w:fill="auto"/>
           </w:tcPr>
           <w:p>
             <w:pPr>
@@ -18302,7 +18023,6 @@
               <w:bottom w:val="single" w:sz="4" w:space="0" w:color="BFBFBF"/>
               <w:right w:val="single" w:sz="4" w:space="0" w:color="BFBFBF"/>
             </w:tcBorders>
-            <w:shd w:val="clear" w:color="auto" w:fill="auto"/>
           </w:tcPr>
           <w:p>
             <w:pPr>
@@ -18331,7 +18051,6 @@
               <w:bottom w:val="single" w:sz="4" w:space="0" w:color="BFBFBF"/>
               <w:right w:val="single" w:sz="4" w:space="0" w:color="BFBFBF"/>
             </w:tcBorders>
-            <w:shd w:val="clear" w:color="auto" w:fill="auto"/>
           </w:tcPr>
           <w:p>
             <w:pPr>
@@ -18360,7 +18079,6 @@
               <w:bottom w:val="single" w:sz="4" w:space="0" w:color="BFBFBF"/>
               <w:right w:val="single" w:sz="4" w:space="0" w:color="BFBFBF"/>
             </w:tcBorders>
-            <w:shd w:val="clear" w:color="auto" w:fill="auto"/>
           </w:tcPr>
           <w:p>
             <w:pPr>
@@ -18409,7 +18127,6 @@
               <w:bottom w:val="single" w:sz="4" w:space="0" w:color="BFBFBF"/>
               <w:right w:val="single" w:sz="4" w:space="0" w:color="BFBFBF"/>
             </w:tcBorders>
-            <w:shd w:val="clear" w:color="auto" w:fill="auto"/>
           </w:tcPr>
           <w:p>
             <w:pPr>
@@ -18578,7 +18295,6 @@
               <w:bottom w:val="single" w:sz="4" w:space="0" w:color="BFBFBF"/>
               <w:right w:val="single" w:sz="4" w:space="0" w:color="BFBFBF"/>
             </w:tcBorders>
-            <w:shd w:val="clear" w:color="auto" w:fill="auto"/>
           </w:tcPr>
           <w:p>
             <w:pPr>
@@ -18607,7 +18323,6 @@
               <w:bottom w:val="single" w:sz="4" w:space="0" w:color="BFBFBF"/>
               <w:right w:val="single" w:sz="4" w:space="0" w:color="BFBFBF"/>
             </w:tcBorders>
-            <w:shd w:val="clear" w:color="auto" w:fill="auto"/>
           </w:tcPr>
           <w:p>
             <w:pPr>
@@ -18636,7 +18351,6 @@
               <w:bottom w:val="single" w:sz="4" w:space="0" w:color="BFBFBF"/>
               <w:right w:val="single" w:sz="4" w:space="0" w:color="BFBFBF"/>
             </w:tcBorders>
-            <w:shd w:val="clear" w:color="auto" w:fill="auto"/>
           </w:tcPr>
           <w:p>
             <w:pPr>
@@ -18685,7 +18399,6 @@
               <w:bottom w:val="single" w:sz="4" w:space="0" w:color="BFBFBF"/>
               <w:right w:val="single" w:sz="4" w:space="0" w:color="BFBFBF"/>
             </w:tcBorders>
-            <w:shd w:val="clear" w:color="auto" w:fill="auto"/>
           </w:tcPr>
           <w:p>
             <w:pPr>
@@ -18893,7 +18606,6 @@
               <w:bottom w:val="single" w:sz="4" w:space="0" w:color="BFBFBF"/>
               <w:right w:val="single" w:sz="4" w:space="0" w:color="BFBFBF"/>
             </w:tcBorders>
-            <w:shd w:val="clear" w:color="auto" w:fill="auto"/>
           </w:tcPr>
           <w:p>
             <w:pPr>
@@ -18922,7 +18634,6 @@
               <w:bottom w:val="single" w:sz="4" w:space="0" w:color="BFBFBF"/>
               <w:right w:val="single" w:sz="4" w:space="0" w:color="BFBFBF"/>
             </w:tcBorders>
-            <w:shd w:val="clear" w:color="auto" w:fill="auto"/>
           </w:tcPr>
           <w:p>
             <w:pPr>
@@ -18951,7 +18662,6 @@
               <w:bottom w:val="single" w:sz="4" w:space="0" w:color="BFBFBF"/>
               <w:right w:val="single" w:sz="4" w:space="0" w:color="BFBFBF"/>
             </w:tcBorders>
-            <w:shd w:val="clear" w:color="auto" w:fill="auto"/>
           </w:tcPr>
           <w:p>
             <w:pPr>
@@ -18980,7 +18690,6 @@
               <w:bottom w:val="single" w:sz="4" w:space="0" w:color="BFBFBF"/>
               <w:right w:val="single" w:sz="4" w:space="0" w:color="BFBFBF"/>
             </w:tcBorders>
-            <w:shd w:val="clear" w:color="auto" w:fill="auto"/>
           </w:tcPr>
           <w:p>
             <w:pPr>
@@ -19183,7 +18892,6 @@
               <w:bottom w:val="single" w:sz="4" w:space="0" w:color="BFBFBF"/>
               <w:right w:val="single" w:sz="4" w:space="0" w:color="BFBFBF"/>
             </w:tcBorders>
-            <w:shd w:val="clear" w:color="auto" w:fill="auto"/>
           </w:tcPr>
           <w:p>
             <w:pPr>
@@ -19212,7 +18920,6 @@
               <w:bottom w:val="single" w:sz="4" w:space="0" w:color="BFBFBF"/>
               <w:right w:val="single" w:sz="4" w:space="0" w:color="BFBFBF"/>
             </w:tcBorders>
-            <w:shd w:val="clear" w:color="auto" w:fill="auto"/>
           </w:tcPr>
           <w:p>
             <w:pPr>
@@ -19275,7 +18982,6 @@
               <w:bottom w:val="single" w:sz="4" w:space="0" w:color="BFBFBF"/>
               <w:right w:val="single" w:sz="4" w:space="0" w:color="BFBFBF"/>
             </w:tcBorders>
-            <w:shd w:val="clear" w:color="auto" w:fill="auto"/>
           </w:tcPr>
           <w:p>
             <w:pPr>
@@ -19306,7 +19012,6 @@
               <w:bottom w:val="single" w:sz="4" w:space="0" w:color="BFBFBF"/>
               <w:right w:val="single" w:sz="4" w:space="0" w:color="BFBFBF"/>
             </w:tcBorders>
-            <w:shd w:val="clear" w:color="auto" w:fill="auto"/>
           </w:tcPr>
           <w:p>
             <w:pPr>
@@ -19396,16 +19101,7 @@
                 <w:color w:val="000000"/>
                 <w:lang w:val="en-GB"/>
               </w:rPr>
-              <w:t xml:space="preserve"> glass, </w:t>
-            </w:r>
-            <w:r>
-              <w:rPr>
-                <w:rFonts w:ascii="Liberation Sans Narrow" w:eastAsia="Liberation Sans Narrow" w:hAnsi="Liberation Sans Narrow" w:cs="Liberation Sans Narrow"/>
-                <w:color w:val="000000"/>
-                <w:lang w:val="en-GB"/>
-              </w:rPr>
-              <w:lastRenderedPageBreak/>
-              <w:t xml:space="preserve">consisting of toughened (tempered) </w:t>
+              <w:t xml:space="preserve"> glass, consisting of toughened (tempered) </w:t>
             </w:r>
             <w:proofErr w:type="spellStart"/>
             <w:proofErr w:type="gramStart"/>
@@ -19456,17 +19152,7 @@
                 <w:color w:val="000000"/>
                 <w:lang w:val="en-GB"/>
               </w:rPr>
-              <w:lastRenderedPageBreak/>
-              <w:t xml:space="preserve">Safety glass, consisting of </w:t>
-            </w:r>
-            <w:r>
-              <w:rPr>
-                <w:rFonts w:ascii="Liberation Sans Narrow" w:eastAsia="Liberation Sans Narrow" w:hAnsi="Liberation Sans Narrow" w:cs="Liberation Sans Narrow"/>
-                <w:color w:val="000000"/>
-                <w:lang w:val="en-GB"/>
-              </w:rPr>
-              <w:lastRenderedPageBreak/>
-              <w:t>toughened (tempered) or laminated glass – Laminated safety glass – Other</w:t>
+              <w:t>Safety glass, consisting of toughened (tempered) or laminated glass – Laminated safety glass – Other</w:t>
             </w:r>
           </w:p>
         </w:tc>
@@ -19495,7 +19181,6 @@
                 <w:rFonts w:ascii="Liberation Sans Narrow" w:eastAsia="Liberation Sans Narrow" w:hAnsi="Liberation Sans Narrow" w:cs="Liberation Sans Narrow"/>
                 <w:color w:val="000000"/>
               </w:rPr>
-              <w:lastRenderedPageBreak/>
               <w:t>0.984296</w:t>
             </w:r>
           </w:p>
@@ -19511,7 +19196,6 @@
               <w:bottom w:val="single" w:sz="4" w:space="0" w:color="BFBFBF"/>
               <w:right w:val="single" w:sz="4" w:space="0" w:color="BFBFBF"/>
             </w:tcBorders>
-            <w:shd w:val="clear" w:color="auto" w:fill="auto"/>
           </w:tcPr>
           <w:p>
             <w:pPr>
@@ -19540,7 +19224,6 @@
               <w:bottom w:val="single" w:sz="4" w:space="0" w:color="BFBFBF"/>
               <w:right w:val="single" w:sz="4" w:space="0" w:color="BFBFBF"/>
             </w:tcBorders>
-            <w:shd w:val="clear" w:color="auto" w:fill="auto"/>
           </w:tcPr>
           <w:p>
             <w:pPr>
@@ -19571,7 +19254,6 @@
               <w:bottom w:val="single" w:sz="4" w:space="0" w:color="BFBFBF"/>
               <w:right w:val="single" w:sz="4" w:space="0" w:color="BFBFBF"/>
             </w:tcBorders>
-            <w:shd w:val="clear" w:color="auto" w:fill="auto"/>
           </w:tcPr>
           <w:p>
             <w:pPr>
@@ -19602,7 +19284,6 @@
               <w:bottom w:val="single" w:sz="4" w:space="0" w:color="BFBFBF"/>
               <w:right w:val="single" w:sz="4" w:space="0" w:color="BFBFBF"/>
             </w:tcBorders>
-            <w:shd w:val="clear" w:color="auto" w:fill="auto"/>
           </w:tcPr>
           <w:p>
             <w:pPr>
@@ -19692,7 +19373,16 @@
                 <w:color w:val="000000"/>
                 <w:lang w:val="en-GB"/>
               </w:rPr>
-              <w:t xml:space="preserve"> bars, rods and </w:t>
+              <w:t xml:space="preserve"> bars, rods </w:t>
+            </w:r>
+            <w:r>
+              <w:rPr>
+                <w:rFonts w:ascii="Liberation Sans Narrow" w:eastAsia="Liberation Sans Narrow" w:hAnsi="Liberation Sans Narrow" w:cs="Liberation Sans Narrow"/>
+                <w:color w:val="000000"/>
+                <w:lang w:val="en-GB"/>
+              </w:rPr>
+              <w:lastRenderedPageBreak/>
+              <w:t xml:space="preserve">and </w:t>
             </w:r>
             <w:proofErr w:type="spellStart"/>
             <w:r>
@@ -19751,7 +19441,17 @@
                 <w:color w:val="000000"/>
                 <w:lang w:val="en-GB"/>
               </w:rPr>
-              <w:t>Copper bars, rods and profiles – Of copper alloys – Other</w:t>
+              <w:lastRenderedPageBreak/>
+              <w:t xml:space="preserve">Copper bars, rods and profiles – </w:t>
+            </w:r>
+            <w:r>
+              <w:rPr>
+                <w:rFonts w:ascii="Liberation Sans Narrow" w:eastAsia="Liberation Sans Narrow" w:hAnsi="Liberation Sans Narrow" w:cs="Liberation Sans Narrow"/>
+                <w:color w:val="000000"/>
+                <w:lang w:val="en-GB"/>
+              </w:rPr>
+              <w:lastRenderedPageBreak/>
+              <w:t>Of copper alloys – Other</w:t>
             </w:r>
           </w:p>
         </w:tc>
@@ -19780,6 +19480,7 @@
                 <w:rFonts w:ascii="Liberation Sans Narrow" w:eastAsia="Liberation Sans Narrow" w:hAnsi="Liberation Sans Narrow" w:cs="Liberation Sans Narrow"/>
                 <w:color w:val="000000"/>
               </w:rPr>
+              <w:lastRenderedPageBreak/>
               <w:t>0.984245</w:t>
             </w:r>
           </w:p>
@@ -19826,7 +19527,7 @@
       <w:pPr>
         <w:pStyle w:val="Ttulo3"/>
       </w:pPr>
-      <w:bookmarkStart w:id="28" w:name="_Toc202122283"/>
+      <w:bookmarkStart w:id="28" w:name="_Toc206607302"/>
       <w:r>
         <w:t xml:space="preserve">Entrenamiento del </w:t>
       </w:r>
@@ -19964,7 +19665,7 @@
       <w:pPr>
         <w:pStyle w:val="Ttulo4"/>
       </w:pPr>
-      <w:bookmarkStart w:id="29" w:name="_Toc202122284"/>
+      <w:bookmarkStart w:id="29" w:name="_Toc206607303"/>
       <w:r>
         <w:t xml:space="preserve">Arquitectura </w:t>
       </w:r>
@@ -20129,7 +19830,7 @@
       <w:pPr>
         <w:pStyle w:val="Ttulo4"/>
       </w:pPr>
-      <w:bookmarkStart w:id="30" w:name="_Toc202122285"/>
+      <w:bookmarkStart w:id="30" w:name="_Toc206607304"/>
       <w:proofErr w:type="spellStart"/>
       <w:r>
         <w:t>Encoder</w:t>
@@ -20728,7 +20429,6 @@
           <w:rFonts w:ascii="Liberation Sans" w:eastAsia="Liberation Sans" w:hAnsi="Liberation Sans" w:cs="Liberation Sans"/>
           <w:color w:val="000000"/>
         </w:rPr>
-        <w:lastRenderedPageBreak/>
         <w:t>ReLU</w:t>
       </w:r>
       <w:proofErr w:type="spellEnd"/>
@@ -20790,7 +20490,15 @@
           <w:rFonts w:ascii="Liberation Sans" w:eastAsia="Liberation Sans" w:hAnsi="Liberation Sans" w:cs="Liberation Sans"/>
           <w:color w:val="000000"/>
         </w:rPr>
-        <w:t>Linear (1024→1133): mapea al espacio de salida con una dimensión por cada clase posible.</w:t>
+        <w:t xml:space="preserve">Linear (1024→1133): mapea al espacio de salida con una dimensión por cada </w:t>
+      </w:r>
+      <w:r>
+        <w:rPr>
+          <w:rFonts w:ascii="Liberation Sans" w:eastAsia="Liberation Sans" w:hAnsi="Liberation Sans" w:cs="Liberation Sans"/>
+          <w:color w:val="000000"/>
+        </w:rPr>
+        <w:lastRenderedPageBreak/>
+        <w:t>clase posible.</w:t>
       </w:r>
     </w:p>
     <w:p>
@@ -20949,7 +20657,7 @@
           <w:numId w:val="7"/>
         </w:numPr>
       </w:pPr>
-      <w:bookmarkStart w:id="31" w:name="_Toc202122286"/>
+      <w:bookmarkStart w:id="31" w:name="_Toc206607305"/>
       <w:r>
         <w:t>Entrenamiento</w:t>
       </w:r>
@@ -21046,7 +20754,6 @@
               <w:bottom w:val="single" w:sz="4" w:space="0" w:color="BFBFBF"/>
               <w:right w:val="single" w:sz="4" w:space="0" w:color="BFBFBF"/>
             </w:tcBorders>
-            <w:shd w:val="clear" w:color="auto" w:fill="auto"/>
           </w:tcPr>
           <w:p>
             <w:pPr>
@@ -21075,7 +20782,6 @@
               <w:bottom w:val="single" w:sz="4" w:space="0" w:color="BFBFBF"/>
               <w:right w:val="single" w:sz="4" w:space="0" w:color="BFBFBF"/>
             </w:tcBorders>
-            <w:shd w:val="clear" w:color="auto" w:fill="auto"/>
           </w:tcPr>
           <w:p>
             <w:pPr>
@@ -21113,7 +20819,6 @@
               <w:bottom w:val="single" w:sz="4" w:space="0" w:color="BFBFBF"/>
               <w:right w:val="single" w:sz="4" w:space="0" w:color="BFBFBF"/>
             </w:tcBorders>
-            <w:shd w:val="clear" w:color="auto" w:fill="auto"/>
           </w:tcPr>
           <w:p>
             <w:pPr>
@@ -21142,7 +20847,6 @@
               <w:bottom w:val="single" w:sz="4" w:space="0" w:color="BFBFBF"/>
               <w:right w:val="single" w:sz="4" w:space="0" w:color="BFBFBF"/>
             </w:tcBorders>
-            <w:shd w:val="clear" w:color="auto" w:fill="auto"/>
           </w:tcPr>
           <w:p>
             <w:pPr>
@@ -21236,7 +20940,6 @@
               <w:bottom w:val="single" w:sz="4" w:space="0" w:color="BFBFBF"/>
               <w:right w:val="single" w:sz="4" w:space="0" w:color="BFBFBF"/>
             </w:tcBorders>
-            <w:shd w:val="clear" w:color="auto" w:fill="auto"/>
           </w:tcPr>
           <w:p>
             <w:pPr>
@@ -21291,7 +20994,6 @@
               <w:bottom w:val="single" w:sz="4" w:space="0" w:color="BFBFBF"/>
               <w:right w:val="single" w:sz="4" w:space="0" w:color="BFBFBF"/>
             </w:tcBorders>
-            <w:shd w:val="clear" w:color="auto" w:fill="auto"/>
           </w:tcPr>
           <w:p>
             <w:pPr>
@@ -21392,7 +21094,6 @@
               <w:bottom w:val="single" w:sz="4" w:space="0" w:color="BFBFBF"/>
               <w:right w:val="single" w:sz="4" w:space="0" w:color="BFBFBF"/>
             </w:tcBorders>
-            <w:shd w:val="clear" w:color="auto" w:fill="auto"/>
           </w:tcPr>
           <w:p>
             <w:pPr>
@@ -21447,7 +21148,6 @@
               <w:bottom w:val="single" w:sz="4" w:space="0" w:color="BFBFBF"/>
               <w:right w:val="single" w:sz="4" w:space="0" w:color="BFBFBF"/>
             </w:tcBorders>
-            <w:shd w:val="clear" w:color="auto" w:fill="auto"/>
           </w:tcPr>
           <w:p>
             <w:pPr>
@@ -21543,7 +21243,6 @@
               <w:bottom w:val="single" w:sz="4" w:space="0" w:color="BFBFBF"/>
               <w:right w:val="single" w:sz="4" w:space="0" w:color="BFBFBF"/>
             </w:tcBorders>
-            <w:shd w:val="clear" w:color="auto" w:fill="auto"/>
           </w:tcPr>
           <w:p>
             <w:pPr>
@@ -21575,7 +21274,6 @@
               <w:bottom w:val="single" w:sz="4" w:space="0" w:color="BFBFBF"/>
               <w:right w:val="single" w:sz="4" w:space="0" w:color="BFBFBF"/>
             </w:tcBorders>
-            <w:shd w:val="clear" w:color="auto" w:fill="auto"/>
           </w:tcPr>
           <w:p>
             <w:pPr>
@@ -21669,7 +21367,6 @@
               <w:bottom w:val="single" w:sz="4" w:space="0" w:color="BFBFBF"/>
               <w:right w:val="single" w:sz="4" w:space="0" w:color="BFBFBF"/>
             </w:tcBorders>
-            <w:shd w:val="clear" w:color="auto" w:fill="auto"/>
           </w:tcPr>
           <w:p>
             <w:pPr>
@@ -21700,7 +21397,6 @@
               <w:bottom w:val="single" w:sz="4" w:space="0" w:color="BFBFBF"/>
               <w:right w:val="single" w:sz="4" w:space="0" w:color="BFBFBF"/>
             </w:tcBorders>
-            <w:shd w:val="clear" w:color="auto" w:fill="auto"/>
           </w:tcPr>
           <w:p>
             <w:pPr>
@@ -21729,7 +21425,6 @@
               <w:bottom w:val="single" w:sz="4" w:space="0" w:color="BFBFBF"/>
               <w:right w:val="single" w:sz="4" w:space="0" w:color="BFBFBF"/>
             </w:tcBorders>
-            <w:shd w:val="clear" w:color="auto" w:fill="auto"/>
           </w:tcPr>
           <w:p>
             <w:pPr>
@@ -21758,7 +21453,6 @@
               <w:bottom w:val="single" w:sz="4" w:space="0" w:color="BFBFBF"/>
               <w:right w:val="single" w:sz="4" w:space="0" w:color="BFBFBF"/>
             </w:tcBorders>
-            <w:shd w:val="clear" w:color="auto" w:fill="auto"/>
           </w:tcPr>
           <w:p>
             <w:pPr>
@@ -22334,7 +22028,7 @@
           <w:numId w:val="7"/>
         </w:numPr>
       </w:pPr>
-      <w:bookmarkStart w:id="32" w:name="_Toc202122287"/>
+      <w:bookmarkStart w:id="32" w:name="_Toc206607306"/>
       <w:r>
         <w:t>Rendimiento</w:t>
       </w:r>
@@ -22418,7 +22112,6 @@
               <w:bottom w:val="single" w:sz="8" w:space="0" w:color="BFBFBF"/>
               <w:right w:val="single" w:sz="8" w:space="0" w:color="BFBFBF"/>
             </w:tcBorders>
-            <w:shd w:val="clear" w:color="auto" w:fill="auto"/>
           </w:tcPr>
           <w:p>
             <w:pPr>
@@ -22449,7 +22142,6 @@
               <w:bottom w:val="single" w:sz="8" w:space="0" w:color="BFBFBF"/>
               <w:right w:val="single" w:sz="8" w:space="0" w:color="BFBFBF"/>
             </w:tcBorders>
-            <w:shd w:val="clear" w:color="auto" w:fill="auto"/>
           </w:tcPr>
           <w:p>
             <w:pPr>
@@ -22494,7 +22186,6 @@
               <w:bottom w:val="single" w:sz="8" w:space="0" w:color="BFBFBF"/>
               <w:right w:val="single" w:sz="8" w:space="0" w:color="BFBFBF"/>
             </w:tcBorders>
-            <w:shd w:val="clear" w:color="auto" w:fill="auto"/>
           </w:tcPr>
           <w:p>
             <w:pPr>
@@ -22523,7 +22214,6 @@
               <w:bottom w:val="single" w:sz="8" w:space="0" w:color="BFBFBF"/>
               <w:right w:val="single" w:sz="8" w:space="0" w:color="BFBFBF"/>
             </w:tcBorders>
-            <w:shd w:val="clear" w:color="auto" w:fill="auto"/>
           </w:tcPr>
           <w:p>
             <w:pPr>
@@ -22668,7 +22358,6 @@
               <w:bottom w:val="single" w:sz="8" w:space="0" w:color="BFBFBF"/>
               <w:right w:val="single" w:sz="8" w:space="0" w:color="BFBFBF"/>
             </w:tcBorders>
-            <w:shd w:val="clear" w:color="auto" w:fill="auto"/>
           </w:tcPr>
           <w:p>
             <w:pPr>
@@ -22697,7 +22386,6 @@
               <w:bottom w:val="single" w:sz="8" w:space="0" w:color="BFBFBF"/>
               <w:right w:val="single" w:sz="8" w:space="0" w:color="BFBFBF"/>
             </w:tcBorders>
-            <w:shd w:val="clear" w:color="auto" w:fill="auto"/>
           </w:tcPr>
           <w:p>
             <w:pPr>
@@ -22726,7 +22414,6 @@
               <w:bottom w:val="single" w:sz="8" w:space="0" w:color="BFBFBF"/>
               <w:right w:val="single" w:sz="8" w:space="0" w:color="BFBFBF"/>
             </w:tcBorders>
-            <w:shd w:val="clear" w:color="auto" w:fill="auto"/>
           </w:tcPr>
           <w:p>
             <w:pPr>
@@ -22755,7 +22442,6 @@
               <w:bottom w:val="single" w:sz="8" w:space="0" w:color="BFBFBF"/>
               <w:right w:val="single" w:sz="8" w:space="0" w:color="BFBFBF"/>
             </w:tcBorders>
-            <w:shd w:val="clear" w:color="auto" w:fill="auto"/>
           </w:tcPr>
           <w:p>
             <w:pPr>
@@ -22908,7 +22594,6 @@
               <w:bottom w:val="single" w:sz="8" w:space="0" w:color="BFBFBF"/>
               <w:right w:val="single" w:sz="8" w:space="0" w:color="BFBFBF"/>
             </w:tcBorders>
-            <w:shd w:val="clear" w:color="auto" w:fill="auto"/>
           </w:tcPr>
           <w:p>
             <w:pPr>
@@ -22937,7 +22622,6 @@
               <w:bottom w:val="single" w:sz="8" w:space="0" w:color="BFBFBF"/>
               <w:right w:val="single" w:sz="8" w:space="0" w:color="BFBFBF"/>
             </w:tcBorders>
-            <w:shd w:val="clear" w:color="auto" w:fill="auto"/>
           </w:tcPr>
           <w:p>
             <w:pPr>
@@ -22966,7 +22650,6 @@
               <w:bottom w:val="single" w:sz="8" w:space="0" w:color="BFBFBF"/>
               <w:right w:val="single" w:sz="8" w:space="0" w:color="BFBFBF"/>
             </w:tcBorders>
-            <w:shd w:val="clear" w:color="auto" w:fill="auto"/>
           </w:tcPr>
           <w:p>
             <w:pPr>
@@ -22995,7 +22678,6 @@
               <w:bottom w:val="single" w:sz="8" w:space="0" w:color="BFBFBF"/>
               <w:right w:val="single" w:sz="8" w:space="0" w:color="BFBFBF"/>
             </w:tcBorders>
-            <w:shd w:val="clear" w:color="auto" w:fill="auto"/>
           </w:tcPr>
           <w:p>
             <w:pPr>
@@ -23242,14 +22924,14 @@
           <w:numId w:val="7"/>
         </w:numPr>
       </w:pPr>
-      <w:bookmarkStart w:id="33" w:name="_Toc202122288"/>
+      <w:bookmarkStart w:id="33" w:name="_Toc206607307"/>
       <w:r>
         <w:lastRenderedPageBreak/>
         <w:t xml:space="preserve">Visualización del </w:t>
       </w:r>
       <w:proofErr w:type="spellStart"/>
       <w:r>
-        <w:t>DistiltBERT</w:t>
+        <w:t>DistilBERT</w:t>
       </w:r>
       <w:proofErr w:type="spellEnd"/>
       <w:r>
@@ -23280,7 +22962,7 @@
           <w:rFonts w:ascii="Liberation Sans" w:eastAsia="Liberation Sans" w:hAnsi="Liberation Sans" w:cs="Liberation Sans"/>
           <w:color w:val="000000"/>
         </w:rPr>
-        <w:t>DistiltBERT</w:t>
+        <w:t>DistilBERT</w:t>
       </w:r>
       <w:proofErr w:type="spellEnd"/>
       <w:r>
@@ -23540,6 +23222,7 @@
           <w:rFonts w:ascii="Liberation Sans" w:eastAsia="Liberation Sans" w:hAnsi="Liberation Sans" w:cs="Liberation Sans"/>
           <w:color w:val="000000"/>
         </w:rPr>
+        <w:lastRenderedPageBreak/>
         <w:t xml:space="preserve">De nuevo, para el nomenclador HS06 en inglés, el </w:t>
       </w:r>
       <w:proofErr w:type="spellStart"/>
@@ -23580,7 +23263,6 @@
         <w:rPr>
           <w:rFonts w:ascii="Liberation Sans" w:eastAsia="Liberation Sans" w:hAnsi="Liberation Sans" w:cs="Liberation Sans"/>
         </w:rPr>
-        <w:lastRenderedPageBreak/>
         <w:t>identificaba</w:t>
       </w:r>
       <w:r>
@@ -23599,7 +23281,7 @@
           <w:numId w:val="7"/>
         </w:numPr>
       </w:pPr>
-      <w:bookmarkStart w:id="34" w:name="_Toc202122289"/>
+      <w:bookmarkStart w:id="34" w:name="_Toc206607308"/>
       <w:r>
         <w:t>Análisis del error</w:t>
       </w:r>
@@ -23750,7 +23432,6 @@
               <w:bottom w:val="single" w:sz="8" w:space="0" w:color="BFBFBF"/>
               <w:right w:val="single" w:sz="8" w:space="0" w:color="BFBFBF"/>
             </w:tcBorders>
-            <w:shd w:val="clear" w:color="auto" w:fill="auto"/>
             <w:vAlign w:val="bottom"/>
           </w:tcPr>
           <w:p>
@@ -23782,7 +23463,6 @@
               <w:bottom w:val="single" w:sz="8" w:space="0" w:color="BFBFBF"/>
               <w:right w:val="single" w:sz="8" w:space="0" w:color="BFBFBF"/>
             </w:tcBorders>
-            <w:shd w:val="clear" w:color="auto" w:fill="auto"/>
             <w:vAlign w:val="bottom"/>
           </w:tcPr>
           <w:p>
@@ -23812,7 +23492,6 @@
               <w:bottom w:val="single" w:sz="8" w:space="0" w:color="BFBFBF"/>
               <w:right w:val="single" w:sz="8" w:space="0" w:color="BFBFBF"/>
             </w:tcBorders>
-            <w:shd w:val="clear" w:color="auto" w:fill="auto"/>
             <w:vAlign w:val="bottom"/>
           </w:tcPr>
           <w:p>
@@ -23842,7 +23521,6 @@
               <w:bottom w:val="single" w:sz="8" w:space="0" w:color="BFBFBF"/>
               <w:right w:val="single" w:sz="8" w:space="0" w:color="BFBFBF"/>
             </w:tcBorders>
-            <w:shd w:val="clear" w:color="auto" w:fill="auto"/>
             <w:vAlign w:val="bottom"/>
           </w:tcPr>
           <w:p>
@@ -23872,7 +23550,6 @@
               <w:bottom w:val="single" w:sz="8" w:space="0" w:color="BFBFBF"/>
               <w:right w:val="single" w:sz="8" w:space="0" w:color="BFBFBF"/>
             </w:tcBorders>
-            <w:shd w:val="clear" w:color="auto" w:fill="auto"/>
             <w:vAlign w:val="bottom"/>
           </w:tcPr>
           <w:p>
@@ -23902,7 +23579,6 @@
               <w:bottom w:val="single" w:sz="8" w:space="0" w:color="BFBFBF"/>
               <w:right w:val="single" w:sz="8" w:space="0" w:color="BFBFBF"/>
             </w:tcBorders>
-            <w:shd w:val="clear" w:color="auto" w:fill="auto"/>
             <w:vAlign w:val="bottom"/>
           </w:tcPr>
           <w:p>
@@ -23932,7 +23608,6 @@
               <w:bottom w:val="single" w:sz="8" w:space="0" w:color="BFBFBF"/>
               <w:right w:val="single" w:sz="8" w:space="0" w:color="BFBFBF"/>
             </w:tcBorders>
-            <w:shd w:val="clear" w:color="auto" w:fill="auto"/>
             <w:vAlign w:val="bottom"/>
           </w:tcPr>
           <w:p>
@@ -23962,7 +23637,6 @@
               <w:bottom w:val="single" w:sz="8" w:space="0" w:color="BFBFBF"/>
               <w:right w:val="single" w:sz="8" w:space="0" w:color="BFBFBF"/>
             </w:tcBorders>
-            <w:shd w:val="clear" w:color="auto" w:fill="auto"/>
             <w:vAlign w:val="bottom"/>
           </w:tcPr>
           <w:p>
@@ -24280,7 +23954,6 @@
               <w:bottom w:val="single" w:sz="8" w:space="0" w:color="BFBFBF"/>
               <w:right w:val="single" w:sz="8" w:space="0" w:color="BFBFBF"/>
             </w:tcBorders>
-            <w:shd w:val="clear" w:color="auto" w:fill="auto"/>
             <w:vAlign w:val="bottom"/>
           </w:tcPr>
           <w:p>
@@ -24330,7 +24003,6 @@
               <w:bottom w:val="single" w:sz="8" w:space="0" w:color="BFBFBF"/>
               <w:right w:val="single" w:sz="8" w:space="0" w:color="BFBFBF"/>
             </w:tcBorders>
-            <w:shd w:val="clear" w:color="auto" w:fill="auto"/>
             <w:vAlign w:val="bottom"/>
           </w:tcPr>
           <w:p>
@@ -24360,7 +24032,6 @@
               <w:bottom w:val="single" w:sz="8" w:space="0" w:color="BFBFBF"/>
               <w:right w:val="single" w:sz="8" w:space="0" w:color="BFBFBF"/>
             </w:tcBorders>
-            <w:shd w:val="clear" w:color="auto" w:fill="auto"/>
             <w:vAlign w:val="bottom"/>
           </w:tcPr>
           <w:p>
@@ -24390,7 +24061,6 @@
               <w:bottom w:val="single" w:sz="8" w:space="0" w:color="BFBFBF"/>
               <w:right w:val="single" w:sz="8" w:space="0" w:color="BFBFBF"/>
             </w:tcBorders>
-            <w:shd w:val="clear" w:color="auto" w:fill="auto"/>
             <w:vAlign w:val="bottom"/>
           </w:tcPr>
           <w:p>
@@ -24420,7 +24090,6 @@
               <w:bottom w:val="single" w:sz="8" w:space="0" w:color="BFBFBF"/>
               <w:right w:val="single" w:sz="8" w:space="0" w:color="BFBFBF"/>
             </w:tcBorders>
-            <w:shd w:val="clear" w:color="auto" w:fill="auto"/>
             <w:vAlign w:val="bottom"/>
           </w:tcPr>
           <w:p>
@@ -24450,7 +24119,6 @@
               <w:bottom w:val="single" w:sz="8" w:space="0" w:color="BFBFBF"/>
               <w:right w:val="single" w:sz="8" w:space="0" w:color="BFBFBF"/>
             </w:tcBorders>
-            <w:shd w:val="clear" w:color="auto" w:fill="auto"/>
             <w:vAlign w:val="bottom"/>
           </w:tcPr>
           <w:p>
@@ -24480,7 +24148,6 @@
               <w:bottom w:val="single" w:sz="8" w:space="0" w:color="BFBFBF"/>
               <w:right w:val="single" w:sz="8" w:space="0" w:color="BFBFBF"/>
             </w:tcBorders>
-            <w:shd w:val="clear" w:color="auto" w:fill="auto"/>
             <w:vAlign w:val="bottom"/>
           </w:tcPr>
           <w:p>
@@ -24510,7 +24177,6 @@
               <w:bottom w:val="single" w:sz="8" w:space="0" w:color="BFBFBF"/>
               <w:right w:val="single" w:sz="8" w:space="0" w:color="BFBFBF"/>
             </w:tcBorders>
-            <w:shd w:val="clear" w:color="auto" w:fill="auto"/>
             <w:vAlign w:val="bottom"/>
           </w:tcPr>
           <w:p>
@@ -24792,7 +24458,6 @@
               <w:bottom w:val="single" w:sz="8" w:space="0" w:color="BFBFBF"/>
               <w:right w:val="single" w:sz="8" w:space="0" w:color="BFBFBF"/>
             </w:tcBorders>
-            <w:shd w:val="clear" w:color="auto" w:fill="auto"/>
             <w:vAlign w:val="bottom"/>
           </w:tcPr>
           <w:p>
@@ -24842,7 +24507,6 @@
               <w:bottom w:val="single" w:sz="8" w:space="0" w:color="BFBFBF"/>
               <w:right w:val="single" w:sz="8" w:space="0" w:color="BFBFBF"/>
             </w:tcBorders>
-            <w:shd w:val="clear" w:color="auto" w:fill="auto"/>
             <w:vAlign w:val="bottom"/>
           </w:tcPr>
           <w:p>
@@ -24872,7 +24536,6 @@
               <w:bottom w:val="single" w:sz="8" w:space="0" w:color="BFBFBF"/>
               <w:right w:val="single" w:sz="8" w:space="0" w:color="BFBFBF"/>
             </w:tcBorders>
-            <w:shd w:val="clear" w:color="auto" w:fill="auto"/>
             <w:vAlign w:val="bottom"/>
           </w:tcPr>
           <w:p>
@@ -24902,7 +24565,6 @@
               <w:bottom w:val="single" w:sz="8" w:space="0" w:color="BFBFBF"/>
               <w:right w:val="single" w:sz="8" w:space="0" w:color="BFBFBF"/>
             </w:tcBorders>
-            <w:shd w:val="clear" w:color="auto" w:fill="auto"/>
             <w:vAlign w:val="bottom"/>
           </w:tcPr>
           <w:p>
@@ -24932,7 +24594,6 @@
               <w:bottom w:val="single" w:sz="8" w:space="0" w:color="BFBFBF"/>
               <w:right w:val="single" w:sz="8" w:space="0" w:color="BFBFBF"/>
             </w:tcBorders>
-            <w:shd w:val="clear" w:color="auto" w:fill="auto"/>
             <w:vAlign w:val="bottom"/>
           </w:tcPr>
           <w:p>
@@ -24962,7 +24623,6 @@
               <w:bottom w:val="single" w:sz="8" w:space="0" w:color="BFBFBF"/>
               <w:right w:val="single" w:sz="8" w:space="0" w:color="BFBFBF"/>
             </w:tcBorders>
-            <w:shd w:val="clear" w:color="auto" w:fill="auto"/>
             <w:vAlign w:val="bottom"/>
           </w:tcPr>
           <w:p>
@@ -24992,7 +24652,6 @@
               <w:bottom w:val="single" w:sz="8" w:space="0" w:color="BFBFBF"/>
               <w:right w:val="single" w:sz="8" w:space="0" w:color="BFBFBF"/>
             </w:tcBorders>
-            <w:shd w:val="clear" w:color="auto" w:fill="auto"/>
             <w:vAlign w:val="bottom"/>
           </w:tcPr>
           <w:p>
@@ -25022,7 +24681,6 @@
               <w:bottom w:val="single" w:sz="8" w:space="0" w:color="BFBFBF"/>
               <w:right w:val="single" w:sz="8" w:space="0" w:color="BFBFBF"/>
             </w:tcBorders>
-            <w:shd w:val="clear" w:color="auto" w:fill="auto"/>
             <w:vAlign w:val="bottom"/>
           </w:tcPr>
           <w:p>
@@ -25403,7 +25061,6 @@
               <w:bottom w:val="single" w:sz="4" w:space="0" w:color="BFBFBF"/>
               <w:right w:val="single" w:sz="4" w:space="0" w:color="BFBFBF"/>
             </w:tcBorders>
-            <w:shd w:val="clear" w:color="auto" w:fill="auto"/>
             <w:vAlign w:val="bottom"/>
           </w:tcPr>
           <w:p>
@@ -25435,7 +25092,6 @@
               <w:bottom w:val="single" w:sz="4" w:space="0" w:color="BFBFBF"/>
               <w:right w:val="single" w:sz="4" w:space="0" w:color="BFBFBF"/>
             </w:tcBorders>
-            <w:shd w:val="clear" w:color="auto" w:fill="auto"/>
             <w:vAlign w:val="bottom"/>
           </w:tcPr>
           <w:p>
@@ -25465,7 +25121,6 @@
               <w:bottom w:val="single" w:sz="4" w:space="0" w:color="BFBFBF"/>
               <w:right w:val="single" w:sz="4" w:space="0" w:color="BFBFBF"/>
             </w:tcBorders>
-            <w:shd w:val="clear" w:color="auto" w:fill="auto"/>
             <w:vAlign w:val="bottom"/>
           </w:tcPr>
           <w:p>
@@ -25495,7 +25150,6 @@
               <w:bottom w:val="single" w:sz="4" w:space="0" w:color="BFBFBF"/>
               <w:right w:val="single" w:sz="4" w:space="0" w:color="BFBFBF"/>
             </w:tcBorders>
-            <w:shd w:val="clear" w:color="auto" w:fill="auto"/>
             <w:vAlign w:val="bottom"/>
           </w:tcPr>
           <w:p>
@@ -25525,7 +25179,6 @@
               <w:bottom w:val="single" w:sz="4" w:space="0" w:color="BFBFBF"/>
               <w:right w:val="single" w:sz="4" w:space="0" w:color="BFBFBF"/>
             </w:tcBorders>
-            <w:shd w:val="clear" w:color="auto" w:fill="auto"/>
             <w:vAlign w:val="bottom"/>
           </w:tcPr>
           <w:p>
@@ -25555,7 +25208,6 @@
               <w:bottom w:val="single" w:sz="4" w:space="0" w:color="BFBFBF"/>
               <w:right w:val="single" w:sz="4" w:space="0" w:color="BFBFBF"/>
             </w:tcBorders>
-            <w:shd w:val="clear" w:color="auto" w:fill="auto"/>
             <w:vAlign w:val="bottom"/>
           </w:tcPr>
           <w:p>
@@ -25585,7 +25237,6 @@
               <w:bottom w:val="single" w:sz="4" w:space="0" w:color="BFBFBF"/>
               <w:right w:val="single" w:sz="4" w:space="0" w:color="BFBFBF"/>
             </w:tcBorders>
-            <w:shd w:val="clear" w:color="auto" w:fill="auto"/>
             <w:vAlign w:val="bottom"/>
           </w:tcPr>
           <w:p>
@@ -25615,7 +25266,6 @@
               <w:bottom w:val="single" w:sz="4" w:space="0" w:color="BFBFBF"/>
               <w:right w:val="single" w:sz="4" w:space="0" w:color="BFBFBF"/>
             </w:tcBorders>
-            <w:shd w:val="clear" w:color="auto" w:fill="auto"/>
             <w:vAlign w:val="bottom"/>
           </w:tcPr>
           <w:p>
@@ -25895,7 +25545,6 @@
               <w:bottom w:val="single" w:sz="4" w:space="0" w:color="BFBFBF"/>
               <w:right w:val="single" w:sz="4" w:space="0" w:color="BFBFBF"/>
             </w:tcBorders>
-            <w:shd w:val="clear" w:color="auto" w:fill="auto"/>
             <w:vAlign w:val="bottom"/>
           </w:tcPr>
           <w:p>
@@ -25925,7 +25574,6 @@
               <w:bottom w:val="single" w:sz="4" w:space="0" w:color="BFBFBF"/>
               <w:right w:val="single" w:sz="4" w:space="0" w:color="BFBFBF"/>
             </w:tcBorders>
-            <w:shd w:val="clear" w:color="auto" w:fill="auto"/>
             <w:vAlign w:val="bottom"/>
           </w:tcPr>
           <w:p>
@@ -25955,7 +25603,6 @@
               <w:bottom w:val="single" w:sz="4" w:space="0" w:color="BFBFBF"/>
               <w:right w:val="single" w:sz="4" w:space="0" w:color="BFBFBF"/>
             </w:tcBorders>
-            <w:shd w:val="clear" w:color="auto" w:fill="auto"/>
             <w:vAlign w:val="bottom"/>
           </w:tcPr>
           <w:p>
@@ -25985,7 +25632,6 @@
               <w:bottom w:val="single" w:sz="4" w:space="0" w:color="BFBFBF"/>
               <w:right w:val="single" w:sz="4" w:space="0" w:color="BFBFBF"/>
             </w:tcBorders>
-            <w:shd w:val="clear" w:color="auto" w:fill="auto"/>
             <w:vAlign w:val="bottom"/>
           </w:tcPr>
           <w:p>
@@ -26015,7 +25661,6 @@
               <w:bottom w:val="single" w:sz="4" w:space="0" w:color="BFBFBF"/>
               <w:right w:val="single" w:sz="4" w:space="0" w:color="BFBFBF"/>
             </w:tcBorders>
-            <w:shd w:val="clear" w:color="auto" w:fill="auto"/>
             <w:vAlign w:val="bottom"/>
           </w:tcPr>
           <w:p>
@@ -26045,7 +25690,6 @@
               <w:bottom w:val="single" w:sz="4" w:space="0" w:color="BFBFBF"/>
               <w:right w:val="single" w:sz="4" w:space="0" w:color="BFBFBF"/>
             </w:tcBorders>
-            <w:shd w:val="clear" w:color="auto" w:fill="auto"/>
             <w:vAlign w:val="bottom"/>
           </w:tcPr>
           <w:p>
@@ -26075,7 +25719,6 @@
               <w:bottom w:val="single" w:sz="4" w:space="0" w:color="BFBFBF"/>
               <w:right w:val="single" w:sz="4" w:space="0" w:color="BFBFBF"/>
             </w:tcBorders>
-            <w:shd w:val="clear" w:color="auto" w:fill="auto"/>
             <w:vAlign w:val="bottom"/>
           </w:tcPr>
           <w:p>
@@ -26105,7 +25748,6 @@
               <w:bottom w:val="single" w:sz="4" w:space="0" w:color="BFBFBF"/>
               <w:right w:val="single" w:sz="4" w:space="0" w:color="BFBFBF"/>
             </w:tcBorders>
-            <w:shd w:val="clear" w:color="auto" w:fill="auto"/>
             <w:vAlign w:val="bottom"/>
           </w:tcPr>
           <w:p>
@@ -26385,7 +26027,6 @@
               <w:bottom w:val="single" w:sz="4" w:space="0" w:color="BFBFBF"/>
               <w:right w:val="single" w:sz="4" w:space="0" w:color="BFBFBF"/>
             </w:tcBorders>
-            <w:shd w:val="clear" w:color="auto" w:fill="auto"/>
             <w:vAlign w:val="bottom"/>
           </w:tcPr>
           <w:p>
@@ -26415,7 +26056,6 @@
               <w:bottom w:val="single" w:sz="4" w:space="0" w:color="BFBFBF"/>
               <w:right w:val="single" w:sz="4" w:space="0" w:color="BFBFBF"/>
             </w:tcBorders>
-            <w:shd w:val="clear" w:color="auto" w:fill="auto"/>
             <w:vAlign w:val="bottom"/>
           </w:tcPr>
           <w:p>
@@ -26445,7 +26085,6 @@
               <w:bottom w:val="single" w:sz="4" w:space="0" w:color="BFBFBF"/>
               <w:right w:val="single" w:sz="4" w:space="0" w:color="BFBFBF"/>
             </w:tcBorders>
-            <w:shd w:val="clear" w:color="auto" w:fill="auto"/>
             <w:vAlign w:val="bottom"/>
           </w:tcPr>
           <w:p>
@@ -26475,7 +26114,6 @@
               <w:bottom w:val="single" w:sz="4" w:space="0" w:color="BFBFBF"/>
               <w:right w:val="single" w:sz="4" w:space="0" w:color="BFBFBF"/>
             </w:tcBorders>
-            <w:shd w:val="clear" w:color="auto" w:fill="auto"/>
             <w:vAlign w:val="bottom"/>
           </w:tcPr>
           <w:p>
@@ -26505,7 +26143,6 @@
               <w:bottom w:val="single" w:sz="4" w:space="0" w:color="BFBFBF"/>
               <w:right w:val="single" w:sz="4" w:space="0" w:color="BFBFBF"/>
             </w:tcBorders>
-            <w:shd w:val="clear" w:color="auto" w:fill="auto"/>
             <w:vAlign w:val="bottom"/>
           </w:tcPr>
           <w:p>
@@ -26535,7 +26172,6 @@
               <w:bottom w:val="single" w:sz="4" w:space="0" w:color="BFBFBF"/>
               <w:right w:val="single" w:sz="4" w:space="0" w:color="BFBFBF"/>
             </w:tcBorders>
-            <w:shd w:val="clear" w:color="auto" w:fill="auto"/>
             <w:vAlign w:val="bottom"/>
           </w:tcPr>
           <w:p>
@@ -26565,7 +26201,6 @@
               <w:bottom w:val="single" w:sz="4" w:space="0" w:color="BFBFBF"/>
               <w:right w:val="single" w:sz="4" w:space="0" w:color="BFBFBF"/>
             </w:tcBorders>
-            <w:shd w:val="clear" w:color="auto" w:fill="auto"/>
             <w:vAlign w:val="bottom"/>
           </w:tcPr>
           <w:p>
@@ -26595,7 +26230,6 @@
               <w:bottom w:val="single" w:sz="4" w:space="0" w:color="BFBFBF"/>
               <w:right w:val="single" w:sz="4" w:space="0" w:color="BFBFBF"/>
             </w:tcBorders>
-            <w:shd w:val="clear" w:color="auto" w:fill="auto"/>
             <w:vAlign w:val="bottom"/>
           </w:tcPr>
           <w:p>
@@ -26647,6 +26281,7 @@
                 <w:rFonts w:ascii="Liberation Sans Narrow" w:eastAsia="Liberation Sans Narrow" w:hAnsi="Liberation Sans Narrow" w:cs="Liberation Sans Narrow"/>
                 <w:color w:val="000000"/>
               </w:rPr>
+              <w:lastRenderedPageBreak/>
               <w:t>58769 MOTIFSIRON</w:t>
             </w:r>
           </w:p>
@@ -26914,7 +26549,6 @@
           <w:rFonts w:ascii="Liberation Sans" w:eastAsia="Liberation Sans" w:hAnsi="Liberation Sans" w:cs="Liberation Sans"/>
           <w:color w:val="000000"/>
         </w:rPr>
-        <w:lastRenderedPageBreak/>
         <w:t xml:space="preserve">Esto motiva la iniciativa de entrenar un metamodelo que tome el output del modelo </w:t>
       </w:r>
       <w:proofErr w:type="spellStart"/>
@@ -26942,7 +26576,7 @@
           <w:numId w:val="7"/>
         </w:numPr>
       </w:pPr>
-      <w:bookmarkStart w:id="35" w:name="_Toc202122290"/>
+      <w:bookmarkStart w:id="35" w:name="_Toc206607309"/>
       <w:r>
         <w:t>Discusión</w:t>
       </w:r>
@@ -26973,7 +26607,7 @@
           <w:lang w:val="es-AR"/>
         </w:rPr>
       </w:pPr>
-      <w:bookmarkStart w:id="36" w:name="_Toc202122291"/>
+      <w:bookmarkStart w:id="36" w:name="_Toc206607310"/>
       <w:r>
         <w:rPr>
           <w:lang w:val="es-AR"/>
@@ -27106,7 +26740,7 @@
           <w:lang w:val="es-AR"/>
         </w:rPr>
       </w:pPr>
-      <w:bookmarkStart w:id="37" w:name="_Toc202122292"/>
+      <w:bookmarkStart w:id="37" w:name="_Toc206607311"/>
       <w:r>
         <w:rPr>
           <w:lang w:val="es-AR"/>
@@ -27172,7 +26806,7 @@
           <w:lang w:val="es-AR"/>
         </w:rPr>
       </w:pPr>
-      <w:bookmarkStart w:id="38" w:name="_Toc202122293"/>
+      <w:bookmarkStart w:id="38" w:name="_Toc206607312"/>
       <w:r>
         <w:rPr>
           <w:lang w:val="es-AR"/>
@@ -27314,7 +26948,7 @@
           <w:lang w:val="es-AR"/>
         </w:rPr>
       </w:pPr>
-      <w:bookmarkStart w:id="39" w:name="_Toc202122294"/>
+      <w:bookmarkStart w:id="39" w:name="_Toc206607313"/>
       <w:r>
         <w:rPr>
           <w:lang w:val="es-AR"/>
@@ -27394,7 +27028,7 @@
           <w:lang w:val="es-AR"/>
         </w:rPr>
       </w:pPr>
-      <w:bookmarkStart w:id="40" w:name="_Toc202122295"/>
+      <w:bookmarkStart w:id="40" w:name="_Toc206607314"/>
       <w:r>
         <w:rPr>
           <w:lang w:val="es-AR"/>
@@ -27428,11 +27062,12 @@
           <w:lang w:val="es-AR"/>
         </w:rPr>
       </w:pPr>
-      <w:bookmarkStart w:id="41" w:name="_Toc202122296"/>
+      <w:bookmarkStart w:id="41" w:name="_Toc206607315"/>
       <w:r>
         <w:rPr>
           <w:lang w:val="es-AR"/>
         </w:rPr>
+        <w:lastRenderedPageBreak/>
         <w:t xml:space="preserve">Soluciones híbridas combinando ML y </w:t>
       </w:r>
       <w:proofErr w:type="spellStart"/>
@@ -27523,9 +27158,8 @@
           <w:lang w:val="es-AR"/>
         </w:rPr>
       </w:pPr>
-      <w:bookmarkStart w:id="42" w:name="_Toc202122297"/>
-      <w:r>
-        <w:lastRenderedPageBreak/>
+      <w:bookmarkStart w:id="42" w:name="_Toc206607316"/>
+      <w:r>
         <w:t>Conclusiones</w:t>
       </w:r>
       <w:bookmarkEnd w:id="42"/>
@@ -27794,7 +27428,7 @@
         <w:t>En resumen, los resultados obtenidos confirman la factibilidad técnica y operativa de implementar soluciones basadas en NLP avanzado para la clasificación de mercaderías, destacando su potencial para reducir costos, errores operativos y mejorar la eficiencia general del comercio internacional.</w:t>
       </w:r>
     </w:p>
-    <w:bookmarkStart w:id="43" w:name="_Toc202122298" w:displacedByCustomXml="next"/>
+    <w:bookmarkStart w:id="43" w:name="_Toc206607317" w:displacedByCustomXml="next"/>
     <w:sdt>
       <w:sdtPr>
         <w:rPr>
@@ -27947,6 +27581,7 @@
                   <w:noProof/>
                   <w:lang w:val="en-GB"/>
                 </w:rPr>
+                <w:lastRenderedPageBreak/>
                 <w:t>Lau, J. H. (2016). An Empirical Evaluation of doc2vec with Practical Insights into Document Embedding Generation.</w:t>
               </w:r>
             </w:p>
@@ -28026,7 +27661,6 @@
                   <w:noProof/>
                   <w:lang w:val="en-GB"/>
                 </w:rPr>
-                <w:lastRenderedPageBreak/>
                 <w:t xml:space="preserve">VUCE. </w:t>
               </w:r>
               <w:r>
@@ -28083,9 +27717,11 @@
       </w:sdtContent>
     </w:sdt>
     <w:sectPr>
+      <w:headerReference w:type="default" r:id="rId29"/>
+      <w:footerReference w:type="default" r:id="rId30"/>
       <w:type w:val="continuous"/>
       <w:pgSz w:w="11906" w:h="16838"/>
-      <w:pgMar w:top="1380" w:right="1559" w:bottom="280" w:left="1700" w:header="0" w:footer="0" w:gutter="0"/>
+      <w:pgMar w:top="1380" w:right="1559" w:bottom="1135" w:left="1700" w:header="0" w:footer="0" w:gutter="0"/>
       <w:cols w:space="720"/>
       <w:formProt w:val="0"/>
       <w:docGrid w:linePitch="100" w:charSpace="4096"/>
@@ -28113,6 +27749,132 @@
 </w:endnotes>
 </file>
 
+<file path=word/footer1.xml><?xml version="1.0" encoding="utf-8"?>
+<w:ftr xmlns:wpc="http://schemas.microsoft.com/office/word/2010/wordprocessingCanvas" xmlns:cx="http://schemas.microsoft.com/office/drawing/2014/chartex" xmlns:cx1="http://schemas.microsoft.com/office/drawing/2015/9/8/chartex" xmlns:cx2="http://schemas.microsoft.com/office/drawing/2015/10/21/chartex" xmlns:cx3="http://schemas.microsoft.com/office/drawing/2016/5/9/chartex" xmlns:cx4="http://schemas.microsoft.com/office/drawing/2016/5/10/chartex" xmlns:cx5="http://schemas.microsoft.com/office/drawing/2016/5/11/chartex" xmlns:cx6="http://schemas.microsoft.com/office/drawing/2016/5/12/chartex" xmlns:cx7="http://schemas.microsoft.com/office/drawing/2016/5/13/chartex" xmlns:cx8="http://schemas.microsoft.com/office/drawing/2016/5/14/chartex" xmlns:mc="http://schemas.openxmlformats.org/markup-compatibility/2006" xmlns:aink="http://schemas.microsoft.com/office/drawing/2016/ink" xmlns:am3d="http://schemas.microsoft.com/office/drawing/2017/model3d" xmlns:o="urn:schemas-microsoft-com:office:office" xmlns:oel="http://schemas.microsoft.com/office/2019/extlst" xmlns:r="http://schemas.openxmlformats.org/officeDocument/2006/relationships" xmlns:m="http://schemas.openxmlformats.org/officeDocument/2006/math" xmlns:v="urn:schemas-microsoft-com:vml" xmlns:wp14="http://schemas.microsoft.com/office/word/2010/wordprocessingDrawing" xmlns:wp="http://schemas.openxmlformats.org/drawingml/2006/wordprocessingDrawing" xmlns:w10="urn:schemas-microsoft-com:office:word" xmlns:w="http://schemas.openxmlformats.org/wordprocessingml/2006/main" xmlns:w14="http://schemas.microsoft.com/office/word/2010/wordml" xmlns:w15="http://schemas.microsoft.com/office/word/2012/wordml" xmlns:w16cex="http://schemas.microsoft.com/office/word/2018/wordml/cex" xmlns:w16cid="http://schemas.microsoft.com/office/word/2016/wordml/cid" xmlns:w16="http://schemas.microsoft.com/office/word/2018/wordml" xmlns:w16du="http://schemas.microsoft.com/office/word/2023/wordml/word16du" xmlns:w16sdtdh="http://schemas.microsoft.com/office/word/2020/wordml/sdtdatahash" xmlns:w16sdtfl="http://schemas.microsoft.com/office/word/2024/wordml/sdtformatlock" xmlns:w16se="http://schemas.microsoft.com/office/word/2015/wordml/symex" xmlns:wpg="http://schemas.microsoft.com/office/word/2010/wordprocessingGroup" xmlns:wpi="http://schemas.microsoft.com/office/word/2010/wordprocessingInk" xmlns:wne="http://schemas.microsoft.com/office/word/2006/wordml" xmlns:wps="http://schemas.microsoft.com/office/word/2010/wordprocessingShape" mc:Ignorable="w14 w15 w16se w16cid w16 w16cex w16sdtdh w16sdtfl w16du wp14">
+  <w:sdt>
+    <w:sdtPr>
+      <w:id w:val="748848285"/>
+      <w:docPartObj>
+        <w:docPartGallery w:val="Page Numbers (Bottom of Page)"/>
+        <w:docPartUnique/>
+      </w:docPartObj>
+    </w:sdtPr>
+    <w:sdtContent>
+      <w:sdt>
+        <w:sdtPr>
+          <w:id w:val="-1769616900"/>
+          <w:docPartObj>
+            <w:docPartGallery w:val="Page Numbers (Top of Page)"/>
+            <w:docPartUnique/>
+          </w:docPartObj>
+        </w:sdtPr>
+        <w:sdtContent>
+          <w:p>
+            <w:pPr>
+              <w:pStyle w:val="Piedepgina"/>
+              <w:jc w:val="right"/>
+            </w:pPr>
+            <w:r>
+              <w:t xml:space="preserve">Página </w:t>
+            </w:r>
+            <w:r>
+              <w:rPr>
+                <w:b/>
+                <w:bCs/>
+                <w:sz w:val="24"/>
+                <w:szCs w:val="24"/>
+              </w:rPr>
+              <w:fldChar w:fldCharType="begin"/>
+            </w:r>
+            <w:r>
+              <w:rPr>
+                <w:b/>
+                <w:bCs/>
+              </w:rPr>
+              <w:instrText>PAGE</w:instrText>
+            </w:r>
+            <w:r>
+              <w:rPr>
+                <w:b/>
+                <w:bCs/>
+                <w:sz w:val="24"/>
+                <w:szCs w:val="24"/>
+              </w:rPr>
+              <w:fldChar w:fldCharType="separate"/>
+            </w:r>
+            <w:r>
+              <w:rPr>
+                <w:b/>
+                <w:bCs/>
+              </w:rPr>
+              <w:t>2</w:t>
+            </w:r>
+            <w:r>
+              <w:rPr>
+                <w:b/>
+                <w:bCs/>
+                <w:sz w:val="24"/>
+                <w:szCs w:val="24"/>
+              </w:rPr>
+              <w:fldChar w:fldCharType="end"/>
+            </w:r>
+            <w:r>
+              <w:t xml:space="preserve"> de </w:t>
+            </w:r>
+            <w:r>
+              <w:rPr>
+                <w:b/>
+                <w:bCs/>
+                <w:sz w:val="24"/>
+                <w:szCs w:val="24"/>
+              </w:rPr>
+              <w:fldChar w:fldCharType="begin"/>
+            </w:r>
+            <w:r>
+              <w:rPr>
+                <w:b/>
+                <w:bCs/>
+              </w:rPr>
+              <w:instrText>NUMPAGES</w:instrText>
+            </w:r>
+            <w:r>
+              <w:rPr>
+                <w:b/>
+                <w:bCs/>
+                <w:sz w:val="24"/>
+                <w:szCs w:val="24"/>
+              </w:rPr>
+              <w:fldChar w:fldCharType="separate"/>
+            </w:r>
+            <w:r>
+              <w:rPr>
+                <w:b/>
+                <w:bCs/>
+              </w:rPr>
+              <w:t>2</w:t>
+            </w:r>
+            <w:r>
+              <w:rPr>
+                <w:b/>
+                <w:bCs/>
+                <w:sz w:val="24"/>
+                <w:szCs w:val="24"/>
+              </w:rPr>
+              <w:fldChar w:fldCharType="end"/>
+            </w:r>
+          </w:p>
+        </w:sdtContent>
+      </w:sdt>
+    </w:sdtContent>
+  </w:sdt>
+  <w:p>
+    <w:pPr>
+      <w:pStyle w:val="Piedepgina"/>
+    </w:pPr>
+  </w:p>
+</w:ftr>
+</file>
+
 <file path=word/footnotes.xml><?xml version="1.0" encoding="utf-8"?>
 <w:footnotes xmlns:wpc="http://schemas.microsoft.com/office/word/2010/wordprocessingCanvas" xmlns:cx="http://schemas.microsoft.com/office/drawing/2014/chartex" xmlns:cx1="http://schemas.microsoft.com/office/drawing/2015/9/8/chartex" xmlns:cx2="http://schemas.microsoft.com/office/drawing/2015/10/21/chartex" xmlns:cx3="http://schemas.microsoft.com/office/drawing/2016/5/9/chartex" xmlns:cx4="http://schemas.microsoft.com/office/drawing/2016/5/10/chartex" xmlns:cx5="http://schemas.microsoft.com/office/drawing/2016/5/11/chartex" xmlns:cx6="http://schemas.microsoft.com/office/drawing/2016/5/12/chartex" xmlns:cx7="http://schemas.microsoft.com/office/drawing/2016/5/13/chartex" xmlns:cx8="http://schemas.microsoft.com/office/drawing/2016/5/14/chartex" xmlns:mc="http://schemas.openxmlformats.org/markup-compatibility/2006" xmlns:aink="http://schemas.microsoft.com/office/drawing/2016/ink" xmlns:am3d="http://schemas.microsoft.com/office/drawing/2017/model3d" xmlns:o="urn:schemas-microsoft-com:office:office" xmlns:oel="http://schemas.microsoft.com/office/2019/extlst" xmlns:r="http://schemas.openxmlformats.org/officeDocument/2006/relationships" xmlns:m="http://schemas.openxmlformats.org/officeDocument/2006/math" xmlns:v="urn:schemas-microsoft-com:vml" xmlns:wp14="http://schemas.microsoft.com/office/word/2010/wordprocessingDrawing" xmlns:wp="http://schemas.openxmlformats.org/drawingml/2006/wordprocessingDrawing" xmlns:w10="urn:schemas-microsoft-com:office:word" xmlns:w="http://schemas.openxmlformats.org/wordprocessingml/2006/main" xmlns:w14="http://schemas.microsoft.com/office/word/2010/wordml" xmlns:w15="http://schemas.microsoft.com/office/word/2012/wordml" xmlns:w16cex="http://schemas.microsoft.com/office/word/2018/wordml/cex" xmlns:w16cid="http://schemas.microsoft.com/office/word/2016/wordml/cid" xmlns:w16="http://schemas.microsoft.com/office/word/2018/wordml" xmlns:w16du="http://schemas.microsoft.com/office/word/2023/wordml/word16du" xmlns:w16sdtdh="http://schemas.microsoft.com/office/word/2020/wordml/sdtdatahash" xmlns:w16sdtfl="http://schemas.microsoft.com/office/word/2024/wordml/sdtformatlock" xmlns:w16se="http://schemas.microsoft.com/office/word/2015/wordml/symex" xmlns:wpg="http://schemas.microsoft.com/office/word/2010/wordprocessingGroup" xmlns:wpi="http://schemas.microsoft.com/office/word/2010/wordprocessingInk" xmlns:wne="http://schemas.microsoft.com/office/word/2006/wordml" xmlns:wps="http://schemas.microsoft.com/office/word/2010/wordprocessingShape" mc:Ignorable="w14 w15 w16se w16cid w16 w16cex w16sdtdh w16sdtfl w16du wp14">
   <w:footnote w:type="separator" w:id="-1">
@@ -28130,6 +27892,26 @@
     </w:p>
   </w:footnote>
 </w:footnotes>
+</file>
+
+<file path=word/header1.xml><?xml version="1.0" encoding="utf-8"?>
+<w:hdr xmlns:wpc="http://schemas.microsoft.com/office/word/2010/wordprocessingCanvas" xmlns:cx="http://schemas.microsoft.com/office/drawing/2014/chartex" xmlns:cx1="http://schemas.microsoft.com/office/drawing/2015/9/8/chartex" xmlns:cx2="http://schemas.microsoft.com/office/drawing/2015/10/21/chartex" xmlns:cx3="http://schemas.microsoft.com/office/drawing/2016/5/9/chartex" xmlns:cx4="http://schemas.microsoft.com/office/drawing/2016/5/10/chartex" xmlns:cx5="http://schemas.microsoft.com/office/drawing/2016/5/11/chartex" xmlns:cx6="http://schemas.microsoft.com/office/drawing/2016/5/12/chartex" xmlns:cx7="http://schemas.microsoft.com/office/drawing/2016/5/13/chartex" xmlns:cx8="http://schemas.microsoft.com/office/drawing/2016/5/14/chartex" xmlns:mc="http://schemas.openxmlformats.org/markup-compatibility/2006" xmlns:aink="http://schemas.microsoft.com/office/drawing/2016/ink" xmlns:am3d="http://schemas.microsoft.com/office/drawing/2017/model3d" xmlns:o="urn:schemas-microsoft-com:office:office" xmlns:oel="http://schemas.microsoft.com/office/2019/extlst" xmlns:r="http://schemas.openxmlformats.org/officeDocument/2006/relationships" xmlns:m="http://schemas.openxmlformats.org/officeDocument/2006/math" xmlns:v="urn:schemas-microsoft-com:vml" xmlns:wp14="http://schemas.microsoft.com/office/word/2010/wordprocessingDrawing" xmlns:wp="http://schemas.openxmlformats.org/drawingml/2006/wordprocessingDrawing" xmlns:w10="urn:schemas-microsoft-com:office:word" xmlns:w="http://schemas.openxmlformats.org/wordprocessingml/2006/main" xmlns:w14="http://schemas.microsoft.com/office/word/2010/wordml" xmlns:w15="http://schemas.microsoft.com/office/word/2012/wordml" xmlns:w16cex="http://schemas.microsoft.com/office/word/2018/wordml/cex" xmlns:w16cid="http://schemas.microsoft.com/office/word/2016/wordml/cid" xmlns:w16="http://schemas.microsoft.com/office/word/2018/wordml" xmlns:w16du="http://schemas.microsoft.com/office/word/2023/wordml/word16du" xmlns:w16sdtdh="http://schemas.microsoft.com/office/word/2020/wordml/sdtdatahash" xmlns:w16sdtfl="http://schemas.microsoft.com/office/word/2024/wordml/sdtformatlock" xmlns:w16se="http://schemas.microsoft.com/office/word/2015/wordml/symex" xmlns:wpg="http://schemas.microsoft.com/office/word/2010/wordprocessingGroup" xmlns:wpi="http://schemas.microsoft.com/office/word/2010/wordprocessingInk" xmlns:wne="http://schemas.microsoft.com/office/word/2006/wordml" xmlns:wps="http://schemas.microsoft.com/office/word/2010/wordprocessingShape" mc:Ignorable="w14 w15 w16se w16cid w16 w16cex w16sdtdh w16sdtfl w16du wp14">
+  <w:p>
+    <w:pPr>
+      <w:pStyle w:val="Encabezado"/>
+    </w:pPr>
+  </w:p>
+  <w:p>
+    <w:pPr>
+      <w:pStyle w:val="Encabezado"/>
+    </w:pPr>
+  </w:p>
+  <w:p>
+    <w:pPr>
+      <w:pStyle w:val="Encabezado"/>
+    </w:pPr>
+  </w:p>
+</w:hdr>
 </file>
 
 <file path=word/numbering.xml><?xml version="1.0" encoding="utf-8"?>
@@ -31085,6 +30867,64 @@
       <w:szCs w:val="20"/>
     </w:rPr>
   </w:style>
+  <w:style w:type="paragraph" w:styleId="Encabezado">
+    <w:name w:val="header"/>
+    <w:basedOn w:val="Normal"/>
+    <w:link w:val="EncabezadoCar"/>
+    <w:uiPriority w:val="99"/>
+    <w:unhideWhenUsed/>
+    <w:rsid w:val="00F90700"/>
+    <w:pPr>
+      <w:tabs>
+        <w:tab w:val="center" w:pos="4252"/>
+        <w:tab w:val="right" w:pos="8504"/>
+      </w:tabs>
+    </w:pPr>
+    <w:rPr>
+      <w:rFonts w:cs="Mangal"/>
+      <w:szCs w:val="20"/>
+    </w:rPr>
+  </w:style>
+  <w:style w:type="character" w:customStyle="1" w:styleId="EncabezadoCar">
+    <w:name w:val="Encabezado Car"/>
+    <w:basedOn w:val="Fuentedeprrafopredeter"/>
+    <w:link w:val="Encabezado"/>
+    <w:uiPriority w:val="99"/>
+    <w:rsid w:val="00F90700"/>
+    <w:rPr>
+      <w:rFonts w:cs="Mangal"/>
+      <w:szCs w:val="20"/>
+    </w:rPr>
+  </w:style>
+  <w:style w:type="paragraph" w:styleId="Piedepgina">
+    <w:name w:val="footer"/>
+    <w:basedOn w:val="Normal"/>
+    <w:link w:val="PiedepginaCar"/>
+    <w:uiPriority w:val="99"/>
+    <w:unhideWhenUsed/>
+    <w:rsid w:val="00F90700"/>
+    <w:pPr>
+      <w:tabs>
+        <w:tab w:val="center" w:pos="4252"/>
+        <w:tab w:val="right" w:pos="8504"/>
+      </w:tabs>
+    </w:pPr>
+    <w:rPr>
+      <w:rFonts w:cs="Mangal"/>
+      <w:szCs w:val="20"/>
+    </w:rPr>
+  </w:style>
+  <w:style w:type="character" w:customStyle="1" w:styleId="PiedepginaCar">
+    <w:name w:val="Pie de página Car"/>
+    <w:basedOn w:val="Fuentedeprrafopredeter"/>
+    <w:link w:val="Piedepgina"/>
+    <w:uiPriority w:val="99"/>
+    <w:rsid w:val="00F90700"/>
+    <w:rPr>
+      <w:rFonts w:cs="Mangal"/>
+      <w:szCs w:val="20"/>
+    </w:rPr>
+  </w:style>
 </w:styles>
 </file>
 

</xml_diff>